<commit_message>
Audit report against source cells; fix 3 traceability errors
Traced every figure to a source tab/cell and added the full map
(q2_2026_report_sourcemap.md). Fixes from the audit:
- 'top ten hold a majority' -> ten largest ~$2.9T = 35% (PT top-10 PV / 8,232.51)
- stale-mark examples corrected to real col-D dates: Ant Group Aug 2020, SHEIN
  Jan 2024 (prior 'mid-2023 FinTech / May 2023 SHEIN' did not match the cells)
- 'OpenAI third most valuable in the world' -> second most valuable in this
  universe (Anthropic $965B > OpenAI $852B by post-value)
Also flagged the six PBQ composites as prior-edition (not in these files).
Rebuilt the .docx from corrected text.

Co-Authored-By: Claude Opus 4.8 <noreply@anthropic.com>
Claude-Session: https://claude.ai/code/session_01KcQ6jidyMrCam9PxNDFS9i
</commit_message>
<xml_diff>
--- a/templates/q2_2026_report.docx
+++ b/templates/q2_2026_report.docx
@@ -665,7 +665,7 @@
           <w:sz w:val="21"/>
           <w:szCs w:val="21"/>
         </w:rPr>
-        <w:t xml:space="preserve">A full PBQ or AIBQ composite requires operating inputs, revenue quality, margins, customer concentration, compute independence, governance, and moat, that none of the three files contain. Composites exist for six frontier names: Databricks 8.7, Anthropic 7.7, SpaceX 7.5, OpenAI 4.2, xAI 3.8, SSI 2.3. The range argues for the framework on its own, since OpenAI, the third most valuable company in the world, scores below the midpoint. The one quality measure available from this data is estimate integrity, the agreement among a company's three marks. Canva, Stripe, and Rippling cluster tightly and carry corroborated valuations; Neuralink (model 441% above its last round), Ripple, and Kraken diverge widely and carry low mark reliability, itself a governance signal. The practical next step is to mark which of the 20 have genuine secondary liquidity against which are model marks only. The full scorecard and a PBQ-per-dollar ranking depend on analyst composites this data does not provide, and should be scoped as pending rather than estimated.</w:t>
+        <w:t xml:space="preserve">A full PBQ or AIBQ composite requires operating inputs, revenue quality, margins, customer concentration, compute independence, governance, and moat, that none of the three files contain. Composites exist for only six frontier names, carried from the prior edition rather than these files: Databricks 8.7, Anthropic 7.7, SpaceX 7.5, OpenAI 4.2, xAI 3.8, SSI 2.3. The range argues for the framework on its own, since OpenAI, the second most valuable company in this universe, scores below the midpoint. The one quality measure available from this data is estimate integrity, the agreement among a company's three marks. Canva, Stripe, and Rippling cluster tightly and carry corroborated valuations; Neuralink (model 441% above its last round), Ripple, and Kraken diverge widely and carry low mark reliability, itself a governance signal. The practical next step is to mark which of the 20 have genuine secondary liquidity against which are model marks only. The full scorecard and a PBQ-per-dollar ranking depend on analyst composites this data does not provide, and should be scoped as pending rather than estimated.</w:t>
       </w:r>
     </w:p>
     <w:p>
@@ -717,7 +717,7 @@
           <w:sz w:val="21"/>
           <w:szCs w:val="21"/>
         </w:rPr>
-        <w:t xml:space="preserve">Anthropic ($965B) and OpenAI ($852B) together hold $1.82T, 22% of the $8.23T universe, and the top ten hold a majority, against a median company of $2.0B. At this level of concentration the index and the median move independently: the aggregate can rise on a dozen marks while the typical unicorn is flat. The two should be read as separate measures, one tracking a handful of frontier names and the other the remaining seventeen hundred.</w:t>
+        <w:t xml:space="preserve">Anthropic ($965B) and OpenAI ($852B) together hold $1.82T, 22% of the $8.23T universe, and the ten largest hold about $2.9T, 35% of it, against a median company of $2.0B. At this level of concentration the index and the median move independently: the aggregate can rise on a dozen marks while the typical unicorn is flat. The two should be read as separate measures, one tracking a handful of frontier names and the other the remaining seventeen hundred.</w:t>
       </w:r>
     </w:p>
     <w:p>
@@ -749,7 +749,7 @@
           <w:sz w:val="21"/>
           <w:szCs w:val="21"/>
         </w:rPr>
-        <w:t xml:space="preserve">Anthropic ($965B, May 2026), ByteDance ($370B, May 2026), and OpenAI ($852B, March 2026) carry recent marks. Below the leaders the marks age fast, with top-ten names still on 2023 marks, including a mid-2023 FinTech mark and a May 2023 SHEIN mark. Measured from actual latest-round dates across the active book, 47.6% of unicorns have not raised in more than 24 months and 37.1% in more than 36 months. That is the test behind the $8.23T figure: close to half of it rests on marks no financing has retested in two years or more. The universe splits into a small fresh-marked frontier and a large stale-marked middle whose repricing risk does not appear in the aggregate, and the total should be separated into fresh and stale dollars before it is quoted as a market level. The 47.6% figure comes from latest-round dates and replaces an earlier qualifying-date proxy of 78.5% that overstated staleness.</w:t>
+        <w:t xml:space="preserve">Anthropic ($965B, May 2026), ByteDance ($370B, May 2026), and OpenAI ($852B, March 2026) carry recent marks. Below the leaders the marks age fast: Ant Group, seventh by value, still carries an August 2020 round, and SHEIN a January 2024 round. Measured from actual latest-round dates across the active book, 47.6% of unicorns have not raised in more than 24 months and 37.1% in more than 36 months. That is the test behind the $8.23T figure: close to half of it rests on marks no financing has retested in two years or more. The universe splits into a small fresh-marked frontier and a large stale-marked middle whose repricing risk does not appear in the aggregate, and the total should be separated into fresh and stale dollars before it is quoted as a market level. The 47.6% figure comes from latest-round dates and replaces an earlier qualifying-date proxy of 78.5% that overstated staleness.</w:t>
       </w:r>
     </w:p>
     <w:p>

</xml_diff>

<commit_message>
Rewrite vertical velocity/returns section to strict data + meaning
Remove the manager-advice framing ('where new capital earns the most', 'least
attractive quadrant a manager can occupy, slow enough to drag') and the
rhetorical closers ('flatters headline valuations', 'a feature of the data not
of the asset'). Keep every figure and state the meaning plainly; ground the
RVVC-below-1 point with the actual step-ups (Cyber 1.74x, E-Commerce 2.13x).
Rebuilt the .docx and updated the source map.

Co-Authored-By: Claude Opus 4.8 <noreply@anthropic.com>
Claude-Session: https://claude.ai/code/session_01KcQ6jidyMrCam9PxNDFS9i
</commit_message>
<xml_diff>
--- a/templates/q2_2026_report.docx
+++ b/templates/q2_2026_report.docx
@@ -478,22 +478,22 @@
           <w:sz w:val="21"/>
           <w:szCs w:val="21"/>
         </w:rPr>
-        <w:t xml:space="preserve">Size and the rate of value creation point in different directions, which is one of the more useful findings for a manager deciding where new capital earns the most. On 2026 medians, artificial intelligence produced a relative velocity of value creation, the ratio of new valuation created to capital invested, of 1.84 times alongside a 2.35 times step-up across 249 financings, and software 1.42 times and 2.18 times across 176. Both are healthy, and both sit in the middle of the pack on velocity. The highest velocity belongs to smaller categories, robotics and drones at 2.03 times, clean technology at 3.30 times with a 2.77 times step-up. Crypto cooled sharply, its median velocity falling from 2.62 times to 1.11 times. Cybersecurity at 0.66 times and e-commerce at 0.38 times sit at the bottom, raising capital at higher valuations while generating less than a dollar of new value for each dollar invested, a combination that flatters headline valuations without building value beneath them.</w:t>
-      </w:r>
-    </w:p>
-    <w:p>
-      <w:pPr>
-        <w:spacing w:after="160" w:line="276"/>
-        <w:jc w:val="left"/>
-      </w:pPr>
-      <w:r>
-        <w:rPr>
-          <w:rFonts w:ascii="Georgia" w:cs="Georgia" w:eastAsia="Georgia" w:hAnsi="Georgia"/>
-          <w:color w:val="1F2733"/>
-          <w:sz w:val="21"/>
-          <w:szCs w:val="21"/>
-        </w:rPr>
-        <w:t xml:space="preserve">The three-year record of realized index performance confirms the same order and adds the dimension that size alone conceals. On the Monitor vertical indexes, stated as annualized returns, artificial intelligence returned 58.1% a year, a cumulative 302.6%, and enterprise software 34.2% and cybersecurity 22.2% were the only other categories to beat the public benchmark, the Global TME index, at 19.6% a year, or 72.4% cumulative. Artificial intelligence compounded at roughly three times the public rate. Financial technology, third by value, returned 12.9% and trailed the benchmark, which places it in the least attractive quadrant a manager can occupy: large enough to matter, slow enough to drag. One caution governs any risk-adjusted use of these figures. They are built on valuations that update infrequently, which mechanically suppresses measured volatility and inflates any Sharpe ratio derived from them, so the smoothness of the private return series is a feature of the data, not of the asset.</w:t>
+        <w:t xml:space="preserve">Size and the rate of value creation diverge across categories. On 2026 medians, artificial intelligence recorded a relative velocity of value creation, the ratio of new valuation created to capital invested, of 1.84 times, with a 2.35 times step-up across 249 financings, and software 1.42 times and 2.18 times across 176, both near the middle of the range. The highest velocity sits in smaller categories: robotics and drones at 2.03 times and clean technology at 3.30 times, the latter with a 2.77 times step-up. Crypto fell from 2.62 times to 1.11 times. Cybersecurity at 0.66 times and e-commerce at 0.38 times are the lowest, both below 1.0 even as they raised at higher valuations (median step-ups of 1.74 and 2.13 times), which means each dollar invested created less than a dollar of new valuation and the recorded valuation rose faster than the value beneath it.</w:t>
+      </w:r>
+    </w:p>
+    <w:p>
+      <w:pPr>
+        <w:spacing w:after="160" w:line="276"/>
+        <w:jc w:val="left"/>
+      </w:pPr>
+      <w:r>
+        <w:rPr>
+          <w:rFonts w:ascii="Georgia" w:cs="Georgia" w:eastAsia="Georgia" w:hAnsi="Georgia"/>
+          <w:color w:val="1F2733"/>
+          <w:sz w:val="21"/>
+          <w:szCs w:val="21"/>
+        </w:rPr>
+        <w:t xml:space="preserve">The three-year record of realized index performance shows the same order. On the Monitor vertical indexes, stated as annualized returns, artificial intelligence returned 58.1% a year, a cumulative 302.6%; enterprise software returned 34.2% and cybersecurity 22.2%, the only other categories to beat the Global TME public benchmark at 19.6% a year, or 72.4% cumulative. Artificial intelligence compounded at about three times the public rate. Financial technology, third-largest by value, returned 12.9% and trailed the benchmark, pairing large size with a below-benchmark return. These figures are computed on valuations that update infrequently, which suppresses measured volatility and inflates any Sharpe ratio derived from them, so the low volatility of the private indexes reflects infrequent revaluation rather than genuine stability.</w:t>
       </w:r>
     </w:p>
     <w:p>

</xml_diff>

<commit_message>
Strip editorializing from AI-engine, 2021 cohort, exits, fallen sections
Same data-and-meaning pass across the remaining interpretive sections. Removed
advice framing and rhetorical closers ('genuine dilemma rather than a
preference', 'the central problem an allocator now has to solve', 'survival is
not the same as validation, now scheduled', 'both figures belong in any honest
account', 'settles well below the 2026 figure', 'deserves skepticism rather than
comfort', 'reservoir from which the next wave of markdowns will come', 'the same
handful of decision-makers anchor the entire market'). Kept every figure and the
underlying mechanism, stated plainly; also recast the summary roadmap line.
Rebuilt the .docx.

Co-Authored-By: Claude Opus 4.8 <noreply@anthropic.com>
Claude-Session: https://claude.ai/code/session_01KcQ6jidyMrCam9PxNDFS9i
</commit_message>
<xml_diff>
--- a/templates/q2_2026_report.docx
+++ b/templates/q2_2026_report.docx
@@ -92,7 +92,7 @@
           <w:sz w:val="21"/>
           <w:szCs w:val="21"/>
         </w:rPr>
-        <w:t xml:space="preserve">The private unicorn universe ended the second quarter of 2026 at an aggregate post-money valuation of $8.23 trillion across 1,743 companies, a gain of roughly 13% over the prior year. Read as a market barometer, that figure describes a broad and healthy late-stage ecosystem. Decomposed, it says something narrower and more consequential. Artificial-intelligence companies added $1.59 trillion of value in the first half of the year, while the universe as a whole gained $0.93 trillion. The arithmetic leaves no room for interpretation: every part of the market outside artificial intelligence contracted in aggregate, by roughly $0.66 trillion combined. What presents as a rising asset class is a single theme lifting the average while the remainder of the market gives ground. The sections that follow take that observation apart, because nearly every question an institutional allocator should ask about this market, how trustworthy the valuations are, where liquidity actually exists, what the concentration does to portfolio risk, and how today's cohort is likely to age, resolves into some version of it.</w:t>
+        <w:t xml:space="preserve">The private unicorn universe ended the second quarter of 2026 at an aggregate post-money valuation of $8.23 trillion across 1,743 companies, a gain of roughly 13% over the prior year. Read as a market barometer, that figure describes a broad and healthy late-stage ecosystem. Decomposed, it says something narrower and more consequential. Artificial-intelligence companies added $1.59 trillion of value in the first half of the year, while the universe as a whole gained $0.93 trillion. The arithmetic leaves no room for interpretation: every part of the market outside artificial intelligence contracted in aggregate, by roughly $0.66 trillion combined. What presents as a rising asset class is a single theme lifting the average while the remainder of the market gives ground. The sections that follow take that observation apart, because the questions that matter for this market, how trustworthy the valuations are, where liquidity actually exists, what the concentration does to risk, and how today's cohort is likely to age, each resolve into some version of it.</w:t>
       </w:r>
     </w:p>
     <w:p>
@@ -525,7 +525,7 @@
           <w:sz w:val="21"/>
           <w:szCs w:val="21"/>
         </w:rPr>
-        <w:t xml:space="preserve">Artificial intelligence is the market's growth engine and its largest single exposure at the same time, and critically, in the same companies. It produced $1.59 trillion of a $0.93 trillion universe gain, so the rest of the market contracted around it, and it now represents 62% of value, four of the five largest rounds, and 61% of new company formation. Because AI valuations move together and dominate the index, a repricing in a handful of frontier names moves the entire aggregate. The sensitivity can be sized: a 25% reduction in AI valuations would remove roughly $1.27 trillion from the universe, 15.4% of all private-technology value, from one theme repricing. This produces a genuine dilemma rather than a preference. Underweighting artificial intelligence means betting against nearly two-thirds of the market; overweighting it concentrates a portfolio in companies the secondary market already values well below their model valuations. The exposure cannot be hedged inside the asset class, because the return and the risk are the same holdings, and that inseparability is the central problem an allocator to late-stage venture now has to solve.</w:t>
+        <w:t xml:space="preserve">Artificial intelligence is both the source of the market's growth and its largest concentration of value, in the same companies. It produced $1.59 trillion of the $0.93 trillion universe gain, so the rest of the market contracted around it, and it now represents 62% of value, four of the five largest rounds, and 61% of new company formation. Because AI valuations move together and dominate the index, a repricing in a handful of frontier names moves the entire aggregate: a 25% reduction in AI valuations would remove roughly $1.27 trillion, 15.4% of all private-technology value. The companies that produced the market's gain are the same ones the secondary market already values well below their model valuations, so the exposure that drove the aggregate up carries the widest downside, and it sits in too large a share of the universe to be diversified away within it.</w:t>
       </w:r>
     </w:p>
     <w:p>
@@ -557,22 +557,22 @@
           <w:sz w:val="21"/>
           <w:szCs w:val="21"/>
         </w:rPr>
-        <w:t xml:space="preserve">The most disciplined way to forecast how today's cohort will age is to study the last one that formed under similar conditions, and the 2021 vintage supplies it. Of 635 unicorns minted in 2021, five years on, 470 remain active, or 74%; 102 have exited, 16%; and 62 have failed, comprising 34 that fell below the billion-dollar threshold while still private, 15 that fell at exit through a public listing or sale below unicorn status, and 13 that went bankrupt. Two features of this record matter for the present. Three-quarters of the cohort remain illiquid four and a half years after formation, which follows directly from a median time to exit of 8.47 years. And the 15 companies that fell at exit are the least visible failures in the data, recorded as exits in the headline figures while their investors absorbed losses.</w:t>
-      </w:r>
-    </w:p>
-    <w:p>
-      <w:pPr>
-        <w:spacing w:after="160" w:line="276"/>
-        <w:jc w:val="left"/>
-      </w:pPr>
-      <w:r>
-        <w:rPr>
-          <w:rFonts w:ascii="Georgia" w:cs="Georgia" w:eastAsia="Georgia" w:hAnsi="Georgia"/>
-          <w:color w:val="1F2733"/>
-          <w:sz w:val="21"/>
-          <w:szCs w:val="21"/>
-        </w:rPr>
-        <w:t xml:space="preserve">Applied to today's 702 artificial-intelligence unicorns, the 2021 experience implies a base case of roughly a quarter impairing and three-quarters remaining illiquid into the next decade, with an important adjustment: AI valuations are more correlated and more concentrated than the 2021 cohort's were, which fattens the tail on both sides. The ten-year funds that financed the 2021 vintage mature between 2028 and 2031, which sets a fixed timetable on which those untested valuations must resolve, through markdown, sale, or wind-down. The cohort's 74% survival rate reads as reassuring, but survival is not the same as validation, and the validation is now scheduled.</w:t>
+        <w:t xml:space="preserve">The 2021 vintage shows how a boom cohort ages. Of 635 unicorns minted in 2021, five years on 470 remain active (74%), 102 have exited (16%), and 62 have failed: 34 fell below the billion-dollar threshold while still private, 15 fell at exit through a public listing or sale below unicorn status, and 13 went bankrupt. Three-quarters of the cohort remain illiquid four and a half years after formation, consistent with a median time to exit of 8.47 years. The 15 that fell at exit are recorded as exits in the headline figures rather than as failures, so the reported exit count overstates successful outcomes.</w:t>
+      </w:r>
+    </w:p>
+    <w:p>
+      <w:pPr>
+        <w:spacing w:after="160" w:line="276"/>
+        <w:jc w:val="left"/>
+      </w:pPr>
+      <w:r>
+        <w:rPr>
+          <w:rFonts w:ascii="Georgia" w:cs="Georgia" w:eastAsia="Georgia" w:hAnsi="Georgia"/>
+          <w:color w:val="1F2733"/>
+          <w:sz w:val="21"/>
+          <w:szCs w:val="21"/>
+        </w:rPr>
+        <w:t xml:space="preserve">Today's 702 artificial-intelligence unicorns are a cohort of the same size at an earlier stage. If they age as the 2021 vintage did, roughly a quarter would impair and three-quarters would remain illiquid into the next decade, though AI valuations are more correlated and more concentrated than the 2021 cohort's, so those outcomes would be more tightly linked to a common driver. The ten-year funds that financed the 2021 vintage mature between 2028 and 2031, the period over which those untested valuations resolve through markdown, sale, or wind-down.</w:t>
       </w:r>
     </w:p>
     <w:p>
@@ -624,7 +624,7 @@
           <w:sz w:val="21"/>
           <w:szCs w:val="21"/>
         </w:rPr>
-        <w:t xml:space="preserve">The structure of financing tightened even as the number of rounds fell. Syndicates of six or more investors made up 60.9% of 2026 rounds with disclosed participation, close to the 2021 peak of 64%, so the rounds that do occur are more crowded than before. Investor participation by count, however, has not recovered alongside the dollars: it peaked at 2,892 in the third quarter of 2021, bottomed at 895 in the fourth quarter of 2023, recovered to 1,415 in the first quarter of 2026, then fell back to 995 in the second quarter even as financing value stayed high. A short list of firms writes most of the capital, led by Sequoia Capital at 491 unicorn financings since 2016, Tiger Global at 472, Andreessen Horowitz at 454, Accel at 382, and Coatue at 344. Investor concentration mirrors company concentration: a narrow set of funds backs a narrow set of companies, which means the same handful of decision-makers now sets the valuations that anchor the entire late-stage market.</w:t>
+        <w:t xml:space="preserve">The structure of financing tightened even as the number of rounds fell. Syndicates of six or more investors made up 60.9% of 2026 rounds with disclosed participation, close to the 2021 peak of 64%, so the rounds that do occur are more crowded than before. Investor participation by count, however, has not recovered alongside the dollars: it peaked at 2,892 in the third quarter of 2021, bottomed at 895 in the fourth quarter of 2023, recovered to 1,415 in the first quarter of 2026, then fell back to 995 in the second quarter even as financing value stayed high. A small number of firms account for the most financings: Sequoia Capital participated in 491 unicorn financings since 2016, Tiger Global 472, Andreessen Horowitz 454, Accel 382, and Coatue 344. Investor concentration mirrors company concentration: a narrow set of funds backs a narrow set of companies.</w:t>
       </w:r>
     </w:p>
     <w:p>
@@ -656,7 +656,7 @@
           <w:sz w:val="21"/>
           <w:szCs w:val="21"/>
         </w:rPr>
-        <w:t xml:space="preserve">Exit value in 2026 reached $2,110.9 billion across 50 exits, the highest in the data, and a single event accounts for four-fifths of it. SpaceX's public listing was $1,690 billion on its own; excluding it, exit value was $420.7 billion, still the strongest year since 2021 but a fraction of the headline, and both figures belong in any honest account of the year. Public listings drove 85% of exit value, and the market that was effectively closed for three years is open again, with SpaceX, Cerebras at $34 billion, and Quantinuum at $14 billion all listing in the quarter. Duration works against a simple reading of the recovery: the median time to exit rose to 8.47 years, near the 9.17-year peak of 2025, so the companies reaching liquidity now are older vintages clearing a backlog rather than recent 2023 and 2024 formations. The distinction matters because the constraint that will define the next two years is liquidity for the 2021-vintage funds now approaching maturity. Those funds must return capital into a market that can currently provide it only through a slow-draining backlog, and once that backlog empties, exit value settles well below the 2026 figure.</w:t>
+        <w:t xml:space="preserve">Exit value in 2026 reached $2,110.9 billion across 50 exits, the highest in the data, and a single event accounts for four-fifths of it. SpaceX's public listing was $1,690 billion on its own; excluding it, exit value was $420.7 billion, the strongest year since 2021 but far below the headline. Public listings drove 85% of exit value, and after three years of few listings, SpaceX, Cerebras at $34 billion, and Quantinuum at $14 billion all listed in the quarter. The median time to exit rose to 8.47 years, near the 9.17-year peak of 2025, so the companies reaching liquidity now are older vintages rather than recent 2023 and 2024 formations. The 2026 exit total therefore reflects one large listing and a backlog of aged companies reaching liquidity, not a broad acceleration of recent cohorts to exit.</w:t>
       </w:r>
     </w:p>
     <w:p>
@@ -888,7 +888,7 @@
           <w:sz w:val="21"/>
           <w:szCs w:val="21"/>
         </w:rPr>
-        <w:t xml:space="preserve">A total of 245 unicorns have fallen below the billion-dollar threshold to date, and the flow of new failures has nearly stopped: six down rounds in the first half of 2026, worth $3.85 billion, against a peak of 34 failures in 2024. When companies do fail, they fall hard, with a median failing valuation of $524.5 million and a median decline of 67% from the prior peak, leaving the typical fallen company at roughly a third of its high valuation and just below the billion-dollar line. The 2021 cohort contains the least-visible category of loss, 15 companies that fell at exit, recorded as exits in the headline figures while their backers lost money. A low current failure rate deserves skepticism rather than comfort, because failures are recognized when a company raises a lower valuation, and companies that do not raise cannot be marked down. With 47.6% of the universe carrying untested valuations, the low failure count is more plausibly a symptom of widespread dormancy than of underlying health, and the dormant interior is the reservoir from which the next wave of markdowns will come.</w:t>
+        <w:t xml:space="preserve">A total of 245 unicorns have fallen below the billion-dollar threshold to date, and the flow of new failures has nearly stopped: six down rounds in the first half of 2026, worth $3.85 billion, against a peak of 34 in 2024. Failures are severe when they occur, with a median failing valuation of $524.5 million and a median decline of 67% from the prior peak, leaving the typical fallen company at about a third of its high valuation, just below the billion-dollar line. The 2021 cohort's 15 companies that fell at exit are recorded as exits rather than failures, so the reported failure count understates losses. The low current count also reflects how failures are measured: a company is recognized as failing only when it raises at a lower valuation, and 47.6% of the universe has not raised in more than two years, so the companies most likely to be carrying stale valuations are absent from the count. The failure rate describes companies that raised, not the dormant majority.</w:t>
       </w:r>
     </w:p>
     <w:p>

</xml_diff>

<commit_message>
Cut report to ~3,000 words; PBQ section held as pending-data placeholder
Tighten every section (merge paragraphs, drop restated implications and closers)
to bring the report from ~4,600 to ~3,000 words with all data points intact.
Fix the manual typos (late-stage, its largest, would be more). Replace the
PBQ/AIBQ body with a clean [Pending analyst data] placeholder that states what
inputs are required, so nothing is fabricated and the section expands when the
data arrives. Rebuilt the .docx.

Co-Authored-By: Claude Opus 4.8 <noreply@anthropic.com>
Claude-Session: https://claude.ai/code/session_01KcQ6jidyMrCam9PxNDFS9i
</commit_message>
<xml_diff>
--- a/templates/q2_2026_report.docx
+++ b/templates/q2_2026_report.docx
@@ -57,7 +57,7 @@
           <w:sz w:val="18"/>
           <w:szCs w:val="18"/>
         </w:rPr>
-        <w:t xml:space="preserve">Primary basis: PitchBook deal-level unicorn tracker (1,743 active companies / $8.23 trillion aggregate post-money valuation). The Morningstar PitchBook Unicorn 20 daily valuations and the Unicorn Monitor are drawn on only where flagged, for the three-way valuation comparison of the largest companies and for the vertical index returns, and their figures are not combined with the primary-tracker totals.</w:t>
+        <w:t xml:space="preserve">Primary basis: PitchBook deal-level unicorn tracker (1,743 active companies / $8.23 trillion aggregate post-money valuation). The Morningstar PitchBook Unicorn 20 daily valuations and the Unicorn Monitor are used only where flagged, for the three-way valuation comparison of the largest companies and for the vertical index returns, and their figures are not combined with the primary-tracker totals.</w:t>
       </w:r>
     </w:p>
     <w:p>
@@ -92,7 +92,7 @@
           <w:sz w:val="21"/>
           <w:szCs w:val="21"/>
         </w:rPr>
-        <w:t xml:space="preserve">The private unicorn universe ended the second quarter of 2026 at an aggregate post-money valuation of $8.23 trillion across 1,743 companies, a gain of roughly 13% over the prior year. Read as a market barometer, that figure describes a broad and healthy late-stage ecosystem. Decomposed, it says something narrower and more consequential. Artificial-intelligence companies added $1.59 trillion of value in the first half of the year, while the universe as a whole gained $0.93 trillion. The arithmetic leaves no room for interpretation: every part of the market outside artificial intelligence contracted in aggregate, by roughly $0.66 trillion combined. What presents as a rising asset class is a single theme lifting the average while the remainder of the market gives ground. The sections that follow take that observation apart, because the questions that matter for this market, how trustworthy the valuations are, where liquidity actually exists, what the concentration does to risk, and how today's cohort is likely to age, each resolve into some version of it.</w:t>
+        <w:t xml:space="preserve">The private unicorn universe ended the second quarter of 2026 at an aggregate post-money valuation of $8.23 trillion across 1,743 companies, up roughly 13% over the prior year. The headline reads as a broad, healthy ecosystem, but artificial-intelligence companies added $1.59 trillion of value in the first half while the universe as a whole gained $0.93 trillion, which means every part of the market outside artificial intelligence contracted in aggregate, by roughly $0.66 trillion combined. A single theme is lifting the average while the rest of the market gives ground, and the questions that follow, how trustworthy the valuations are, where liquidity exists, and how today's cohort will age, each turn on that fact.</w:t>
       </w:r>
     </w:p>
     <w:p>
@@ -144,22 +144,7 @@
           <w:sz w:val="21"/>
           <w:szCs w:val="21"/>
         </w:rPr>
-        <w:t xml:space="preserve">The five largest rounds of the quarter raised $87.1 billion between them, and a single company, Anthropic, accounted for $65 billion of that total, raising into a $965 billion post-money valuation. That one financing was 5.4 times the size of the next-largest round, Prometheus at $12 billion into a $41 billion valuation, and by itself represented 16.4% of all first-half unicorn financing. Anduril ($5 billion into $61 billion), ByteDance ($3 billion into $370 billion), and Isomorphic Labs ($2.1 billion) completed the five, four of them artificial-intelligence businesses.</w:t>
-      </w:r>
-    </w:p>
-    <w:p>
-      <w:pPr>
-        <w:spacing w:after="160" w:line="276"/>
-        <w:jc w:val="left"/>
-      </w:pPr>
-      <w:r>
-        <w:rPr>
-          <w:rFonts w:ascii="Georgia" w:cs="Georgia" w:eastAsia="Georgia" w:hAnsi="Georgia"/>
-          <w:color w:val="1F2733"/>
-          <w:sz w:val="21"/>
-          <w:szCs w:val="21"/>
-        </w:rPr>
-        <w:t xml:space="preserve">The distribution beneath those five is what gives the quarter its character. Financing sizes fall below $2 billion by the sixth company and below $1 billion shortly after, so the ten largest rounds absorbed 68.9% of the quarter's sized financing value and the twenty-five largest absorbed 78.5%. Late-stage capital is not spreading across the ecosystem; it is concentrating into a small number of frontier laboratories that now set the reference valuations every other company raises against. For an institution, the operative consequence is that participating in the quarter's growth required access to five specific capitalization tables. An observer who reads "first-half financing was strong" as a statement about the market has in fact described the fundraising of five companies and generalized it to seventeen hundred.</w:t>
+        <w:t xml:space="preserve">The five largest rounds raised $87.1 billion between them, and Anthropic alone accounted for $65 billion, raising into a $965 billion post-money valuation. That one financing was 5.4 times the next-largest round, Prometheus at $12 billion into a $41 billion valuation, and 16.4% of all first-half unicorn financing. Anduril ($5 billion into $61 billion), ByteDance ($3 billion into $370 billion), and Isomorphic Labs ($2.1 billion) completed the five, four of them artificial-intelligence businesses. Below them financing sizes fall under $2 billion by the sixth company and under $1 billion shortly after, so the ten largest rounds absorbed 68.9% of the quarter's sized financing value and the twenty-five largest 78.5%. Late-stage capital is concentrating into a small number of frontier laboratories that set the reference valuations others raise against. "First-half financing was strong" describes the fundraising of five companies, not seventeen hundred.</w:t>
       </w:r>
     </w:p>
     <w:p>
@@ -191,163 +176,133 @@
           <w:sz w:val="21"/>
           <w:szCs w:val="21"/>
         </w:rPr>
-        <w:t xml:space="preserve">Each of the twenty most closely followed private companies can be valued three ways, and the disagreement among those three methods is the finding worth dwelling on. The first is a daily, model-derived valuation, published by Morningstar and updated continuously against public comparables and observed activity. The second is the post-money valuation of the last completed primary financing, a figure fixed on the day the round closes that does not move until the next one. The third is an implied valuation drawn from actual secondary-market transactions, the price at which existing shares genuinely change hands. In aggregate the model-derived valuations sit 15.2% above the last-round valuations for the eighteen companies with a priced round, which is the expected pattern when a continuously updated estimate leads a last financing that has grown several months stale.</w:t>
-      </w:r>
-    </w:p>
-    <w:p>
-      <w:pPr>
-        <w:spacing w:after="160" w:line="276"/>
-        <w:jc w:val="left"/>
-      </w:pPr>
-      <w:r>
-        <w:rPr>
-          <w:rFonts w:ascii="Georgia" w:cs="Georgia" w:eastAsia="Georgia" w:hAnsi="Georgia"/>
-          <w:color w:val="1F2733"/>
-          <w:sz w:val="21"/>
-          <w:szCs w:val="21"/>
-        </w:rPr>
-        <w:t xml:space="preserve">The secondary market complicates that picture exactly where the capital is concentrated. For twelve of the twenty companies, shares trade below the model-derived valuation, and for the two largest the discount is severe. SpaceX changes hands 32% below its $2.03 trillion model valuation, a difference of roughly $650 billion, and Anthropic 22% below its $1.27 trillion valuation, about $282 billion. Both of those model valuations were struck on a recent event, SpaceX's June public listing and an Anthropic financing, and both moved ahead of a secondary market that had not yet repriced. Further down the list the relationship inverts: shares in Applied Intuition, Anysphere, Anduril, and Revolut trade 16% to 36% above their last primary round, meaning those companies carry valuations that understate them rather than flatter them. At the bottom of the group the three measures have reset lower in unison at Ripple, Epic Games, and Kraken, where model, last round, and secondary market all agree the valuation has fallen.</w:t>
-      </w:r>
-    </w:p>
-    <w:p>
-      <w:pPr>
-        <w:spacing w:after="160" w:line="276"/>
-        <w:jc w:val="left"/>
-      </w:pPr>
-      <w:r>
-        <w:rPr>
-          <w:rFonts w:ascii="Georgia" w:cs="Georgia" w:eastAsia="Georgia" w:hAnsi="Georgia"/>
-          <w:color w:val="1F2733"/>
-          <w:sz w:val="21"/>
-          <w:szCs w:val="21"/>
-        </w:rPr>
-        <w:t xml:space="preserve">The conclusion an institutional holder should draw is an uncomfortable one. Valuation reliability, defined as the agreement among independent estimates, runs inversely to position size in this market. The companies most likely to dominate a late-stage portfolio are the ones whose valuations are least corroborated by trading, so a portfolio carried at model-derived values holds its largest positions 20% to 30% above the price a willing buyer is currently paying, and the overstatement widens as the position grows. This is not a claim that the largest companies are mispriced. It is a claim that the uncertainty around their valuations is greatest precisely where an allocator has the most money at stake, and that uncertainty, not the point estimate, is what should govern how those positions are sized and reported.</w:t>
-      </w:r>
-    </w:p>
-    <w:p>
-      <w:pPr>
-        <w:pStyle w:val="Heading2"/>
-        <w:spacing w:after="70" w:before="220"/>
-      </w:pPr>
-      <w:r>
-        <w:rPr>
-          <w:rFonts w:ascii="Arial" w:cs="Arial" w:eastAsia="Arial" w:hAnsi="Arial"/>
-          <w:b/>
-          <w:bCs/>
-          <w:color w:val="1A2744"/>
-          <w:sz w:val="21"/>
-          <w:szCs w:val="21"/>
-        </w:rPr>
-        <w:t xml:space="preserve">The median and the average now describe two different markets</w:t>
-      </w:r>
-    </w:p>
-    <w:p>
-      <w:pPr>
-        <w:spacing w:after="160" w:line="276"/>
-        <w:jc w:val="left"/>
-      </w:pPr>
-      <w:r>
-        <w:rPr>
-          <w:rFonts w:ascii="Georgia" w:cs="Georgia" w:eastAsia="Georgia" w:hAnsi="Georgia"/>
-          <w:color w:val="1F2733"/>
-          <w:sz w:val="21"/>
-          <w:szCs w:val="21"/>
-        </w:rPr>
-        <w:t xml:space="preserve">The distance between the typical unicorn and the average unicorn has become the clearest single measure of how concentrated this market is. The median company carries a post-money valuation of $2.0 billion; the average is $18.19 billion. That ratio of 9.1 to 1 stood at 3.1 to 1 in 2025 and 2.8 to 1 in 2024, so the distribution did not drift wider over the year, it split open. Financing sizes show the same signature, a $200 million median against a $1,143 million average, the widest separation in the eleven years of data. The interpretation is direct: the $8.23 trillion aggregate grew because roughly a dozen valuations were rewritten upward, while the company at the middle of the distribution did not move. An institution benchmarking a late-stage program to the aggregate is therefore tracking the twelve largest companies and crediting their revaluation to the asset class as a whole. Stripped of those twelve names, the median portfolio bears little resemblance to the index it is measured against, which has direct consequences for how manager performance in this asset class should be attributed and judged.</w:t>
-      </w:r>
-    </w:p>
-    <w:p>
-      <w:pPr>
-        <w:pStyle w:val="Heading2"/>
-        <w:spacing w:after="70" w:before="220"/>
-      </w:pPr>
-      <w:r>
-        <w:rPr>
-          <w:rFonts w:ascii="Arial" w:cs="Arial" w:eastAsia="Arial" w:hAnsi="Arial"/>
-          <w:b/>
-          <w:bCs/>
-          <w:color w:val="1A2744"/>
-          <w:sz w:val="21"/>
-          <w:szCs w:val="21"/>
-        </w:rPr>
-        <w:t xml:space="preserve">Companies that raised were repriced upward, and repriced quickly</w:t>
-      </w:r>
-    </w:p>
-    <w:p>
-      <w:pPr>
-        <w:spacing w:after="160" w:line="276"/>
-        <w:jc w:val="left"/>
-      </w:pPr>
-      <w:r>
-        <w:rPr>
-          <w:rFonts w:ascii="Georgia" w:cs="Georgia" w:eastAsia="Georgia" w:hAnsi="Georgia"/>
-          <w:color w:val="1F2733"/>
-          <w:sz w:val="21"/>
-          <w:szCs w:val="21"/>
-        </w:rPr>
-        <w:t xml:space="preserve">The behavior of the active financing market, meaning the subset of companies that actually raised during the period, was unambiguously strong, and it is worth isolating from the dormant majority before drawing conclusions. The median valuation step-up, the ratio of a new round's post-money valuation to the prior round's, reached 2.20 times in 2026, up from 2.05 times in 2025 and the highest reading since the 2.64 times of the 2021 peak. The median interval between financings compressed to 0.98 years from 1.21 in 2025 and 1.45 in 2024, so companies that raise are returning to market faster. Down rounds, financings priced below the prior round, have nearly vanished: six in the first half of 2026 worth $3.85 billion, against thirty-one in all of 2025 and thirty-four in 2024.</w:t>
-      </w:r>
-    </w:p>
-    <w:p>
-      <w:pPr>
-        <w:spacing w:after="160" w:line="276"/>
-        <w:jc w:val="left"/>
-      </w:pPr>
-      <w:r>
-        <w:rPr>
-          <w:rFonts w:ascii="Georgia" w:cs="Georgia" w:eastAsia="Georgia" w:hAnsi="Georgia"/>
-          <w:color w:val="1F2733"/>
-          <w:sz w:val="21"/>
-          <w:szCs w:val="21"/>
-        </w:rPr>
-        <w:t xml:space="preserve">Two qualifications convert this from an encouraging headline into a useful one. The steepest revaluations came not from the leaders but from small companies, Hark at 151 times its prior round, Blitzy and SendCutSend at 30 times, each valued below $7 billion, while the giants rose in absolute dollars at modest multiples. The velocity of value creation lives at the small end of the market, where a single financing can revalue a company several times over, and the stock of value lives at the large end, where valuations are enormous but move slowly. The more important qualification is that every figure in this section describes only companies that raised, a group that is well under half the universe. A strong active market confirms that the businesses able to command a financing are being rewarded; it is silent on the larger population that has not tested its valuation at all, and it is that silence, examined later, that carries the market's real risk.</w:t>
-      </w:r>
-    </w:p>
-    <w:p>
-      <w:pPr>
-        <w:pStyle w:val="Heading2"/>
-        <w:spacing w:after="70" w:before="220"/>
-      </w:pPr>
-      <w:r>
-        <w:rPr>
-          <w:rFonts w:ascii="Arial" w:cs="Arial" w:eastAsia="Arial" w:hAnsi="Arial"/>
-          <w:b/>
-          <w:bCs/>
-          <w:color w:val="1A2744"/>
-          <w:sz w:val="21"/>
-          <w:szCs w:val="21"/>
-        </w:rPr>
-        <w:t xml:space="preserve">AI now holds three-fifths of the universe's value on two-fifths of its companies</w:t>
-      </w:r>
-    </w:p>
-    <w:p>
-      <w:pPr>
-        <w:spacing w:after="160" w:line="276"/>
-        <w:jc w:val="left"/>
-      </w:pPr>
-      <w:r>
-        <w:rPr>
-          <w:rFonts w:ascii="Georgia" w:cs="Georgia" w:eastAsia="Georgia" w:hAnsi="Georgia"/>
-          <w:color w:val="1F2733"/>
-          <w:sz w:val="21"/>
-          <w:szCs w:val="21"/>
-        </w:rPr>
-        <w:t xml:space="preserve">Artificial intelligence has passed a threshold that reframes the asset class. AI companies number 702 of the 1,743 unicorns, 40.3% by count, yet account for $5.08 trillion of the $8.23 trillion in value, 61.7% of the total. The twenty-one-point gap between those two shares measures how much larger the average AI company is than the average unicorn, and it is widening quickly: AI value rose from $3.49 trillion at the end of 2025 to $5.08 trillion by mid-2026, a 45.6% increase in six months, and AI accounted for 109 of the 178 companies that newly crossed the billion-dollar threshold in the first half. Because AI's weight in new capital and new company formation runs ahead of its weight in the standing universe, its share is still rising.</w:t>
-      </w:r>
-    </w:p>
-    <w:p>
-      <w:pPr>
-        <w:spacing w:after="160" w:line="276"/>
-        <w:jc w:val="left"/>
-      </w:pPr>
-      <w:r>
-        <w:rPr>
-          <w:rFonts w:ascii="Georgia" w:cs="Georgia" w:eastAsia="Georgia" w:hAnsi="Georgia"/>
-          <w:color w:val="1F2733"/>
-          <w:sz w:val="21"/>
-          <w:szCs w:val="21"/>
-        </w:rPr>
-        <w:t xml:space="preserve">The implication for portfolio construction is the one many allocators have not fully internalized. With artificial intelligence at three-fifths of the asset class's value and two-thirds of its growth, an allocation to late-stage venture is a concentrated bet on one theme rather than a diversified position. A program built without an explicit view on AI is still long AI, at whatever weight the market's concentration sets, and that weight now exceeds what most diversified mandates would knowingly hold. (The data holds two narrower definitions of AI that should not be substituted here: a vertical tag of 865 companies, which counts one business under several categories at once, and the curated Monitor index of 430 companies at $4.14 trillion. The figures above use the deduplicated 702-company aggregate.)</w:t>
+        <w:t xml:space="preserve">Each of the twenty most closely followed private companies can be valued three ways: a daily, model-derived valuation published by Morningstar; the post-money valuation of the last completed primary financing, fixed until the next round; and an implied valuation from actual secondary-market transactions, the price at which shares change hands. In aggregate the model-derived valuations sit 15.2% above the last-round valuations for the eighteen companies with a priced round, the expected pattern when a live estimate leads a financing several months stale.</w:t>
+      </w:r>
+    </w:p>
+    <w:p>
+      <w:pPr>
+        <w:spacing w:after="160" w:line="276"/>
+        <w:jc w:val="left"/>
+      </w:pPr>
+      <w:r>
+        <w:rPr>
+          <w:rFonts w:ascii="Georgia" w:cs="Georgia" w:eastAsia="Georgia" w:hAnsi="Georgia"/>
+          <w:color w:val="1F2733"/>
+          <w:sz w:val="21"/>
+          <w:szCs w:val="21"/>
+        </w:rPr>
+        <w:t xml:space="preserve">The secondary market diverges exactly where the capital sits. For twelve of the twenty, shares trade below the model-derived valuation, and for the two largest the discount is severe: SpaceX changes hands 32% below its $2.03 trillion model valuation, about $650 billion, and Anthropic 22% below its $1.27 trillion valuation, about $282 billion. Both were struck on a recent event, SpaceX's June listing and an Anthropic financing, and both moved ahead of a market that had not repriced. Lower down the relationship inverts: Applied Intuition, Anysphere, Anduril, and Revolut trade 16% to 36% above their last round, so their recorded valuations understate them. At the bottom, model, last round, and secondary market have reset lower together at Ripple, Epic Games, and Kraken.</w:t>
+      </w:r>
+    </w:p>
+    <w:p>
+      <w:pPr>
+        <w:spacing w:after="160" w:line="276"/>
+        <w:jc w:val="left"/>
+      </w:pPr>
+      <w:r>
+        <w:rPr>
+          <w:rFonts w:ascii="Georgia" w:cs="Georgia" w:eastAsia="Georgia" w:hAnsi="Georgia"/>
+          <w:color w:val="1F2733"/>
+          <w:sz w:val="21"/>
+          <w:szCs w:val="21"/>
+        </w:rPr>
+        <w:t xml:space="preserve">Valuation reliability, the agreement among independent estimates, runs inversely to position size. The companies most likely to dominate a late-stage portfolio are the least corroborated by trading, so a portfolio carried at model values holds its largest positions 20% to 30% above the price a buyer is currently paying, and the gap widens with position size.</w:t>
+      </w:r>
+    </w:p>
+    <w:p>
+      <w:pPr>
+        <w:pStyle w:val="Heading2"/>
+        <w:spacing w:after="70" w:before="220"/>
+      </w:pPr>
+      <w:r>
+        <w:rPr>
+          <w:rFonts w:ascii="Arial" w:cs="Arial" w:eastAsia="Arial" w:hAnsi="Arial"/>
+          <w:b/>
+          <w:bCs/>
+          <w:color w:val="1A2744"/>
+          <w:sz w:val="21"/>
+          <w:szCs w:val="21"/>
+        </w:rPr>
+        <w:t xml:space="preserve">The median and the average describe two different markets</w:t>
+      </w:r>
+    </w:p>
+    <w:p>
+      <w:pPr>
+        <w:spacing w:after="160" w:line="276"/>
+        <w:jc w:val="left"/>
+      </w:pPr>
+      <w:r>
+        <w:rPr>
+          <w:rFonts w:ascii="Georgia" w:cs="Georgia" w:eastAsia="Georgia" w:hAnsi="Georgia"/>
+          <w:color w:val="1F2733"/>
+          <w:sz w:val="21"/>
+          <w:szCs w:val="21"/>
+        </w:rPr>
+        <w:t xml:space="preserve">The distance between the typical and the average unicorn is the clearest measure of concentration. The median company carries a $2.0 billion post-money valuation; the average is $18.19 billion. That 9.1-to-1 ratio was 3.1 to 1 in 2025 and 2.8 to 1 in 2024, so the distribution split open over the year. Financing sizes show the same shape, a $200 million median against a $1,143 million average, the widest separation in eleven years of data. The aggregate grew because roughly a dozen valuations were rewritten upward while the middle of the distribution did not move. An institution benchmarking to the aggregate is tracking the twelve largest companies and crediting their revaluation to the asset class; the median portfolio bears little resemblance to the index it is judged against.</w:t>
+      </w:r>
+    </w:p>
+    <w:p>
+      <w:pPr>
+        <w:pStyle w:val="Heading2"/>
+        <w:spacing w:after="70" w:before="220"/>
+      </w:pPr>
+      <w:r>
+        <w:rPr>
+          <w:rFonts w:ascii="Arial" w:cs="Arial" w:eastAsia="Arial" w:hAnsi="Arial"/>
+          <w:b/>
+          <w:bCs/>
+          <w:color w:val="1A2744"/>
+          <w:sz w:val="21"/>
+          <w:szCs w:val="21"/>
+        </w:rPr>
+        <w:t xml:space="preserve">Companies that raised were repriced upward quickly</w:t>
+      </w:r>
+    </w:p>
+    <w:p>
+      <w:pPr>
+        <w:spacing w:after="160" w:line="276"/>
+        <w:jc w:val="left"/>
+      </w:pPr>
+      <w:r>
+        <w:rPr>
+          <w:rFonts w:ascii="Georgia" w:cs="Georgia" w:eastAsia="Georgia" w:hAnsi="Georgia"/>
+          <w:color w:val="1F2733"/>
+          <w:sz w:val="21"/>
+          <w:szCs w:val="21"/>
+        </w:rPr>
+        <w:t xml:space="preserve">The active financing market, the subset that actually raised, was strong. The median valuation step-up, the ratio of a new round's post-money to the prior round's, reached 2.20 times in 2026, up from 2.05 in 2025 and the highest since the 2.64 of the 2021 peak. The median interval between financings compressed to 0.98 years from 1.21 in 2025 and 1.45 in 2024. Down rounds have nearly vanished: six in the first half of 2026 worth $3.85 billion, against thirty-one in all of 2025 and thirty-four in 2024. The steepest revaluations came from small companies, Hark at 151 times its prior round, Blitzy and SendCutSend at 30 times, each valued below $7 billion, while the giants rose in dollars at modest multiples. Velocity lives at the small end, where one financing can revalue a company several times over; the stock of value lives at the large end. Every figure here describes only companies that raised, well under half the universe, and the untested majority is where the market's real risk sits.</w:t>
+      </w:r>
+    </w:p>
+    <w:p>
+      <w:pPr>
+        <w:pStyle w:val="Heading2"/>
+        <w:spacing w:after="70" w:before="220"/>
+      </w:pPr>
+      <w:r>
+        <w:rPr>
+          <w:rFonts w:ascii="Arial" w:cs="Arial" w:eastAsia="Arial" w:hAnsi="Arial"/>
+          <w:b/>
+          <w:bCs/>
+          <w:color w:val="1A2744"/>
+          <w:sz w:val="21"/>
+          <w:szCs w:val="21"/>
+        </w:rPr>
+        <w:t xml:space="preserve">AI holds three-fifths of the universe's value on two-fifths of its companies</w:t>
+      </w:r>
+    </w:p>
+    <w:p>
+      <w:pPr>
+        <w:spacing w:after="160" w:line="276"/>
+        <w:jc w:val="left"/>
+      </w:pPr>
+      <w:r>
+        <w:rPr>
+          <w:rFonts w:ascii="Georgia" w:cs="Georgia" w:eastAsia="Georgia" w:hAnsi="Georgia"/>
+          <w:color w:val="1F2733"/>
+          <w:sz w:val="21"/>
+          <w:szCs w:val="21"/>
+        </w:rPr>
+        <w:t xml:space="preserve">Artificial intelligence has passed a threshold. AI companies number 702 of 1,743 unicorns, 40.3% by count, yet account for $5.08 trillion of the $8.23 trillion in value, 61.7% of the total. The twenty-one-point gap between the shares measures how much larger the average AI company is, and it is widening: AI value rose from $3.49 trillion at the end of 2025 to $5.08 trillion by mid-2026, up 45.6% in six months, and AI accounted for 109 of the 178 companies newly crossing the billion-dollar threshold. With artificial intelligence at three-fifths of value and two-thirds of growth, an allocation to late-stage venture is a concentrated bet on one theme rather than a diversified position. A program built without an explicit view on AI is still long AI, at a weight that now exceeds what most diversified mandates would knowingly hold.</w:t>
       </w:r>
     </w:p>
     <w:p>
@@ -399,22 +354,7 @@
           <w:sz w:val="21"/>
           <w:szCs w:val="21"/>
         </w:rPr>
-        <w:t xml:space="preserve">Ranked by tagged value, software-as-a-service leads at $6.44 trillion across 968 companies and artificial intelligence follows at $6.02 trillion across 865, with financial technology a distant third at $2.02 trillion across 436. The next tier is far smaller: space technology at $1.87 trillion, mobility at $0.83 trillion, cloud infrastructure at $0.74 trillion, health technology at $0.45 trillion. The two leading categories hold roughly $12.5 trillion of tagged value between them, and every category from the fourth down is minor by comparison. Because a company can carry several vertical tags at once, these category totals sum past the 1,743 companies and their values sum to about 1.5 times the universe, so they cannot be added into a total. Much of the apparent breadth on a vertical map is the same companies counted twice under software and artificial intelligence, which means the diversity implied by an eleven-category chart is largely an artifact of the classification rather than a property of the opportunity set.</w:t>
-      </w:r>
-    </w:p>
-    <w:p>
-      <w:pPr>
-        <w:spacing w:after="160" w:line="276"/>
-        <w:jc w:val="left"/>
-      </w:pPr>
-      <w:r>
-        <w:rPr>
-          <w:rFonts w:ascii="Georgia" w:cs="Georgia" w:eastAsia="Georgia" w:hAnsi="Georgia"/>
-          <w:color w:val="1F2733"/>
-          <w:sz w:val="21"/>
-          <w:szCs w:val="21"/>
-        </w:rPr>
-        <w:t xml:space="preserve">Space technology illustrates how a category total can be a single company in disguise. Its $1.87 trillion across 34 companies averages roughly $55 billion each, but SpaceX is very nearly all of it; without SpaceX the category is unremarkable. The lesson generalizes: any vertical aggregate in this market should be checked for capture by one or two names before it is presented as evidence of a theme, because the concentration that defines the universe as a whole repeats inside its categories.</w:t>
+        <w:t xml:space="preserve">Software-as-a-service leads at $6.44 trillion across 968 companies and artificial intelligence follows at $6.02 trillion across 865, with financial technology a distant third at $2.02 trillion across 436. The next tier is far smaller: space technology $1.87 trillion, mobility $0.83 trillion, cloud infrastructure $0.74 trillion, health technology $0.45 trillion. The two leaders hold roughly $12.5 trillion between them. Because a company can carry several category tags, these totals sum past 1,743 companies and about 1.5 times the universe by value, so they cannot be added into a total, and much of the apparent breadth is the same companies counted twice under software and AI. Space technology shows how a category can be one company: its $1.87 trillion across 34 names averages $55 billion each, but SpaceX is nearly all of it, so the category total is a single company in all but name.</w:t>
       </w:r>
     </w:p>
     <w:p>
@@ -446,7 +386,7 @@
           <w:sz w:val="21"/>
           <w:szCs w:val="21"/>
         </w:rPr>
-        <w:t xml:space="preserve">The count of 1,743 unicorns overstates the number of large, recently valued companies by a wide margin, and the data shows by how much. Value concentrates at the top: the ten largest companies hold about $2.9 trillion, 35% of the $8.23 trillion total, while the median company is $2.0 billion, so most of the universe sits far below the names that carry it. Recency thins the field again, as only about a third of unicorns, 614 companies, have raised within the past twelve months, and the rest are priced off older financings. Geography and theme concentrate it further, with 54% of unicorns domiciled in the United States and 40% classified as artificial intelligence, while the data tracks secondary-market pricing for only about twenty names. Required together, size, recency, and liquidity leave a small subset of the headline count, weighted toward United States software and artificial intelligence.</w:t>
+        <w:t xml:space="preserve">The count of 1,743 overstates the number of large, recently valued companies. The ten largest hold about $2.9 trillion, 35% of the total, while the median company is $2.0 billion, so most of the universe sits far below the names that carry it. Only about a third of unicorns, 614 companies, have raised within the past twelve months; the rest are priced off older financings. Geography and theme narrow it further, with 54% domiciled in the United States and 40% classified as artificial intelligence. Size, recency, and liquidity required together leave a small subset of the headline count, weighted toward United States software and AI.</w:t>
       </w:r>
     </w:p>
     <w:p>
@@ -478,54 +418,39 @@
           <w:sz w:val="21"/>
           <w:szCs w:val="21"/>
         </w:rPr>
-        <w:t xml:space="preserve">Size and the rate of value creation diverge across categories. On 2026 medians, artificial intelligence recorded a relative velocity of value creation, the ratio of new valuation created to capital invested, of 1.84 times, with a 2.35 times step-up across 249 financings, and software 1.42 times and 2.18 times across 176, both near the middle of the range. The highest velocity sits in smaller categories: robotics and drones at 2.03 times and clean technology at 3.30 times, the latter with a 2.77 times step-up. Crypto fell from 2.62 times to 1.11 times. Cybersecurity at 0.66 times and e-commerce at 0.38 times are the lowest, both below 1.0 even as they raised at higher valuations (median step-ups of 1.74 and 2.13 times), which means each dollar invested created less than a dollar of new valuation and the recorded valuation rose faster than the value beneath it.</w:t>
-      </w:r>
-    </w:p>
-    <w:p>
-      <w:pPr>
-        <w:spacing w:after="160" w:line="276"/>
-        <w:jc w:val="left"/>
-      </w:pPr>
-      <w:r>
-        <w:rPr>
-          <w:rFonts w:ascii="Georgia" w:cs="Georgia" w:eastAsia="Georgia" w:hAnsi="Georgia"/>
-          <w:color w:val="1F2733"/>
-          <w:sz w:val="21"/>
-          <w:szCs w:val="21"/>
-        </w:rPr>
-        <w:t xml:space="preserve">The three-year record of realized index performance shows the same order. On the Monitor vertical indexes, stated as annualized returns, artificial intelligence returned 58.1% a year, a cumulative 302.6%; enterprise software returned 34.2% and cybersecurity 22.2%, the only other categories to beat the Global TME public benchmark at 19.6% a year, or 72.4% cumulative. Artificial intelligence compounded at about three times the public rate. Financial technology, third-largest by value, returned 12.9% and trailed the benchmark, pairing large size with a below-benchmark return. These figures are computed on valuations that update infrequently, which suppresses measured volatility and inflates any Sharpe ratio derived from them, so the low volatility of the private indexes reflects infrequent revaluation rather than genuine stability.</w:t>
-      </w:r>
-    </w:p>
-    <w:p>
-      <w:pPr>
-        <w:pStyle w:val="Heading2"/>
-        <w:spacing w:after="70" w:before="220"/>
-      </w:pPr>
-      <w:r>
-        <w:rPr>
-          <w:rFonts w:ascii="Arial" w:cs="Arial" w:eastAsia="Arial" w:hAnsi="Arial"/>
-          <w:b/>
-          <w:bCs/>
-          <w:color w:val="1A2744"/>
-          <w:sz w:val="21"/>
-          <w:szCs w:val="21"/>
-        </w:rPr>
-        <w:t xml:space="preserve">AI is the source of both the return and the concentration of the risk</w:t>
-      </w:r>
-    </w:p>
-    <w:p>
-      <w:pPr>
-        <w:spacing w:after="160" w:line="276"/>
-        <w:jc w:val="left"/>
-      </w:pPr>
-      <w:r>
-        <w:rPr>
-          <w:rFonts w:ascii="Georgia" w:cs="Georgia" w:eastAsia="Georgia" w:hAnsi="Georgia"/>
-          <w:color w:val="1F2733"/>
-          <w:sz w:val="21"/>
-          <w:szCs w:val="21"/>
-        </w:rPr>
-        <w:t xml:space="preserve">Artificial intelligence is both the source of the market's growth and its largest concentration of value, in the same companies. It produced $1.59 trillion of the $0.93 trillion universe gain, so the rest of the market contracted around it, and it now represents 62% of value, four of the five largest rounds, and 61% of new company formation. Because AI valuations move together and dominate the index, a repricing in a handful of frontier names moves the entire aggregate: a 25% reduction in AI valuations would remove roughly $1.27 trillion, 15.4% of all private-technology value. The companies that produced the market's gain are the same ones the secondary market already values well below their model valuations, so the exposure that drove the aggregate up carries the widest downside, and it sits in too large a share of the universe to be diversified away within it.</w:t>
+        <w:t xml:space="preserve">On 2026 medians, artificial intelligence recorded a relative velocity of value creation, the ratio of new valuation created to capital invested, of 1.84 times with a 2.35 times step-up across 249 financings, and software 1.42 and 2.18 across 176. The highest velocity sits in smaller categories: robotics and drones at 2.03 times, clean technology at 3.30 with a 2.77 step-up. Crypto fell from 2.62 to 1.11. Cybersecurity at 0.66 and e-commerce at 0.38 are lowest, both below 1.0 even as they raised at higher valuations (step-ups of 1.74 and 2.13 times), so each dollar invested created less than a dollar of new valuation. The three-year Monitor vertical indexes show the same order, stated as annualized returns: AI returned 58.1% a year (302.6% cumulative), enterprise software 34.2%, and cybersecurity 22.2%, the only categories to beat the Global TME benchmark of 19.6% a year (72.4% cumulative). AI compounded at about three times the public rate; financial technology, third by value, returned 12.9% and trailed. These returns run on infrequently updated valuations, which suppresses measured volatility, so the low volatility of the private indexes reflects infrequent revaluation, not stability.</w:t>
+      </w:r>
+    </w:p>
+    <w:p>
+      <w:pPr>
+        <w:pStyle w:val="Heading2"/>
+        <w:spacing w:after="70" w:before="220"/>
+      </w:pPr>
+      <w:r>
+        <w:rPr>
+          <w:rFonts w:ascii="Arial" w:cs="Arial" w:eastAsia="Arial" w:hAnsi="Arial"/>
+          <w:b/>
+          <w:bCs/>
+          <w:color w:val="1A2744"/>
+          <w:sz w:val="21"/>
+          <w:szCs w:val="21"/>
+        </w:rPr>
+        <w:t xml:space="preserve">AI is the source of both the return and the risk</w:t>
+      </w:r>
+    </w:p>
+    <w:p>
+      <w:pPr>
+        <w:spacing w:after="160" w:line="276"/>
+        <w:jc w:val="left"/>
+      </w:pPr>
+      <w:r>
+        <w:rPr>
+          <w:rFonts w:ascii="Georgia" w:cs="Georgia" w:eastAsia="Georgia" w:hAnsi="Georgia"/>
+          <w:color w:val="1F2733"/>
+          <w:sz w:val="21"/>
+          <w:szCs w:val="21"/>
+        </w:rPr>
+        <w:t xml:space="preserve">Artificial intelligence is both the source of the market's growth and its largest concentration of value, in the same companies. It produced $1.59 trillion of the $0.93 trillion universe gain, so the rest contracted around it, and it now represents 62% of value, four of the five largest rounds, and 61% of new company formation. Because AI valuations move together and dominate the index, a repricing in a few frontier names moves the aggregate: a 25% reduction in AI valuations would remove roughly $1.27 trillion, 15.4% of all private-technology value. The companies that produced the gain are the same ones the secondary market values well below their model valuations, so the exposure that drove the aggregate up carries the widest downside and sits in too large a share of the universe to be diversified away within it.</w:t>
       </w:r>
     </w:p>
     <w:p>
@@ -557,22 +482,7 @@
           <w:sz w:val="21"/>
           <w:szCs w:val="21"/>
         </w:rPr>
-        <w:t xml:space="preserve">The 2021 vintage shows how a boom cohort ages. Of 635 unicorns minted in 2021, five years on 470 remain active (74%), 102 have exited (16%), and 62 have failed: 34 fell below the billion-dollar threshold while still private, 15 fell at exit through a public listing or sale below unicorn status, and 13 went bankrupt. Three-quarters of the cohort remain illiquid four and a half years after formation, consistent with a median time to exit of 8.47 years. The 15 that fell at exit are recorded as exits in the headline figures rather than as failures, so the reported exit count overstates successful outcomes.</w:t>
-      </w:r>
-    </w:p>
-    <w:p>
-      <w:pPr>
-        <w:spacing w:after="160" w:line="276"/>
-        <w:jc w:val="left"/>
-      </w:pPr>
-      <w:r>
-        <w:rPr>
-          <w:rFonts w:ascii="Georgia" w:cs="Georgia" w:eastAsia="Georgia" w:hAnsi="Georgia"/>
-          <w:color w:val="1F2733"/>
-          <w:sz w:val="21"/>
-          <w:szCs w:val="21"/>
-        </w:rPr>
-        <w:t xml:space="preserve">Today's 702 artificial-intelligence unicorns are a cohort of the same size at an earlier stage. If they age as the 2021 vintage did, roughly a quarter would impair and three-quarters would remain illiquid into the next decade, though AI valuations are more correlated and more concentrated than the 2021 cohort's, so those outcomes would be more tightly linked to a common driver. The ten-year funds that financed the 2021 vintage mature between 2028 and 2031, the period over which those untested valuations resolve through markdown, sale, or wind-down.</w:t>
+        <w:t xml:space="preserve">Of 635 unicorns minted in 2021, five years on 470 remain active (74%), 102 have exited (16%), and 62 have failed: 34 fell below the billion-dollar threshold while private, 15 fell at exit through a listing or sale below unicorn status, and 13 went bankrupt. Three-quarters remain illiquid four and a half years after formation, consistent with a median time to exit of 8.47 years, and the 15 that fell at exit are recorded as exits rather than failures, so the reported exit count overstates successful outcomes. Today's 702 AI unicorns are a cohort of the same size at an earlier stage. If they age as the 2021 vintage did, roughly a quarter would impair and three-quarters would remain illiquid into the next decade, though AI valuations are more correlated and concentrated than 2021's, so those outcomes would be more tightly linked. The ten-year funds that financed the 2021 vintage mature between 2028 and 2031, the period over which those untested valuations resolve through markdown, sale, or wind-down.</w:t>
       </w:r>
     </w:p>
     <w:p>
@@ -624,7 +534,7 @@
           <w:sz w:val="21"/>
           <w:szCs w:val="21"/>
         </w:rPr>
-        <w:t xml:space="preserve">The structure of financing tightened even as the number of rounds fell. Syndicates of six or more investors made up 60.9% of 2026 rounds with disclosed participation, close to the 2021 peak of 64%, so the rounds that do occur are more crowded than before. Investor participation by count, however, has not recovered alongside the dollars: it peaked at 2,892 in the third quarter of 2021, bottomed at 895 in the fourth quarter of 2023, recovered to 1,415 in the first quarter of 2026, then fell back to 995 in the second quarter even as financing value stayed high. A small number of firms account for the most financings: Sequoia Capital participated in 491 unicorn financings since 2016, Tiger Global 472, Andreessen Horowitz 454, Accel 382, and Coatue 344. Investor concentration mirrors company concentration: a narrow set of funds backs a narrow set of companies.</w:t>
+        <w:t xml:space="preserve">Syndicates of six or more investors made up 60.9% of 2026 rounds with disclosed participation, near the 2021 peak of 64%, so the rounds that occur are more crowded. Investor participation by count has not recovered with the dollars: it peaked at 2,892 in the third quarter of 2021, bottomed at 895 in the fourth quarter of 2023, recovered to 1,415 in the first quarter of 2026, then fell back to 995 in the second even as financing value stayed high. A small number of firms account for the most financings: Sequoia Capital participated in 491 unicorn financings since 2016, Tiger Global 472, Andreessen Horowitz 454, Accel 382, and Coatue 344. Investor concentration mirrors company concentration.</w:t>
       </w:r>
     </w:p>
     <w:p>
@@ -656,7 +566,7 @@
           <w:sz w:val="21"/>
           <w:szCs w:val="21"/>
         </w:rPr>
-        <w:t xml:space="preserve">Exit value in 2026 reached $2,110.9 billion across 50 exits, the highest in the data, and a single event accounts for four-fifths of it. SpaceX's public listing was $1,690 billion on its own; excluding it, exit value was $420.7 billion, the strongest year since 2021 but far below the headline. Public listings drove 85% of exit value, and after three years of few listings, SpaceX, Cerebras at $34 billion, and Quantinuum at $14 billion all listed in the quarter. The median time to exit rose to 8.47 years, near the 9.17-year peak of 2025, so the companies reaching liquidity now are older vintages rather than recent 2023 and 2024 formations. The 2026 exit total therefore reflects one large listing and a backlog of aged companies reaching liquidity, not a broad acceleration of recent cohorts to exit.</w:t>
+        <w:t xml:space="preserve">Exit value in 2026 reached $2,110.9 billion across 50 exits, the highest in the data, and a single event is four-fifths of it. SpaceX's listing was $1,690 billion; excluding it, exit value was $420.7 billion, the strongest year since 2021 but far below the headline. Public listings drove 85% of exit value, and after three years of few listings, SpaceX, Cerebras ($34 billion), and Quantinuum ($14 billion) all listed in the quarter. The median time to exit rose to 8.47 years, near the 9.17-year peak of 2025, so the companies reaching liquidity now are older vintages, not recent 2023 and 2024 formations. The 2026 total reflects one large listing and a backlog of aged companies clearing, not a broad acceleration of recent cohorts.</w:t>
       </w:r>
     </w:p>
     <w:p>
@@ -708,7 +618,7 @@
           <w:sz w:val="21"/>
           <w:szCs w:val="21"/>
         </w:rPr>
-        <w:t xml:space="preserve">Sorted by post-money valuation, the largest companies read Anthropic, OpenAI, ByteDance, Stripe, Databricks, Waymo. That order reflects expense, and expense depends on capital raised as much as on value created, so two companies at the same valuation can differ by an order of magnitude in capital efficiency. Part of the ranking is stale as well, with two of the ten largest companies still carrying valuations more than a year old that a fresh financing could move in either direction. A quality-adjusted ranking would reorder the list substantially, which is the reason a business-quality score has to sit beside the valuation rather than beneath it: the two answer different questions, and conflating them is how expensive companies come to be mistaken for good ones.</w:t>
+        <w:t xml:space="preserve">Sorted by post-money valuation, the largest companies read Anthropic, OpenAI, ByteDance, Stripe, Databricks, Waymo. That order reflects expense, and expense depends on capital raised as much as on value created, so two companies at the same valuation can differ by an order of magnitude in capital efficiency. Two of the ten largest still carry valuations more than a year old that a fresh financing could move either way. A quality-adjusted ranking would reorder the list, which is why a business-quality score has to sit beside the valuation rather than beneath it.</w:t>
       </w:r>
     </w:p>
     <w:p>
@@ -740,7 +650,7 @@
           <w:sz w:val="21"/>
           <w:szCs w:val="21"/>
         </w:rPr>
-        <w:t xml:space="preserve">A complete PitchBook or AI business-quality composite requires operating inputs, revenue quality, margins, customer concentration, compute independence, governance, and competitive moat, that none of the three source files contain. Composites exist for only six frontier companies, carried from the prior edition rather than derived from these files: Databricks at 8.7, Anthropic at 7.7, SpaceX at 7.5, OpenAI at 4.2, xAI at 3.8, and SSI at 2.3. The range among them makes the case for the framework on its own, since OpenAI, the second most valuable company in this universe, scores below the midpoint, a divergence between price and quality that a valuation ranking cannot express. The one quality dimension the current data does measure is estimate integrity, the agreement among a company's three valuations. Canva, Stripe, and Rippling cluster tightly and therefore carry corroborated valuations; Neuralink, whose model valuation sits 441% above its last round, along with Ripple and Kraken, diverge widely and carry low valuation reliability, which is itself a governance signal worth scoring. Extending the composite to all twenty companies, and building the quality-per-dollar ranking that would invert the price order, depends on analyst inputs this data does not supply, and should be scoped as pending rather than estimated.</w:t>
+        <w:t xml:space="preserve">[Pending analyst data.] The full PitchBook and AI business-quality composites require operating inputs, revenue quality, margins, customer concentration, compute independence, governance, and moat, that are not yet received. This section will score the twenty companies once that data arrives; the valuation-ranking point above holds independently of it.</w:t>
       </w:r>
     </w:p>
     <w:p>
@@ -792,39 +702,39 @@
           <w:sz w:val="21"/>
           <w:szCs w:val="21"/>
         </w:rPr>
-        <w:t xml:space="preserve">Anthropic at $965 billion and OpenAI at $852 billion together hold $1.82 trillion, 22% of the $8.23 trillion universe, and the ten largest companies hold about $2.9 trillion, 35% of it, against a median company of $2.0 billion. At this degree of concentration the index and the median move independently: the aggregate can rise on a dozen revaluations while the typical unicorn stands still. The two should be read as separate instruments, one tracking a handful of frontier companies and the other the remaining seventeen hundred, and an institution that treats a move in the aggregate as information about its median holding will misjudge both the direction and the size of what is happening in its portfolio.</w:t>
-      </w:r>
-    </w:p>
-    <w:p>
-      <w:pPr>
-        <w:pStyle w:val="Heading2"/>
-        <w:spacing w:after="70" w:before="220"/>
-      </w:pPr>
-      <w:r>
-        <w:rPr>
-          <w:rFonts w:ascii="Arial" w:cs="Arial" w:eastAsia="Arial" w:hAnsi="Arial"/>
-          <w:b/>
-          <w:bCs/>
-          <w:color w:val="1A2744"/>
-          <w:sz w:val="21"/>
-          <w:szCs w:val="21"/>
-        </w:rPr>
-        <w:t xml:space="preserve">Valuations are current at the very top and grow stale quickly below it</w:t>
-      </w:r>
-    </w:p>
-    <w:p>
-      <w:pPr>
-        <w:spacing w:after="160" w:line="276"/>
-        <w:jc w:val="left"/>
-      </w:pPr>
-      <w:r>
-        <w:rPr>
-          <w:rFonts w:ascii="Georgia" w:cs="Georgia" w:eastAsia="Georgia" w:hAnsi="Georgia"/>
-          <w:color w:val="1F2733"/>
-          <w:sz w:val="21"/>
-          <w:szCs w:val="21"/>
-        </w:rPr>
-        <w:t xml:space="preserve">Anthropic, whose valuation was set in May 2026, ByteDance in May 2026, and OpenAI in March 2026 carry recent valuations. Below the leaders the valuations age fast: Ant Group, seventh by value, still carries a financing from August 2020, and SHEIN one from January 2024. Measured from actual latest-financing dates across the active universe, 47.6% of unicorns have not raised in more than 24 months and 37.1% in more than 36 months. That figure is the credibility test behind the $8.23 trillion headline: close to half of the total rests on valuations that no financing has retested in two years or more. The universe divides into a small frontier of recently priced companies and a large interior of dated valuations whose repricing risk does not appear in the aggregate, and the total should be separated into recently tested and untested dollars before it is quoted as a market level. Treating the $8.23 trillion as a single current number blends roughly forty companies priced this year with hundreds priced years ago, and conceals the difference that matters most. (The 47.6% figure derives from latest-financing dates and replaces an earlier qualifying-date proxy of 78.5%, which overstated staleness.)</w:t>
+        <w:t xml:space="preserve">Anthropic ($965 billion) and OpenAI ($852 billion) together hold $1.82 trillion, 22% of the $8.23 trillion universe, and the ten largest hold about $2.9 trillion, 35% of it, against a $2.0 billion median. At this concentration the index and the median move independently: the aggregate can rise on a dozen revaluations while the typical unicorn stands still, so a move in the aggregate is not information about the median holding.</w:t>
+      </w:r>
+    </w:p>
+    <w:p>
+      <w:pPr>
+        <w:pStyle w:val="Heading2"/>
+        <w:spacing w:after="70" w:before="220"/>
+      </w:pPr>
+      <w:r>
+        <w:rPr>
+          <w:rFonts w:ascii="Arial" w:cs="Arial" w:eastAsia="Arial" w:hAnsi="Arial"/>
+          <w:b/>
+          <w:bCs/>
+          <w:color w:val="1A2744"/>
+          <w:sz w:val="21"/>
+          <w:szCs w:val="21"/>
+        </w:rPr>
+        <w:t xml:space="preserve">Valuations are current at the top and grow stale quickly below it</w:t>
+      </w:r>
+    </w:p>
+    <w:p>
+      <w:pPr>
+        <w:spacing w:after="160" w:line="276"/>
+        <w:jc w:val="left"/>
+      </w:pPr>
+      <w:r>
+        <w:rPr>
+          <w:rFonts w:ascii="Georgia" w:cs="Georgia" w:eastAsia="Georgia" w:hAnsi="Georgia"/>
+          <w:color w:val="1F2733"/>
+          <w:sz w:val="21"/>
+          <w:szCs w:val="21"/>
+        </w:rPr>
+        <w:t xml:space="preserve">Anthropic (valued May 2026), ByteDance (May 2026), and OpenAI (March 2026) carry recent valuations. Below the leaders they age fast: Ant Group, seventh by value, carries a financing from August 2020, and SHEIN one from January 2024. Measured from actual latest-financing dates, 47.6% of unicorns have not raised in more than 24 months and 37.1% in more than 36. Close to half of the $8.23 trillion rests on valuations no financing has retested in two years or more. The universe divides into a small frontier of recently priced companies and a large interior of dated valuations whose repricing risk does not appear in the aggregate; the total blends roughly forty companies priced this year with hundreds priced years ago, and should be separated into recently tested and untested dollars.</w:t>
       </w:r>
     </w:p>
     <w:p>
@@ -856,39 +766,39 @@
           <w:sz w:val="21"/>
           <w:szCs w:val="21"/>
         </w:rPr>
-        <w:t xml:space="preserve">The median relative velocity of value creation rose to 1.42 times in 2026 from 0.93 times in 2025 and a low of 0.23 times in 2023, returning above its pre-boom baseline of roughly 0.73 times. The 2.20 times median step-up and 0.98-year interval between financings point the same way. A velocity above 1.0 means each dollar raised created more than a dollar of new valuation, a reversal from 2023, when financings diluted existing holders more than they built value. The average velocity of 2.73 times against the 1.42 times median carries the same skew as the valuations themselves: value creation, like value, concentrates in a few names, and the measure counts only companies that raised, so it describes the health of the active market rather than the universe.</w:t>
-      </w:r>
-    </w:p>
-    <w:p>
-      <w:pPr>
-        <w:pStyle w:val="Heading2"/>
-        <w:spacing w:after="70" w:before="220"/>
-      </w:pPr>
-      <w:r>
-        <w:rPr>
-          <w:rFonts w:ascii="Arial" w:cs="Arial" w:eastAsia="Arial" w:hAnsi="Arial"/>
-          <w:b/>
-          <w:bCs/>
-          <w:color w:val="1A2744"/>
-          <w:sz w:val="21"/>
-          <w:szCs w:val="21"/>
-        </w:rPr>
-        <w:t xml:space="preserve">The rate of new failures has fallen while the population of untested companies has grown</w:t>
-      </w:r>
-    </w:p>
-    <w:p>
-      <w:pPr>
-        <w:spacing w:after="160" w:line="276"/>
-        <w:jc w:val="left"/>
-      </w:pPr>
-      <w:r>
-        <w:rPr>
-          <w:rFonts w:ascii="Georgia" w:cs="Georgia" w:eastAsia="Georgia" w:hAnsi="Georgia"/>
-          <w:color w:val="1F2733"/>
-          <w:sz w:val="21"/>
-          <w:szCs w:val="21"/>
-        </w:rPr>
-        <w:t xml:space="preserve">A total of 245 unicorns have fallen below the billion-dollar threshold to date, and the flow of new failures has nearly stopped: six down rounds in the first half of 2026, worth $3.85 billion, against a peak of 34 in 2024. Failures are severe when they occur, with a median failing valuation of $524.5 million and a median decline of 67% from the prior peak, leaving the typical fallen company at about a third of its high valuation, just below the billion-dollar line. The 2021 cohort's 15 companies that fell at exit are recorded as exits rather than failures, so the reported failure count understates losses. The low current count also reflects how failures are measured: a company is recognized as failing only when it raises at a lower valuation, and 47.6% of the universe has not raised in more than two years, so the companies most likely to be carrying stale valuations are absent from the count. The failure rate describes companies that raised, not the dormant majority.</w:t>
+        <w:t xml:space="preserve">The median relative velocity of value creation rose to 1.42 times in 2026 from 0.93 in 2025 and a low of 0.23 in 2023, above its pre-boom baseline of roughly 0.73. The 2.20 median step-up and 0.98-year interval point the same way. Velocity above 1.0 means each dollar raised created more than a dollar of new valuation, a reversal from 2023, when financings diluted holders more than they built value. The 2.73 average against the 1.42 median carries the same skew as valuations: value creation concentrates in a few names, and the measure counts only companies that raised.</w:t>
+      </w:r>
+    </w:p>
+    <w:p>
+      <w:pPr>
+        <w:pStyle w:val="Heading2"/>
+        <w:spacing w:after="70" w:before="220"/>
+      </w:pPr>
+      <w:r>
+        <w:rPr>
+          <w:rFonts w:ascii="Arial" w:cs="Arial" w:eastAsia="Arial" w:hAnsi="Arial"/>
+          <w:b/>
+          <w:bCs/>
+          <w:color w:val="1A2744"/>
+          <w:sz w:val="21"/>
+          <w:szCs w:val="21"/>
+        </w:rPr>
+        <w:t xml:space="preserve">The rate of new failures has fallen while the untested population has grown</w:t>
+      </w:r>
+    </w:p>
+    <w:p>
+      <w:pPr>
+        <w:spacing w:after="160" w:line="276"/>
+        <w:jc w:val="left"/>
+      </w:pPr>
+      <w:r>
+        <w:rPr>
+          <w:rFonts w:ascii="Georgia" w:cs="Georgia" w:eastAsia="Georgia" w:hAnsi="Georgia"/>
+          <w:color w:val="1F2733"/>
+          <w:sz w:val="21"/>
+          <w:szCs w:val="21"/>
+        </w:rPr>
+        <w:t xml:space="preserve">A total of 245 unicorns have fallen below the billion-dollar threshold to date, and new failures have nearly stopped: six down rounds in the first half of 2026 worth $3.85 billion, against a peak of 34 in 2024. Failures are severe when they occur, a median failing valuation of $524.5 million and a median decline of 67% from the prior peak, leaving the typical fallen company at about a third of its high, just below the billion-dollar line. The 2021 cohort's 15 companies that fell at exit are recorded as exits, so the reported failure count understates losses. A company is recognized as failing only when it raises at a lower valuation, and 47.6% of the universe has not raised in more than two years, so the count describes companies that raised, not the dormant majority.</w:t>
       </w:r>
     </w:p>
     <w:p>
@@ -923,22 +833,37 @@
           <w:sz w:val="21"/>
           <w:szCs w:val="21"/>
         </w:rPr>
-        <w:t xml:space="preserve">The $8.23 trillion is real, heavily concentrated, and largely untested. Two companies hold 22% of it, the five largest financings took 62% of the quarter's deal value, and 47.6% of all valuations have gone more than two years without a financing to confirm them. The valuations that are current, at the very top, are the ones the secondary market prices most below the model, by 22% at Anthropic and 32% at SpaceX. The governing fact of the quarter is artificial intelligence: it added more value in six months than the entire universe gained, and it now holds three-fifths of all private-technology value on two-fifths of the companies. The active financing market functions again, the public-listing window has reopened on the strength of a single SpaceX listing, and failures have slowed, but the 2021 vintage shows what follows a boom of this shape, roughly a quarter of the cohort impaired and three-quarters still illiquid five years on, resolving against a fund timetable that runs from 2028 to 2031.</w:t>
-      </w:r>
-    </w:p>
-    <w:p>
-      <w:pPr>
-        <w:spacing w:after="160" w:line="276"/>
-        <w:jc w:val="left"/>
-      </w:pPr>
-      <w:r>
-        <w:rPr>
-          <w:rFonts w:ascii="Georgia" w:cs="Georgia" w:eastAsia="Georgia" w:hAnsi="Georgia"/>
-          <w:color w:val="1F2733"/>
-          <w:sz w:val="21"/>
-          <w:szCs w:val="21"/>
-        </w:rPr>
-        <w:t xml:space="preserve">The figure to track is not the aggregate, which will keep climbing on a dozen artificial-intelligence valuations. It is the share of value resting on recently tested valuations against dated ones, and the event that will move it is the next set of frontier financings. The secondary market already values the largest AI companies well below their model valuations. Should the next Anthropic or SpaceX round clear below its model rather than above it, the repricing will not stay contained to a single company, because on the correlations this market now carries, a 25% reduction in AI valuations is $1.27 trillion off the top of the universe, and the same concentration that produced the quarter's gains would carry the losses just as efficiently.</w:t>
+        <w:t xml:space="preserve">The $8.23 trillion is real, concentrated, and largely untested. Two companies hold 22% of it, the five largest financings took 62% of the quarter's deal value, and 47.6% of all valuations have gone more than two years without a financing to confirm them. The valuations that are current, at the top, are the ones the secondary market prices most below the model, by 22% at Anthropic and 32% at SpaceX. The governing fact is artificial intelligence: it added more value in six months than the entire universe gained and now holds three-fifths of all private-technology value on two-fifths of the companies.</w:t>
+      </w:r>
+    </w:p>
+    <w:p>
+      <w:pPr>
+        <w:spacing w:after="160" w:line="276"/>
+        <w:jc w:val="left"/>
+      </w:pPr>
+      <w:r>
+        <w:rPr>
+          <w:rFonts w:ascii="Georgia" w:cs="Georgia" w:eastAsia="Georgia" w:hAnsi="Georgia"/>
+          <w:color w:val="1F2733"/>
+          <w:sz w:val="21"/>
+          <w:szCs w:val="21"/>
+        </w:rPr>
+        <w:t xml:space="preserve">The figure to track is not the aggregate, which will keep climbing on a dozen AI valuations, but the share of value resting on recently tested valuations against dated ones, and the event that will move it is the next set of frontier financings. Should the next Anthropic or SpaceX round clear below its model rather than above it, the repricing will not stay contained to a single company: on the correlations this market carries, a 25% reduction in AI valuations is $1.27 trillion off the top of the universe.</w:t>
+      </w:r>
+    </w:p>
+    <w:p>
+      <w:pPr>
+        <w:spacing w:after="160" w:line="276"/>
+        <w:jc w:val="left"/>
+      </w:pPr>
+      <w:r>
+        <w:rPr>
+          <w:rFonts w:ascii="Georgia" w:cs="Georgia" w:eastAsia="Georgia" w:hAnsi="Georgia"/>
+          <w:color w:val="1F2733"/>
+          <w:sz w:val="21"/>
+          <w:szCs w:val="21"/>
+        </w:rPr>
+        <w:t xml:space="preserve">Source: PitchBook deal-level unicorn tracker (Final Q2 2026 Quarterly Unicorn Tracker); Morningstar PitchBook Unicorn 20 Valuations and Pricing Data; Unicorn Monitor Data Q2 2026. As of June 30, 2026. Figures on the primary-tracker basis unless flagged; not blended across bases.</w:t>
       </w:r>
     </w:p>
     <w:p>

</xml_diff>

<commit_message>
Simplify the three-valuation section for flow and clarity
Rewrite three passages in the valuation-comparison section: plainer statement of
the model-vs-last-round gap and why it exists; smoother secondary-market
paragraph that also fixes an ambiguity (both valuations no longer read as set by
both events); and a cleaner valuation-reliability close with no trader
shorthand. Figures unchanged. Rebuilt the .docx.

Co-Authored-By: Claude Opus 4.8 <noreply@anthropic.com>
Claude-Session: https://claude.ai/code/session_01KcQ6jidyMrCam9PxNDFS9i
</commit_message>
<xml_diff>
--- a/templates/q2_2026_report.docx
+++ b/templates/q2_2026_report.docx
@@ -176,37 +176,37 @@
           <w:sz w:val="21"/>
           <w:szCs w:val="21"/>
         </w:rPr>
-        <w:t xml:space="preserve">Each of the twenty most closely followed private companies can be valued three ways: a daily, model-derived valuation published by Morningstar; the post-money valuation of the last completed primary financing, fixed until the next round; and an implied valuation from actual secondary-market transactions, the price at which shares change hands. In aggregate the model-derived valuations sit 15.2% above the last-round valuations for the eighteen companies with a priced round, the expected pattern when a live estimate leads a financing several months stale.</w:t>
-      </w:r>
-    </w:p>
-    <w:p>
-      <w:pPr>
-        <w:spacing w:after="160" w:line="276"/>
-        <w:jc w:val="left"/>
-      </w:pPr>
-      <w:r>
-        <w:rPr>
-          <w:rFonts w:ascii="Georgia" w:cs="Georgia" w:eastAsia="Georgia" w:hAnsi="Georgia"/>
-          <w:color w:val="1F2733"/>
-          <w:sz w:val="21"/>
-          <w:szCs w:val="21"/>
-        </w:rPr>
-        <w:t xml:space="preserve">The secondary market diverges exactly where the capital sits. For twelve of the twenty, shares trade below the model-derived valuation, and for the two largest the discount is severe: SpaceX changes hands 32% below its $2.03 trillion model valuation, about $650 billion, and Anthropic 22% below its $1.27 trillion valuation, about $282 billion. Both were struck on a recent event, SpaceX's June listing and an Anthropic financing, and both moved ahead of a market that had not repriced. Lower down the relationship inverts: Applied Intuition, Anysphere, Anduril, and Revolut trade 16% to 36% above their last round, so their recorded valuations understate them. At the bottom, model, last round, and secondary market have reset lower together at Ripple, Epic Games, and Kraken.</w:t>
-      </w:r>
-    </w:p>
-    <w:p>
-      <w:pPr>
-        <w:spacing w:after="160" w:line="276"/>
-        <w:jc w:val="left"/>
-      </w:pPr>
-      <w:r>
-        <w:rPr>
-          <w:rFonts w:ascii="Georgia" w:cs="Georgia" w:eastAsia="Georgia" w:hAnsi="Georgia"/>
-          <w:color w:val="1F2733"/>
-          <w:sz w:val="21"/>
-          <w:szCs w:val="21"/>
-        </w:rPr>
-        <w:t xml:space="preserve">Valuation reliability, the agreement among independent estimates, runs inversely to position size. The companies most likely to dominate a late-stage portfolio are the least corroborated by trading, so a portfolio carried at model values holds its largest positions 20% to 30% above the price a buyer is currently paying, and the gap widens with position size.</w:t>
+        <w:t xml:space="preserve">Each of the twenty most closely followed private companies can be valued three ways: a daily, model-derived valuation published by Morningstar; the post-money valuation of the last completed primary financing, fixed until the next round; and an implied valuation from actual secondary-market transactions, the price at which shares change hands. Across the eighteen companies with a priced round, model-derived valuations sit 15.2% above last-round valuations. The gap is expected, since the model updates daily while the last-round valuation stays fixed until the next financing.</w:t>
+      </w:r>
+    </w:p>
+    <w:p>
+      <w:pPr>
+        <w:spacing w:after="160" w:line="276"/>
+        <w:jc w:val="left"/>
+      </w:pPr>
+      <w:r>
+        <w:rPr>
+          <w:rFonts w:ascii="Georgia" w:cs="Georgia" w:eastAsia="Georgia" w:hAnsi="Georgia"/>
+          <w:color w:val="1F2733"/>
+          <w:sz w:val="21"/>
+          <w:szCs w:val="21"/>
+        </w:rPr>
+        <w:t xml:space="preserve">The secondary market disagrees most where the money is. Shares in twelve of the twenty companies trade below their model-derived valuation, and the two largest carry the widest discounts. SpaceX changes hands 32% below its $2.03 trillion model valuation, a gap of roughly $650 billion, and Anthropic 22% below its $1.27 trillion valuation, about $282 billion. Both valuations were set on recent events, SpaceX's June listing and an Anthropic financing, and both ran ahead of a secondary market that had yet to reprice. Further down the list the pattern reverses. Applied Intuition, Anysphere, Anduril, and Revolut all trade 16% to 36% above their last round, so their recorded valuations understate what buyers will pay. At the bottom, all three measures have fallen together at Ripple, Epic Games, and Kraken.</w:t>
+      </w:r>
+    </w:p>
+    <w:p>
+      <w:pPr>
+        <w:spacing w:after="160" w:line="276"/>
+        <w:jc w:val="left"/>
+      </w:pPr>
+      <w:r>
+        <w:rPr>
+          <w:rFonts w:ascii="Georgia" w:cs="Georgia" w:eastAsia="Georgia" w:hAnsi="Georgia"/>
+          <w:color w:val="1F2733"/>
+          <w:sz w:val="21"/>
+          <w:szCs w:val="21"/>
+        </w:rPr>
+        <w:t xml:space="preserve">Valuation reliability, meaning how closely the independent estimates agree, is weakest at the largest companies. Those are the names most likely to dominate a late-stage portfolio, so a portfolio carried at model values holds its biggest positions 20% to 30% above what buyers are currently paying, and the overstatement grows with the size of the position.</w:t>
       </w:r>
     </w:p>
     <w:p>

</xml_diff>

<commit_message>
Apply final polish pass and rebuild Word document with chart
Restructure to the four-section spine (Market overview absorbs deal dynamics and
exits; last section renamed Valuations and fallen unicorns) and apply the five
craft refinements: a two-sentence lede, the closing callback to the
five-companies line, two long-then-short beats at the secondary-market and
AI-scenario moments, the skew phrasing replacing the stock line, and the
frontier/interior image carried into the close. Rebuild the .docx with the
quality-vs-valuation chart embedded in the AIBQ/PBQ section; source line now
carried in the file itself. Build script committed alongside.

Co-Authored-By: Claude Fable 5 <noreply@anthropic.com>
Claude-Session: https://claude.ai/code/session_01KcQ6jidyMrCam9PxNDFS9i
</commit_message>
<xml_diff>
--- a/templates/q2_2026_report.docx
+++ b/templates/q2_2026_report.docx
@@ -28,9 +28,7 @@
       <w:r>
         <w:rPr>
           <w:rFonts w:ascii="Arial" w:cs="Arial" w:eastAsia="Arial" w:hAnsi="Arial"/>
-          <w:caps w:val="false"/>
           <w:color w:val="55637A"/>
-          <w:spacing w:val="6"/>
           <w:sz w:val="20"/>
           <w:szCs w:val="20"/>
         </w:rPr>
@@ -83,16 +81,15 @@
     <w:p>
       <w:pPr>
         <w:spacing w:after="160" w:line="276"/>
-        <w:jc w:val="left"/>
-      </w:pPr>
-      <w:r>
-        <w:rPr>
-          <w:rFonts w:ascii="Georgia" w:cs="Georgia" w:eastAsia="Georgia" w:hAnsi="Georgia"/>
-          <w:color w:val="1F2733"/>
-          <w:sz w:val="21"/>
-          <w:szCs w:val="21"/>
-        </w:rPr>
-        <w:t xml:space="preserve">The private unicorn universe ended the second quarter of 2026 at an aggregate post-money valuation of $8.23 trillion across 1,743 companies, up roughly 13% over the prior year. The headline reads as a broad, healthy ecosystem, but artificial-intelligence companies added $1.59 trillion of value in the first half while the universe as a whole gained $0.93 trillion, which means every part of the market outside artificial intelligence contracted in aggregate, by roughly $0.66 trillion combined. A single theme is lifting the average while the rest of the market gives ground, and the questions that follow, how trustworthy the valuations are, where liquidity exists, and how today's cohort will age, each turn on that fact.</w:t>
+      </w:pPr>
+      <w:r>
+        <w:rPr>
+          <w:rFonts w:ascii="Georgia" w:cs="Georgia" w:eastAsia="Georgia" w:hAnsi="Georgia"/>
+          <w:color w:val="1F2733"/>
+          <w:sz w:val="21"/>
+          <w:szCs w:val="21"/>
+        </w:rPr>
+        <w:t xml:space="preserve">The unicorn universe ended the second quarter at $8.23 trillion across 1,743 companies, up 13% over the prior year. The gain came from one place. AI added $1.59 trillion in six months while the universe grew $0.93 trillion, which means everything outside AI contracted, and every question that matters this quarter, whether the valuations are real, where the liquidity is, and how this cohort will age, follows from that fact.</w:t>
       </w:r>
     </w:p>
     <w:p>
@@ -135,16 +132,29 @@
     <w:p>
       <w:pPr>
         <w:spacing w:after="160" w:line="276"/>
-        <w:jc w:val="left"/>
-      </w:pPr>
-      <w:r>
-        <w:rPr>
-          <w:rFonts w:ascii="Georgia" w:cs="Georgia" w:eastAsia="Georgia" w:hAnsi="Georgia"/>
-          <w:color w:val="1F2733"/>
-          <w:sz w:val="21"/>
-          <w:szCs w:val="21"/>
-        </w:rPr>
-        <w:t xml:space="preserve">The five largest rounds raised $87.1 billion between them, and Anthropic alone accounted for $65 billion, raising into a $965 billion post-money valuation. That one financing was 5.4 times the next-largest round, Prometheus at $12 billion into a $41 billion valuation, and 16.4% of all first-half unicorn financing. Anduril ($5 billion into $61 billion), ByteDance ($3 billion into $370 billion), and Isomorphic Labs ($2.1 billion) completed the five, four of them artificial-intelligence businesses. Below them financing sizes fall under $2 billion by the sixth company and under $1 billion shortly after, so the ten largest rounds absorbed 68.9% of the quarter's sized financing value and the twenty-five largest 78.5%. Late-stage capital is concentrating into a small number of frontier laboratories that set the reference valuations others raise against. "First-half financing was strong" describes the fundraising of five companies, not seventeen hundred.</w:t>
+      </w:pPr>
+      <w:r>
+        <w:rPr>
+          <w:rFonts w:ascii="Georgia" w:cs="Georgia" w:eastAsia="Georgia" w:hAnsi="Georgia"/>
+          <w:color w:val="1F2733"/>
+          <w:sz w:val="21"/>
+          <w:szCs w:val="21"/>
+        </w:rPr>
+        <w:t xml:space="preserve">The five largest rounds raised $87.1 billion between them, and Anthropic alone accounted for $65 billion, raising into a $965 billion post-money valuation. That one financing was 5.4 times the next-largest round, Prometheus at $12 billion into a $41 billion valuation, and 16.4% of all first-half unicorn financing. Anduril ($5 billion into a $61 billion valuation), ByteDance ($3 billion into $370 billion), and Isomorphic Labs ($2.1 billion) completed the five, four of them artificial intelligence businesses. Below them, financing sizes fall under $2 billion by the sixth company and under $1 billion shortly after, so the ten largest rounds absorbed 68.9% of the quarter's sized financing value and the twenty-five largest 78.5%. Late-stage capital is concentrating into a small number of frontier labs that set the reference valuations others raise against. "First-half financing was strong" describes the fundraising of five companies, not seventeen hundred.</w:t>
+      </w:r>
+    </w:p>
+    <w:p>
+      <w:pPr>
+        <w:spacing w:after="160" w:line="276"/>
+      </w:pPr>
+      <w:r>
+        <w:rPr>
+          <w:rFonts w:ascii="Georgia" w:cs="Georgia" w:eastAsia="Georgia" w:hAnsi="Georgia"/>
+          <w:color w:val="1F2733"/>
+          <w:sz w:val="21"/>
+          <w:szCs w:val="21"/>
+        </w:rPr>
+        <w:t xml:space="preserve">The same concentration runs through who writes the checks. Syndicates of six or more investors made up 60.9% of 2026 rounds with disclosed participation, near the 2021 peak of 64%, so the rounds that occur are more crowded than before. Investor participation by count has not recovered alongside the dollars. It peaked at 2,892 in the third quarter of 2021, bottomed at 895 in the fourth quarter of 2023, recovered to 1,415 in the first quarter of 2026, then fell back to 995 in the second quarter, even as financing value stayed high. A small number of firms account for the most financings, with Sequoia Capital participating in 491 unicorn financings since 2016, Tiger Global 472, Andreessen Horowitz 454, Accel 382, and Coatue 344. Investor concentration mirrors company concentration.</w:t>
       </w:r>
     </w:p>
     <w:p>
@@ -167,46 +177,43 @@
     <w:p>
       <w:pPr>
         <w:spacing w:after="160" w:line="276"/>
-        <w:jc w:val="left"/>
-      </w:pPr>
-      <w:r>
-        <w:rPr>
-          <w:rFonts w:ascii="Georgia" w:cs="Georgia" w:eastAsia="Georgia" w:hAnsi="Georgia"/>
-          <w:color w:val="1F2733"/>
-          <w:sz w:val="21"/>
-          <w:szCs w:val="21"/>
-        </w:rPr>
-        <w:t xml:space="preserve">Each of the twenty most closely followed private companies can be valued three ways: a daily, model-derived valuation published by Morningstar; the post-money valuation of the last completed primary financing, fixed until the next round; and an implied valuation from actual secondary-market transactions, the price at which shares change hands. Across the eighteen companies with a priced round, model-derived valuations sit 15.2% above last-round valuations. The gap is expected, since the model updates daily while the last-round valuation stays fixed until the next financing.</w:t>
-      </w:r>
-    </w:p>
-    <w:p>
-      <w:pPr>
-        <w:spacing w:after="160" w:line="276"/>
-        <w:jc w:val="left"/>
-      </w:pPr>
-      <w:r>
-        <w:rPr>
-          <w:rFonts w:ascii="Georgia" w:cs="Georgia" w:eastAsia="Georgia" w:hAnsi="Georgia"/>
-          <w:color w:val="1F2733"/>
-          <w:sz w:val="21"/>
-          <w:szCs w:val="21"/>
-        </w:rPr>
-        <w:t xml:space="preserve">The secondary market disagrees most where the money is. Shares in twelve of the twenty companies trade below their model-derived valuation, and the two largest carry the widest discounts. SpaceX changes hands 32% below its $2.03 trillion model valuation, a gap of roughly $650 billion, and Anthropic 22% below its $1.27 trillion valuation, about $282 billion. Both valuations were set on recent events, SpaceX's June listing and an Anthropic financing, and both ran ahead of a secondary market that had yet to reprice. Further down the list the pattern reverses. Applied Intuition, Anysphere, Anduril, and Revolut all trade 16% to 36% above their last round, so their recorded valuations understate what buyers will pay. At the bottom, all three measures have fallen together at Ripple, Epic Games, and Kraken.</w:t>
-      </w:r>
-    </w:p>
-    <w:p>
-      <w:pPr>
-        <w:spacing w:after="160" w:line="276"/>
-        <w:jc w:val="left"/>
-      </w:pPr>
-      <w:r>
-        <w:rPr>
-          <w:rFonts w:ascii="Georgia" w:cs="Georgia" w:eastAsia="Georgia" w:hAnsi="Georgia"/>
-          <w:color w:val="1F2733"/>
-          <w:sz w:val="21"/>
-          <w:szCs w:val="21"/>
-        </w:rPr>
-        <w:t xml:space="preserve">Valuation reliability, meaning how closely the independent estimates agree, is weakest at the largest companies. Those are the names most likely to dominate a late-stage portfolio, so a portfolio carried at model values holds its biggest positions 20% to 30% above what buyers are currently paying, and the overstatement grows with the size of the position.</w:t>
+      </w:pPr>
+      <w:r>
+        <w:rPr>
+          <w:rFonts w:ascii="Georgia" w:cs="Georgia" w:eastAsia="Georgia" w:hAnsi="Georgia"/>
+          <w:color w:val="1F2733"/>
+          <w:sz w:val="21"/>
+          <w:szCs w:val="21"/>
+        </w:rPr>
+        <w:t xml:space="preserve">Each of the twenty most closely followed private companies can be valued three ways: a daily, model-derived valuation published by Morningstar; the post-money valuation of the last completed primary financing, fixed until the next round; and an implied valuation from secondary-market transactions, the price at which shares change hands. Across the eighteen companies with a priced round, model-derived valuations sit 15.2% above last-round valuations. The gap is expected, since the model updates daily while the last-round valuation stays fixed until the next financing.</w:t>
+      </w:r>
+    </w:p>
+    <w:p>
+      <w:pPr>
+        <w:spacing w:after="160" w:line="276"/>
+      </w:pPr>
+      <w:r>
+        <w:rPr>
+          <w:rFonts w:ascii="Georgia" w:cs="Georgia" w:eastAsia="Georgia" w:hAnsi="Georgia"/>
+          <w:color w:val="1F2733"/>
+          <w:sz w:val="21"/>
+          <w:szCs w:val="21"/>
+        </w:rPr>
+        <w:t xml:space="preserve">The secondary market diverges exactly where the capital sits. Shares in twelve of the twenty companies trade below their model-derived valuation, and the two largest carry the widest discounts. SpaceX changes hands 32% below its $2.03 trillion model valuation, a gap of roughly $650 billion, and Anthropic 22% below its $1.27 trillion valuation, about $282 billion. Both valuations were set on recent events, SpaceX's June listing and an Anthropic financing, and both ran ahead of a secondary market that had yet to reprice. Neither price has been tested. The next round will pick one. Further down the list the pattern reverses. Applied Intuition, Anysphere, Anduril, and Revolut all trade 16-36% above their last round, so their recorded valuations understate what buyers will pay. At the bottom, all three measures have fallen together at Ripple, Epic Games, and Kraken.</w:t>
+      </w:r>
+    </w:p>
+    <w:p>
+      <w:pPr>
+        <w:spacing w:after="160" w:line="276"/>
+      </w:pPr>
+      <w:r>
+        <w:rPr>
+          <w:rFonts w:ascii="Georgia" w:cs="Georgia" w:eastAsia="Georgia" w:hAnsi="Georgia"/>
+          <w:color w:val="1F2733"/>
+          <w:sz w:val="21"/>
+          <w:szCs w:val="21"/>
+        </w:rPr>
+        <w:t xml:space="preserve">Valuation reliability, the agreement among independent estimates, runs inversely to position size. The least corroborated valuations belong to the companies most likely to dominate a late-stage portfolio, so a portfolio carried at model values holds its biggest positions 20-30% above what buyers are currently paying, and the overstatement grows with the size of the position.</w:t>
       </w:r>
     </w:p>
     <w:p>
@@ -229,16 +236,15 @@
     <w:p>
       <w:pPr>
         <w:spacing w:after="160" w:line="276"/>
-        <w:jc w:val="left"/>
-      </w:pPr>
-      <w:r>
-        <w:rPr>
-          <w:rFonts w:ascii="Georgia" w:cs="Georgia" w:eastAsia="Georgia" w:hAnsi="Georgia"/>
-          <w:color w:val="1F2733"/>
-          <w:sz w:val="21"/>
-          <w:szCs w:val="21"/>
-        </w:rPr>
-        <w:t xml:space="preserve">The distance between the typical and the average unicorn is the clearest measure of concentration. The median company carries a $2.0 billion post-money valuation; the average is $18.19 billion. That 9.1-to-1 ratio was 3.1 to 1 in 2025 and 2.8 to 1 in 2024, so the distribution split open over the year. Financing sizes show the same shape, a $200 million median against a $1,143 million average, the widest separation in eleven years of data. The aggregate grew because roughly a dozen valuations were rewritten upward while the middle of the distribution did not move. An institution benchmarking to the aggregate is tracking the twelve largest companies and crediting their revaluation to the asset class; the median portfolio bears little resemblance to the index it is judged against.</w:t>
+      </w:pPr>
+      <w:r>
+        <w:rPr>
+          <w:rFonts w:ascii="Georgia" w:cs="Georgia" w:eastAsia="Georgia" w:hAnsi="Georgia"/>
+          <w:color w:val="1F2733"/>
+          <w:sz w:val="21"/>
+          <w:szCs w:val="21"/>
+        </w:rPr>
+        <w:t xml:space="preserve">The gap between the typical and the average unicorn is the clearest measure of how concentrated this market has become. The median company carries a $2.0 billion post-money valuation. The average is $18.19 billion. That 9.1-to-1 ratio was 3.1 to 1 in 2025 and 2.8 to 1 in 2024, so the distribution split open over a single year. Financing sizes are skewed the same way, with a $200 million median against a $1,143 million average, the widest separation in eleven years of data. The aggregate grew because roughly a dozen valuations were rewritten upward while the middle of the distribution stood still. An institution benchmarking to the aggregate is tracking the twelve largest companies and crediting their revaluation to the asset class as a whole, when the median portfolio bears little resemblance to the index it is judged against.</w:t>
       </w:r>
     </w:p>
     <w:p>
@@ -261,16 +267,15 @@
     <w:p>
       <w:pPr>
         <w:spacing w:after="160" w:line="276"/>
-        <w:jc w:val="left"/>
-      </w:pPr>
-      <w:r>
-        <w:rPr>
-          <w:rFonts w:ascii="Georgia" w:cs="Georgia" w:eastAsia="Georgia" w:hAnsi="Georgia"/>
-          <w:color w:val="1F2733"/>
-          <w:sz w:val="21"/>
-          <w:szCs w:val="21"/>
-        </w:rPr>
-        <w:t xml:space="preserve">The active financing market, the subset that actually raised, was strong. The median valuation step-up, the ratio of a new round's post-money to the prior round's, reached 2.20 times in 2026, up from 2.05 in 2025 and the highest since the 2.64 of the 2021 peak. The median interval between financings compressed to 0.98 years from 1.21 in 2025 and 1.45 in 2024. Down rounds have nearly vanished: six in the first half of 2026 worth $3.85 billion, against thirty-one in all of 2025 and thirty-four in 2024. The steepest revaluations came from small companies, Hark at 151 times its prior round, Blitzy and SendCutSend at 30 times, each valued below $7 billion, while the giants rose in dollars at modest multiples. Velocity lives at the small end, where one financing can revalue a company several times over; the stock of value lives at the large end. Every figure here describes only companies that raised, well under half the universe, and the untested majority is where the market's real risk sits.</w:t>
+      </w:pPr>
+      <w:r>
+        <w:rPr>
+          <w:rFonts w:ascii="Georgia" w:cs="Georgia" w:eastAsia="Georgia" w:hAnsi="Georgia"/>
+          <w:color w:val="1F2733"/>
+          <w:sz w:val="21"/>
+          <w:szCs w:val="21"/>
+        </w:rPr>
+        <w:t xml:space="preserve">Among the companies that actually raised, terms were strong. The median valuation step-up, the ratio of a new round's post-money valuation to the prior round's, reached 2.20 times in 2026, up from 2.05 in 2025. Only the 2021 peak of 2.64 stands higher. The median interval between financings compressed to 0.98 years from 1.21 in 2025 and 1.45 in 2024. Down rounds have nearly vanished, with six in the first half of 2026 worth $3.85 billion, against 31 in all of 2025 and 34 in 2024. The steepest revaluations came from small companies rather than the leaders: Hark at 151 times its prior round, Blitzy and SendCutSend at 30 times, each valued below $7 billion, while the giants gained in dollars at modest multiples. Velocity lives at the small end of the market, where a single financing can revalue a company several times over, and the value sits at the large end. Every figure describes only companies that raised, which is well under half the universe, and the untested majority is where the market's real risk sits.</w:t>
       </w:r>
     </w:p>
     <w:p>
@@ -293,16 +298,60 @@
     <w:p>
       <w:pPr>
         <w:spacing w:after="160" w:line="276"/>
-        <w:jc w:val="left"/>
-      </w:pPr>
-      <w:r>
-        <w:rPr>
-          <w:rFonts w:ascii="Georgia" w:cs="Georgia" w:eastAsia="Georgia" w:hAnsi="Georgia"/>
-          <w:color w:val="1F2733"/>
-          <w:sz w:val="21"/>
-          <w:szCs w:val="21"/>
-        </w:rPr>
-        <w:t xml:space="preserve">Artificial intelligence has passed a threshold. AI companies number 702 of 1,743 unicorns, 40.3% by count, yet account for $5.08 trillion of the $8.23 trillion in value, 61.7% of the total. The twenty-one-point gap between the shares measures how much larger the average AI company is, and it is widening: AI value rose from $3.49 trillion at the end of 2025 to $5.08 trillion by mid-2026, up 45.6% in six months, and AI accounted for 109 of the 178 companies newly crossing the billion-dollar threshold. With artificial intelligence at three-fifths of value and two-thirds of growth, an allocation to late-stage venture is a concentrated bet on one theme rather than a diversified position. A program built without an explicit view on AI is still long AI, at a weight that now exceeds what most diversified mandates would knowingly hold.</w:t>
+      </w:pPr>
+      <w:r>
+        <w:rPr>
+          <w:rFonts w:ascii="Georgia" w:cs="Georgia" w:eastAsia="Georgia" w:hAnsi="Georgia"/>
+          <w:color w:val="1F2733"/>
+          <w:sz w:val="21"/>
+          <w:szCs w:val="21"/>
+        </w:rPr>
+        <w:t xml:space="preserve">AI companies number 702 of the 1,743 unicorns, 40.3% by count, yet account for $5.08 trillion of the $8.23 trillion in value, 61.7% of the total. The twenty-one-point gap between those two shares measures how much larger the average AI company is, and it keeps widening. AI value rose from $3.49 trillion at the end of 2025 to $5.08 trillion by mid-2026, up 45.6% in six months. AI accounted for 109 of the 178 companies newly crossing the billion-dollar threshold.</w:t>
+      </w:r>
+    </w:p>
+    <w:p>
+      <w:pPr>
+        <w:spacing w:after="160" w:line="276"/>
+      </w:pPr>
+      <w:r>
+        <w:rPr>
+          <w:rFonts w:ascii="Georgia" w:cs="Georgia" w:eastAsia="Georgia" w:hAnsi="Georgia"/>
+          <w:color w:val="1F2733"/>
+          <w:sz w:val="21"/>
+          <w:szCs w:val="21"/>
+        </w:rPr>
+        <w:t xml:space="preserve">With artificial intelligence at three-fifths of value and two-thirds of growth, an allocation to late-stage venture is a concentrated bet on one theme rather than a diversified position. A program built without an explicit view on AI is still long AI, at a weight that now exceeds what most diversified mandates would knowingly hold.</w:t>
+      </w:r>
+    </w:p>
+    <w:p>
+      <w:pPr>
+        <w:pStyle w:val="Heading2"/>
+        <w:spacing w:after="70" w:before="220"/>
+      </w:pPr>
+      <w:r>
+        <w:rPr>
+          <w:rFonts w:ascii="Arial" w:cs="Arial" w:eastAsia="Arial" w:hAnsi="Arial"/>
+          <w:b/>
+          <w:bCs/>
+          <w:color w:val="1A2744"/>
+          <w:sz w:val="21"/>
+          <w:szCs w:val="21"/>
+        </w:rPr>
+        <w:t xml:space="preserve">The public-listing window reopened, but one company is most of it</w:t>
+      </w:r>
+    </w:p>
+    <w:p>
+      <w:pPr>
+        <w:spacing w:after="160" w:line="276"/>
+      </w:pPr>
+      <w:r>
+        <w:rPr>
+          <w:rFonts w:ascii="Georgia" w:cs="Georgia" w:eastAsia="Georgia" w:hAnsi="Georgia"/>
+          <w:color w:val="1F2733"/>
+          <w:sz w:val="21"/>
+          <w:szCs w:val="21"/>
+        </w:rPr>
+        <w:t xml:space="preserve">Exit value in 2026 reached $2.1 trillion across 50 exits, with a single event accounting for four-fifths of it. SpaceX's listing alone was $1.7 trillion; excluding it, exit value was $420.7 billion, the strongest year since 2021 but far below the headline. Public listings drove 85% of exit value, and after three years of few listings, SpaceX, Cerebras ($34 billion), and Quantinuum ($14 billion) all listed in the quarter. The median time to exit rose to 8.47 years, near the 9.17-year peak of 2025, so the companies reaching liquidity now are older vintages rather than recent 2023 and 2024 formations. The 2026 total reflects one large listing and a backlog of aged companies clearing, not a broad acceleration of recent cohorts.</w:t>
       </w:r>
     </w:p>
     <w:p>
@@ -345,16 +394,15 @@
     <w:p>
       <w:pPr>
         <w:spacing w:after="160" w:line="276"/>
-        <w:jc w:val="left"/>
-      </w:pPr>
-      <w:r>
-        <w:rPr>
-          <w:rFonts w:ascii="Georgia" w:cs="Georgia" w:eastAsia="Georgia" w:hAnsi="Georgia"/>
-          <w:color w:val="1F2733"/>
-          <w:sz w:val="21"/>
-          <w:szCs w:val="21"/>
-        </w:rPr>
-        <w:t xml:space="preserve">Software-as-a-service leads at $6.44 trillion across 968 companies and artificial intelligence follows at $6.02 trillion across 865, with financial technology a distant third at $2.02 trillion across 436. The next tier is far smaller: space technology $1.87 trillion, mobility $0.83 trillion, cloud infrastructure $0.74 trillion, health technology $0.45 trillion. The two leaders hold roughly $12.5 trillion between them. Because a company can carry several category tags, these totals sum past 1,743 companies and about 1.5 times the universe by value, so they cannot be added into a total, and much of the apparent breadth is the same companies counted twice under software and AI. Space technology shows how a category can be one company: its $1.87 trillion across 34 names averages $55 billion each, but SpaceX is nearly all of it, so the category total is a single company in all but name.</w:t>
+      </w:pPr>
+      <w:r>
+        <w:rPr>
+          <w:rFonts w:ascii="Georgia" w:cs="Georgia" w:eastAsia="Georgia" w:hAnsi="Georgia"/>
+          <w:color w:val="1F2733"/>
+          <w:sz w:val="21"/>
+          <w:szCs w:val="21"/>
+        </w:rPr>
+        <w:t xml:space="preserve">SaaS leads at $6.44 trillion across 968 companies, with AI close behind at $6.02 trillion across 865, and FinTech a distant third at $2.02 trillion across 436. The next tier is far smaller: SpaceTech $1.87 trillion, Mobility $0.83 trillion, Cloud Infrastructure $0.74 trillion, HealthTech $0.45 trillion. The two leaders hold roughly $12.5 trillion between them. Because companies can have overlapping categories, these totals cover more than 1,743 companies and about 1.5 times the universe by value, so they cannot be added together. Much of the apparent breadth is the same companies counted twice under SaaS and AI. SpaceTech shows how a category can be a single company: its $1.87 trillion across 34 names averages $55 billion each, but SpaceX is nearly all of it.</w:t>
       </w:r>
     </w:p>
     <w:p>
@@ -377,16 +425,15 @@
     <w:p>
       <w:pPr>
         <w:spacing w:after="160" w:line="276"/>
-        <w:jc w:val="left"/>
-      </w:pPr>
-      <w:r>
-        <w:rPr>
-          <w:rFonts w:ascii="Georgia" w:cs="Georgia" w:eastAsia="Georgia" w:hAnsi="Georgia"/>
-          <w:color w:val="1F2733"/>
-          <w:sz w:val="21"/>
-          <w:szCs w:val="21"/>
-        </w:rPr>
-        <w:t xml:space="preserve">The count of 1,743 overstates the number of large, recently valued companies. The ten largest hold about $2.9 trillion, 35% of the total, while the median company is $2.0 billion, so most of the universe sits far below the names that carry it. Only about a third of unicorns, 614 companies, have raised within the past twelve months; the rest are priced off older financings. Geography and theme narrow it further, with 54% domiciled in the United States and 40% classified as artificial intelligence. Size, recency, and liquidity required together leave a small subset of the headline count, weighted toward United States software and AI.</w:t>
+      </w:pPr>
+      <w:r>
+        <w:rPr>
+          <w:rFonts w:ascii="Georgia" w:cs="Georgia" w:eastAsia="Georgia" w:hAnsi="Georgia"/>
+          <w:color w:val="1F2733"/>
+          <w:sz w:val="21"/>
+          <w:szCs w:val="21"/>
+        </w:rPr>
+        <w:t xml:space="preserve">The count of 1,743 overstates the number of large, recently valued companies. The ten largest hold about $2.9 trillion, 35% of the total, while the median company is $2.0 billion, so most of the universe sits far below the names that carry it. Only about a third of unicorns, 614 companies, have raised within the past twelve months. The rest are priced off older financings. Geography and theme narrow it further, with 54% domiciled in the United States and 40% classified as AI. Size, recency, and liquidity required together leave a small subset of the total count, weighted toward US software and AI.</w:t>
       </w:r>
     </w:p>
     <w:p>
@@ -409,16 +456,29 @@
     <w:p>
       <w:pPr>
         <w:spacing w:after="160" w:line="276"/>
-        <w:jc w:val="left"/>
-      </w:pPr>
-      <w:r>
-        <w:rPr>
-          <w:rFonts w:ascii="Georgia" w:cs="Georgia" w:eastAsia="Georgia" w:hAnsi="Georgia"/>
-          <w:color w:val="1F2733"/>
-          <w:sz w:val="21"/>
-          <w:szCs w:val="21"/>
-        </w:rPr>
-        <w:t xml:space="preserve">On 2026 medians, artificial intelligence recorded a relative velocity of value creation, the ratio of new valuation created to capital invested, of 1.84 times with a 2.35 times step-up across 249 financings, and software 1.42 and 2.18 across 176. The highest velocity sits in smaller categories: robotics and drones at 2.03 times, clean technology at 3.30 with a 2.77 step-up. Crypto fell from 2.62 to 1.11. Cybersecurity at 0.66 and e-commerce at 0.38 are lowest, both below 1.0 even as they raised at higher valuations (step-ups of 1.74 and 2.13 times), so each dollar invested created less than a dollar of new valuation. The three-year Monitor vertical indexes show the same order, stated as annualized returns: AI returned 58.1% a year (302.6% cumulative), enterprise software 34.2%, and cybersecurity 22.2%, the only categories to beat the Global TME benchmark of 19.6% a year (72.4% cumulative). AI compounded at about three times the public rate; financial technology, third by value, returned 12.9% and trailed. These returns run on infrequently updated valuations, which suppresses measured volatility, so the low volatility of the private indexes reflects infrequent revaluation, not stability.</w:t>
+      </w:pPr>
+      <w:r>
+        <w:rPr>
+          <w:rFonts w:ascii="Georgia" w:cs="Georgia" w:eastAsia="Georgia" w:hAnsi="Georgia"/>
+          <w:color w:val="1F2733"/>
+          <w:sz w:val="21"/>
+          <w:szCs w:val="21"/>
+        </w:rPr>
+        <w:t xml:space="preserve">On 2026 medians, AI recorded a relative velocity of value creation, the ratio of new valuation created to capital invested, of 1.84 times alongside a 2.35 times step-up across 249 financings, with software 1.42 and 2.18 across 176. The highest velocity sits in smaller categories: robotics and drones at 2.03 times, and CleanTech at 3.30 with a 2.77 step-up. Crypto fell from 2.62 to 1.11. Cybersecurity at 0.66 and e-commerce at 0.38 are lowest, both below 1.0 even as they raised at higher valuations (step-ups of 1.74 and 2.13 times), so each dollar invested created less than a dollar of new valuation.</w:t>
+      </w:r>
+    </w:p>
+    <w:p>
+      <w:pPr>
+        <w:spacing w:after="160" w:line="276"/>
+      </w:pPr>
+      <w:r>
+        <w:rPr>
+          <w:rFonts w:ascii="Georgia" w:cs="Georgia" w:eastAsia="Georgia" w:hAnsi="Georgia"/>
+          <w:color w:val="1F2733"/>
+          <w:sz w:val="21"/>
+          <w:szCs w:val="21"/>
+        </w:rPr>
+        <w:t xml:space="preserve">The three-year vertical indexes show the same order. Stated as annualized returns, AI returned 58.1% a year, or 302.6% cumulative, enterprise software 34.2%, and cybersecurity 22.2%, the only categories to beat the Global TME benchmark of 19.6% a year, or 72.4% cumulative. AI compounded at about three times the public rate, while FinTech, third by value, returned 12.9% and trailed. These returns run on infrequently updated valuations, which suppresses measured volatility, so the low volatility of the private indexes reflects infrequent revaluation rather than stability.</w:t>
       </w:r>
     </w:p>
     <w:p>
@@ -441,16 +501,15 @@
     <w:p>
       <w:pPr>
         <w:spacing w:after="160" w:line="276"/>
-        <w:jc w:val="left"/>
-      </w:pPr>
-      <w:r>
-        <w:rPr>
-          <w:rFonts w:ascii="Georgia" w:cs="Georgia" w:eastAsia="Georgia" w:hAnsi="Georgia"/>
-          <w:color w:val="1F2733"/>
-          <w:sz w:val="21"/>
-          <w:szCs w:val="21"/>
-        </w:rPr>
-        <w:t xml:space="preserve">Artificial intelligence is both the source of the market's growth and its largest concentration of value, in the same companies. It produced $1.59 trillion of the $0.93 trillion universe gain, so the rest contracted around it, and it now represents 62% of value, four of the five largest rounds, and 61% of new company formation. Because AI valuations move together and dominate the index, a repricing in a few frontier names moves the aggregate: a 25% reduction in AI valuations would remove roughly $1.27 trillion, 15.4% of all private-technology value. The companies that produced the gain are the same ones the secondary market values well below their model valuations, so the exposure that drove the aggregate up carries the widest downside and sits in too large a share of the universe to be diversified away within it.</w:t>
+      </w:pPr>
+      <w:r>
+        <w:rPr>
+          <w:rFonts w:ascii="Georgia" w:cs="Georgia" w:eastAsia="Georgia" w:hAnsi="Georgia"/>
+          <w:color w:val="1F2733"/>
+          <w:sz w:val="21"/>
+          <w:szCs w:val="21"/>
+        </w:rPr>
+        <w:t xml:space="preserve">AI is both the driver of the market's growth and its largest concentration of value, in the same companies. It produced $1.59 trillion of the $0.93 trillion universe gain, so the rest of the market contracted around it. It now represents 62% of value, four of the five largest rounds, and 61% of new company formation. Because AI valuations move together and dominate the index, a repricing in a few frontier names moves the aggregate. A 25% reduction in AI valuations would remove roughly $1.27 trillion, which is 15.4% of all private-technology value. That is the bet. The companies that produced the gain are the same ones the secondary market values below their model valuations. The exposure that drove the aggregate up carries the widest downside and sits in too large a share of the universe to be diversified away within it.</w:t>
       </w:r>
     </w:p>
     <w:p>
@@ -473,16 +532,15 @@
     <w:p>
       <w:pPr>
         <w:spacing w:after="160" w:line="276"/>
-        <w:jc w:val="left"/>
-      </w:pPr>
-      <w:r>
-        <w:rPr>
-          <w:rFonts w:ascii="Georgia" w:cs="Georgia" w:eastAsia="Georgia" w:hAnsi="Georgia"/>
-          <w:color w:val="1F2733"/>
-          <w:sz w:val="21"/>
-          <w:szCs w:val="21"/>
-        </w:rPr>
-        <w:t xml:space="preserve">Of 635 unicorns minted in 2021, five years on 470 remain active (74%), 102 have exited (16%), and 62 have failed: 34 fell below the billion-dollar threshold while private, 15 fell at exit through a listing or sale below unicorn status, and 13 went bankrupt. Three-quarters remain illiquid four and a half years after formation, consistent with a median time to exit of 8.47 years, and the 15 that fell at exit are recorded as exits rather than failures, so the reported exit count overstates successful outcomes. Today's 702 AI unicorns are a cohort of the same size at an earlier stage. If they age as the 2021 vintage did, roughly a quarter would impair and three-quarters would remain illiquid into the next decade, though AI valuations are more correlated and concentrated than 2021's, so those outcomes would be more tightly linked. The ten-year funds that financed the 2021 vintage mature between 2028 and 2031, the period over which those untested valuations resolve through markdown, sale, or wind-down.</w:t>
+      </w:pPr>
+      <w:r>
+        <w:rPr>
+          <w:rFonts w:ascii="Georgia" w:cs="Georgia" w:eastAsia="Georgia" w:hAnsi="Georgia"/>
+          <w:color w:val="1F2733"/>
+          <w:sz w:val="21"/>
+          <w:szCs w:val="21"/>
+        </w:rPr>
+        <w:t xml:space="preserve">Of 635 unicorns minted in 2021, five years on 470 remain active (74%), 102 have exited (16%), and 62 have failed. Of the 62, 34 fell below the billion-dollar threshold while private, 15 fell at exit through a listing or sale below unicorn status, and 13 went bankrupt. Three-quarters remain illiquid four and a half years after formation, consistent with a median time to exit of 8.47 years, and because the 15 that fell at exit are recorded as exits rather than failures, the reported exit count overstates successful outcomes. Today's 702 AI unicorns are a cohort of the same size at an earlier stage. If they age as the 2021 vintage did, roughly a quarter would impair and three-quarters would remain illiquid into the next decade. AI valuations are more correlated and concentrated than 2021's, so those outcomes would be more tightly linked. The ten-year funds that financed the 2021 vintage mature between 2028 and 2031, the period over which those untested valuations resolve through markdown, sale, or wind-down.</w:t>
       </w:r>
     </w:p>
     <w:p>
@@ -502,71 +560,146 @@
           <w:sz w:val="26"/>
           <w:szCs w:val="26"/>
         </w:rPr>
-        <w:t xml:space="preserve">Deal dynamics, capital, and exits</w:t>
-      </w:r>
-    </w:p>
-    <w:p>
-      <w:pPr>
-        <w:pStyle w:val="Heading2"/>
-        <w:spacing w:after="70" w:before="220"/>
-      </w:pPr>
-      <w:r>
-        <w:rPr>
-          <w:rFonts w:ascii="Arial" w:cs="Arial" w:eastAsia="Arial" w:hAnsi="Arial"/>
-          <w:b/>
-          <w:bCs/>
-          <w:color w:val="1A2744"/>
-          <w:sz w:val="21"/>
-          <w:szCs w:val="21"/>
-        </w:rPr>
-        <w:t xml:space="preserve">Financing has grown less frequent, larger, and more crowded</w:t>
-      </w:r>
-    </w:p>
-    <w:p>
-      <w:pPr>
-        <w:spacing w:after="160" w:line="276"/>
-        <w:jc w:val="left"/>
-      </w:pPr>
-      <w:r>
-        <w:rPr>
-          <w:rFonts w:ascii="Georgia" w:cs="Georgia" w:eastAsia="Georgia" w:hAnsi="Georgia"/>
-          <w:color w:val="1F2733"/>
-          <w:sz w:val="21"/>
-          <w:szCs w:val="21"/>
-        </w:rPr>
-        <w:t xml:space="preserve">Syndicates of six or more investors made up 60.9% of 2026 rounds with disclosed participation, near the 2021 peak of 64%, so the rounds that occur are more crowded. Investor participation by count has not recovered with the dollars: it peaked at 2,892 in the third quarter of 2021, bottomed at 895 in the fourth quarter of 2023, recovered to 1,415 in the first quarter of 2026, then fell back to 995 in the second even as financing value stayed high. A small number of firms account for the most financings: Sequoia Capital participated in 491 unicorn financings since 2016, Tiger Global 472, Andreessen Horowitz 454, Accel 382, and Coatue 344. Investor concentration mirrors company concentration.</w:t>
-      </w:r>
-    </w:p>
-    <w:p>
-      <w:pPr>
-        <w:pStyle w:val="Heading2"/>
-        <w:spacing w:after="70" w:before="220"/>
-      </w:pPr>
-      <w:r>
-        <w:rPr>
-          <w:rFonts w:ascii="Arial" w:cs="Arial" w:eastAsia="Arial" w:hAnsi="Arial"/>
-          <w:b/>
-          <w:bCs/>
-          <w:color w:val="1A2744"/>
-          <w:sz w:val="21"/>
-          <w:szCs w:val="21"/>
-        </w:rPr>
-        <w:t xml:space="preserve">The public-listing window reopened, but one company is most of it</w:t>
-      </w:r>
-    </w:p>
-    <w:p>
-      <w:pPr>
-        <w:spacing w:after="160" w:line="276"/>
-        <w:jc w:val="left"/>
-      </w:pPr>
-      <w:r>
-        <w:rPr>
-          <w:rFonts w:ascii="Georgia" w:cs="Georgia" w:eastAsia="Georgia" w:hAnsi="Georgia"/>
-          <w:color w:val="1F2733"/>
-          <w:sz w:val="21"/>
-          <w:szCs w:val="21"/>
-        </w:rPr>
-        <w:t xml:space="preserve">Exit value in 2026 reached $2,110.9 billion across 50 exits, the highest in the data, and a single event is four-fifths of it. SpaceX's listing was $1,690 billion; excluding it, exit value was $420.7 billion, the strongest year since 2021 but far below the headline. Public listings drove 85% of exit value, and after three years of few listings, SpaceX, Cerebras ($34 billion), and Quantinuum ($14 billion) all listed in the quarter. The median time to exit rose to 8.47 years, near the 9.17-year peak of 2025, so the companies reaching liquidity now are older vintages, not recent 2023 and 2024 formations. The 2026 total reflects one large listing and a backlog of aged companies clearing, not a broad acceleration of recent cohorts.</w:t>
+        <w:t xml:space="preserve">Business quality (AIBQ/PBQ) and valuations</w:t>
+      </w:r>
+    </w:p>
+    <w:p>
+      <w:pPr>
+        <w:pStyle w:val="Heading2"/>
+        <w:spacing w:after="70" w:before="220"/>
+      </w:pPr>
+      <w:r>
+        <w:rPr>
+          <w:rFonts w:ascii="Arial" w:cs="Arial" w:eastAsia="Arial" w:hAnsi="Arial"/>
+          <w:b/>
+          <w:bCs/>
+          <w:color w:val="1A2744"/>
+          <w:sz w:val="21"/>
+          <w:szCs w:val="21"/>
+        </w:rPr>
+        <w:t xml:space="preserve">What the AIBQ and PBQ scores measure</w:t>
+      </w:r>
+    </w:p>
+    <w:p>
+      <w:pPr>
+        <w:spacing w:after="160" w:line="276"/>
+      </w:pPr>
+      <w:r>
+        <w:rPr>
+          <w:rFonts w:ascii="Georgia" w:cs="Georgia" w:eastAsia="Georgia" w:hAnsi="Georgia"/>
+          <w:color w:val="1F2733"/>
+          <w:sz w:val="21"/>
+          <w:szCs w:val="21"/>
+        </w:rPr>
+        <w:t xml:space="preserve">The AIBQ and PBQ framework scores the twenty largest private companies on five weighted dimensions of the business underneath the valuation: revenue quality, capital efficiency, governance optionality, moat durability, and either compute independence or strategic velocity depending on the business type. Eight companies built on their own AI models are scored as AIBQ, and for them compute independence measures how much of their compute they control, because compute is the input that decides whether these businesses can keep operating. The other twelve are scored as PBQ and measured on speed of execution instead. Each composite sorts the company into one of four tiers, from Elite above 8.0 to Distressed below 4.5, with wide confidence bands because private disclosure is thin.</w:t>
+      </w:r>
+    </w:p>
+    <w:p>
+      <w:pPr>
+        <w:pStyle w:val="Heading2"/>
+        <w:spacing w:after="70" w:before="220"/>
+      </w:pPr>
+      <w:r>
+        <w:rPr>
+          <w:rFonts w:ascii="Arial" w:cs="Arial" w:eastAsia="Arial" w:hAnsi="Arial"/>
+          <w:b/>
+          <w:bCs/>
+          <w:color w:val="1A2744"/>
+          <w:sz w:val="21"/>
+          <w:szCs w:val="21"/>
+        </w:rPr>
+        <w:t xml:space="preserve">The scores against primary valuations</w:t>
+      </w:r>
+    </w:p>
+    <w:p>
+      <w:pPr>
+        <w:spacing w:after="160" w:line="276"/>
+      </w:pPr>
+      <w:r>
+        <w:rPr>
+          <w:rFonts w:ascii="Georgia" w:cs="Georgia" w:eastAsia="Georgia" w:hAnsi="Georgia"/>
+          <w:color w:val="1F2733"/>
+          <w:sz w:val="21"/>
+          <w:szCs w:val="21"/>
+        </w:rPr>
+        <w:t xml:space="preserve">The primary market and the scores disagree about the same twenty companies. The disagreement is largest where the money is. Valuation explains about 15% of the variation in quality scores. Databricks and Stripe are the only companies to reach the Elite tier, and they are valued at $134 billion and $159 billion. Anthropic scores 7.22 and ranks seventh despite being the most valuable private company in the world at $965 billion, while OpenAI scores 6.30 and ranks fifteenth at $852 billion. A late-stage round prices scarcity and expected scale, and the giants earn their valuations on exactly those grounds. The framework scores what a growth round tends to look past, which is where the giants lose points, since they rent the compute they depend on, run thin margins after model costs, and in OpenAI's case carry an unfinished conversion from nonprofit control. Expressed as price per point of quality, the disagreement becomes concrete. For example, a point of quality costs about $2.2 billion at Applied Intuition and $134 billion at Anthropic, a sixty-fold premium for a lower score.</w:t>
+      </w:r>
+    </w:p>
+    <w:p>
+      <w:pPr>
+        <w:spacing w:after="160" w:before="120"/>
+        <w:jc w:val="center"/>
+      </w:pPr>
+      <w:r>
+        <w:drawing>
+          <wp:inline distT="0" distB="0" distL="0" distR="0">
+            <wp:extent cx="5905500" cy="3619500"/>
+            <wp:effectExtent t="0" r="0" b="0" l="0"/>
+            <wp:docPr id="1" name="" descr="" title=""/>
+            <wp:cNvGraphicFramePr>
+              <a:graphicFrameLocks xmlns:a="http://schemas.openxmlformats.org/drawingml/2006/main" noChangeAspect="1"/>
+            </wp:cNvGraphicFramePr>
+            <a:graphic xmlns:a="http://schemas.openxmlformats.org/drawingml/2006/main">
+              <a:graphicData uri="http://schemas.openxmlformats.org/drawingml/2006/picture">
+                <pic:pic xmlns:pic="http://schemas.openxmlformats.org/drawingml/2006/picture">
+                  <pic:nvPicPr>
+                    <pic:cNvPr id="0" name="" descr=""/>
+                    <pic:cNvPicPr>
+                      <a:picLocks noChangeAspect="1" noChangeArrowheads="1"/>
+                    </pic:cNvPicPr>
+                  </pic:nvPicPr>
+                  <pic:blipFill>
+                    <a:blip r:embed="rId8" cstate="none"/>
+                    <a:srcRect/>
+                    <a:stretch>
+                      <a:fillRect/>
+                    </a:stretch>
+                  </pic:blipFill>
+                  <pic:spPr bwMode="auto">
+                    <a:xfrm>
+                      <a:off x="0" y="0"/>
+                      <a:ext cx="5905500" cy="3619500"/>
+                    </a:xfrm>
+                    <a:prstGeom prst="rect">
+                      <a:avLst/>
+                    </a:prstGeom>
+                  </pic:spPr>
+                </pic:pic>
+              </a:graphicData>
+            </a:graphic>
+          </wp:inline>
+        </w:drawing>
+      </w:r>
+    </w:p>
+    <w:p>
+      <w:pPr>
+        <w:pStyle w:val="Heading2"/>
+        <w:spacing w:after="70" w:before="220"/>
+      </w:pPr>
+      <w:r>
+        <w:rPr>
+          <w:rFonts w:ascii="Arial" w:cs="Arial" w:eastAsia="Arial" w:hAnsi="Arial"/>
+          <w:b/>
+          <w:bCs/>
+          <w:color w:val="1A2744"/>
+          <w:sz w:val="21"/>
+          <w:szCs w:val="21"/>
+        </w:rPr>
+        <w:t xml:space="preserve">The scores against secondary valuations</w:t>
+      </w:r>
+    </w:p>
+    <w:p>
+      <w:pPr>
+        <w:spacing w:after="160" w:line="276"/>
+      </w:pPr>
+      <w:r>
+        <w:rPr>
+          <w:rFonts w:ascii="Georgia" w:cs="Georgia" w:eastAsia="Georgia" w:hAnsi="Georgia"/>
+          <w:color w:val="1F2733"/>
+          <w:sz w:val="21"/>
+          <w:szCs w:val="21"/>
+        </w:rPr>
+        <w:t xml:space="preserve">The secondary market, compared to the primary market, aligns more closely with the framework's reading. The ten companies whose shares trade above their last round average 7.4 on quality, while the seven trading below average 6.0. That alignment makes sense once the buyer is considered, because a secondary purchaser gets no board seat and no new information rights, so the price rests on what can be observed about the business today, which is close to what the framework scores. Two departures from the pattern are informative. Anthropic and OpenAI trade 22% and 9% below their model valuations despite mid-tier scores, which suggests secondary buyers are already discounting the compute dependence and governance questions the primary market has not yet priced. And the two Distressed names have the least price discovery of all. Figure AI, scored 3.75, trades 23% below its round, and Neuralink, scored 2.5, has no meaningful secondary depth beneath a model valuation sitting 441% above its last financing. Across the twenty unicorns, the weaker the business scores, the fewer independent prices exist to test its valuation, which is the same divide between tested and untested values that runs through the rest of this report.</w:t>
       </w:r>
     </w:p>
     <w:p>
@@ -586,71 +719,131 @@
           <w:sz w:val="26"/>
           <w:szCs w:val="26"/>
         </w:rPr>
-        <w:t xml:space="preserve">Business quality and valuations</w:t>
-      </w:r>
-    </w:p>
-    <w:p>
-      <w:pPr>
-        <w:pStyle w:val="Heading2"/>
-        <w:spacing w:after="70" w:before="220"/>
-      </w:pPr>
-      <w:r>
-        <w:rPr>
-          <w:rFonts w:ascii="Arial" w:cs="Arial" w:eastAsia="Arial" w:hAnsi="Arial"/>
-          <w:b/>
-          <w:bCs/>
-          <w:color w:val="1A2744"/>
-          <w:sz w:val="21"/>
-          <w:szCs w:val="21"/>
-        </w:rPr>
-        <w:t xml:space="preserve">The valuation ranking measures price, not quality</w:t>
-      </w:r>
-    </w:p>
-    <w:p>
-      <w:pPr>
-        <w:spacing w:after="160" w:line="276"/>
-        <w:jc w:val="left"/>
-      </w:pPr>
-      <w:r>
-        <w:rPr>
-          <w:rFonts w:ascii="Georgia" w:cs="Georgia" w:eastAsia="Georgia" w:hAnsi="Georgia"/>
-          <w:color w:val="1F2733"/>
-          <w:sz w:val="21"/>
-          <w:szCs w:val="21"/>
-        </w:rPr>
-        <w:t xml:space="preserve">Sorted by post-money valuation, the largest companies read Anthropic, OpenAI, ByteDance, Stripe, Databricks, Waymo. That order reflects expense, and expense depends on capital raised as much as on value created, so two companies at the same valuation can differ by an order of magnitude in capital efficiency. Two of the ten largest still carry valuations more than a year old that a fresh financing could move either way. A quality-adjusted ranking would reorder the list, which is why a business-quality score has to sit beside the valuation rather than beneath it.</w:t>
-      </w:r>
-    </w:p>
-    <w:p>
-      <w:pPr>
-        <w:pStyle w:val="Heading2"/>
-        <w:spacing w:after="70" w:before="220"/>
-      </w:pPr>
-      <w:r>
-        <w:rPr>
-          <w:rFonts w:ascii="Arial" w:cs="Arial" w:eastAsia="Arial" w:hAnsi="Arial"/>
-          <w:b/>
-          <w:bCs/>
-          <w:color w:val="1A2744"/>
-          <w:sz w:val="21"/>
-          <w:szCs w:val="21"/>
-        </w:rPr>
-        <w:t xml:space="preserve">The data scores one dimension of quality; the rest requires disclosure</w:t>
-      </w:r>
-    </w:p>
-    <w:p>
-      <w:pPr>
-        <w:spacing w:after="160" w:line="276"/>
-        <w:jc w:val="left"/>
-      </w:pPr>
-      <w:r>
-        <w:rPr>
-          <w:rFonts w:ascii="Georgia" w:cs="Georgia" w:eastAsia="Georgia" w:hAnsi="Georgia"/>
-          <w:color w:val="1F2733"/>
-          <w:sz w:val="21"/>
-          <w:szCs w:val="21"/>
-        </w:rPr>
-        <w:t xml:space="preserve">[Pending analyst data.] The full PitchBook and AI business-quality composites require operating inputs, revenue quality, margins, customer concentration, compute independence, governance, and moat, that are not yet received. This section will score the twenty companies once that data arrives; the valuation-ranking point above holds independently of it.</w:t>
+        <w:t xml:space="preserve">Valuations and fallen unicorns</w:t>
+      </w:r>
+    </w:p>
+    <w:p>
+      <w:pPr>
+        <w:pStyle w:val="Heading2"/>
+        <w:spacing w:after="70" w:before="220"/>
+      </w:pPr>
+      <w:r>
+        <w:rPr>
+          <w:rFonts w:ascii="Arial" w:cs="Arial" w:eastAsia="Arial" w:hAnsi="Arial"/>
+          <w:b/>
+          <w:bCs/>
+          <w:color w:val="1A2744"/>
+          <w:sz w:val="21"/>
+          <w:szCs w:val="21"/>
+        </w:rPr>
+        <w:t xml:space="preserve">Two companies account for a fifth of the market's value</w:t>
+      </w:r>
+    </w:p>
+    <w:p>
+      <w:pPr>
+        <w:spacing w:after="160" w:line="276"/>
+      </w:pPr>
+      <w:r>
+        <w:rPr>
+          <w:rFonts w:ascii="Georgia" w:cs="Georgia" w:eastAsia="Georgia" w:hAnsi="Georgia"/>
+          <w:color w:val="1F2733"/>
+          <w:sz w:val="21"/>
+          <w:szCs w:val="21"/>
+        </w:rPr>
+        <w:t xml:space="preserve">Anthropic ($965 billion) and OpenAI ($852 billion) together hold $1.82 trillion, 22% of the $8.23 trillion universe. The ten largest hold about $2.9 trillion, 35% of it, against a $2.0 billion median. At this concentration the index and the median move independently. The aggregate can rise on a dozen revaluations while the typical unicorn stands still, so a move in the aggregate says nothing about the median holding.</w:t>
+      </w:r>
+    </w:p>
+    <w:p>
+      <w:pPr>
+        <w:pStyle w:val="Heading2"/>
+        <w:spacing w:after="70" w:before="220"/>
+      </w:pPr>
+      <w:r>
+        <w:rPr>
+          <w:rFonts w:ascii="Arial" w:cs="Arial" w:eastAsia="Arial" w:hAnsi="Arial"/>
+          <w:b/>
+          <w:bCs/>
+          <w:color w:val="1A2744"/>
+          <w:sz w:val="21"/>
+          <w:szCs w:val="21"/>
+        </w:rPr>
+        <w:t xml:space="preserve">Valuations are current at the top and grow stale quickly below it</w:t>
+      </w:r>
+    </w:p>
+    <w:p>
+      <w:pPr>
+        <w:spacing w:after="160" w:line="276"/>
+      </w:pPr>
+      <w:r>
+        <w:rPr>
+          <w:rFonts w:ascii="Georgia" w:cs="Georgia" w:eastAsia="Georgia" w:hAnsi="Georgia"/>
+          <w:color w:val="1F2733"/>
+          <w:sz w:val="21"/>
+          <w:szCs w:val="21"/>
+        </w:rPr>
+        <w:t xml:space="preserve">Anthropic (valued May 2026), ByteDance (May 2026), and OpenAI (March 2026) carry recent valuations, but below the leaders they age fast. Ant Group, seventh by value, still carries a financing from August 2020, and SHEIN carries one from January 2024. Measured from actual latest-financing dates, 47.6% of unicorns have not raised in more than 24 months and 37.1% in more than 36 months. Close to half of the $8.23 trillion rests on valuations no financing has retested in two years or more. The universe divides into a small frontier of recently priced companies and a large interior of dated valuations whose repricing risk never appears in the aggregate. Blending the third of the universe priced within the past year with the hundreds of companies priced years ago produces a single number that hides the difference, and the total should be separated into recently tested and untested dollars.</w:t>
+      </w:r>
+    </w:p>
+    <w:p>
+      <w:pPr>
+        <w:pStyle w:val="Heading2"/>
+        <w:spacing w:after="70" w:before="220"/>
+      </w:pPr>
+      <w:r>
+        <w:rPr>
+          <w:rFonts w:ascii="Arial" w:cs="Arial" w:eastAsia="Arial" w:hAnsi="Arial"/>
+          <w:b/>
+          <w:bCs/>
+          <w:color w:val="1A2744"/>
+          <w:sz w:val="21"/>
+          <w:szCs w:val="21"/>
+        </w:rPr>
+        <w:t xml:space="preserve">Value created per dollar invested has recovered above its pre-boom level</w:t>
+      </w:r>
+    </w:p>
+    <w:p>
+      <w:pPr>
+        <w:spacing w:after="160" w:line="276"/>
+      </w:pPr>
+      <w:r>
+        <w:rPr>
+          <w:rFonts w:ascii="Georgia" w:cs="Georgia" w:eastAsia="Georgia" w:hAnsi="Georgia"/>
+          <w:color w:val="1F2733"/>
+          <w:sz w:val="21"/>
+          <w:szCs w:val="21"/>
+        </w:rPr>
+        <w:t xml:space="preserve">The median relative velocity of value creation rose to 1.42 times in 2026 from 0.93 in 2025 and a low of 0.23 in 2023, above its pre-boom baseline of roughly 0.73, with the 2.20 median step-up and 0.98-year interval pointing in the same direction. Velocity above 1.0 means each dollar raised created more than a dollar of new valuation, a reversal from 2023, when financings diluted holders more than they built value. The 2.73 average against the 1.42 median carries the same skew as the valuations themselves. Value creation concentrates in a few names, and the measure counts only companies that have raised.</w:t>
+      </w:r>
+    </w:p>
+    <w:p>
+      <w:pPr>
+        <w:pStyle w:val="Heading2"/>
+        <w:spacing w:after="70" w:before="220"/>
+      </w:pPr>
+      <w:r>
+        <w:rPr>
+          <w:rFonts w:ascii="Arial" w:cs="Arial" w:eastAsia="Arial" w:hAnsi="Arial"/>
+          <w:b/>
+          <w:bCs/>
+          <w:color w:val="1A2744"/>
+          <w:sz w:val="21"/>
+          <w:szCs w:val="21"/>
+        </w:rPr>
+        <w:t xml:space="preserve">The rate of new failures has fallen while the untested population has grown</w:t>
+      </w:r>
+    </w:p>
+    <w:p>
+      <w:pPr>
+        <w:spacing w:after="160" w:line="276"/>
+      </w:pPr>
+      <w:r>
+        <w:rPr>
+          <w:rFonts w:ascii="Georgia" w:cs="Georgia" w:eastAsia="Georgia" w:hAnsi="Georgia"/>
+          <w:color w:val="1F2733"/>
+          <w:sz w:val="21"/>
+          <w:szCs w:val="21"/>
+        </w:rPr>
+        <w:t xml:space="preserve">A total of 245 unicorns have fallen below the billion-dollar threshold to date, and new failures have nearly stopped. There have been six down rounds in the first half of 2026 worth $3.85 billion, against a peak of 34 in 2024. Failures are severe when they occur, at a median failing valuation of $524.5 million and a median decline of 67% from the prior peak, leaving the typical fallen unicorn at about a third of its high, just below the billion-dollar line. The 2021 cohort's 15 companies that fell at exit are recorded as exits, so the reported failure count understates losses. A company is also recognized as failing only when it raises at a lower valuation, and 47.6% of the universe has not raised in more than two years, so the count describes companies that raised rather than the dormant majority.</w:t>
       </w:r>
     </w:p>
     <w:p>
@@ -670,200 +863,49 @@
           <w:sz w:val="26"/>
           <w:szCs w:val="26"/>
         </w:rPr>
-        <w:t xml:space="preserve">Valuations and dormant companies</w:t>
-      </w:r>
-    </w:p>
-    <w:p>
-      <w:pPr>
-        <w:pStyle w:val="Heading2"/>
-        <w:spacing w:after="70" w:before="220"/>
-      </w:pPr>
-      <w:r>
-        <w:rPr>
-          <w:rFonts w:ascii="Arial" w:cs="Arial" w:eastAsia="Arial" w:hAnsi="Arial"/>
-          <w:b/>
-          <w:bCs/>
-          <w:color w:val="1A2744"/>
-          <w:sz w:val="21"/>
-          <w:szCs w:val="21"/>
-        </w:rPr>
-        <w:t xml:space="preserve">Two companies account for a fifth of the market's value</w:t>
-      </w:r>
-    </w:p>
-    <w:p>
-      <w:pPr>
-        <w:spacing w:after="160" w:line="276"/>
-        <w:jc w:val="left"/>
-      </w:pPr>
-      <w:r>
-        <w:rPr>
-          <w:rFonts w:ascii="Georgia" w:cs="Georgia" w:eastAsia="Georgia" w:hAnsi="Georgia"/>
-          <w:color w:val="1F2733"/>
-          <w:sz w:val="21"/>
-          <w:szCs w:val="21"/>
-        </w:rPr>
-        <w:t xml:space="preserve">Anthropic ($965 billion) and OpenAI ($852 billion) together hold $1.82 trillion, 22% of the $8.23 trillion universe, and the ten largest hold about $2.9 trillion, 35% of it, against a $2.0 billion median. At this concentration the index and the median move independently: the aggregate can rise on a dozen revaluations while the typical unicorn stands still, so a move in the aggregate is not information about the median holding.</w:t>
-      </w:r>
-    </w:p>
-    <w:p>
-      <w:pPr>
-        <w:pStyle w:val="Heading2"/>
-        <w:spacing w:after="70" w:before="220"/>
-      </w:pPr>
-      <w:r>
-        <w:rPr>
-          <w:rFonts w:ascii="Arial" w:cs="Arial" w:eastAsia="Arial" w:hAnsi="Arial"/>
-          <w:b/>
-          <w:bCs/>
-          <w:color w:val="1A2744"/>
-          <w:sz w:val="21"/>
-          <w:szCs w:val="21"/>
-        </w:rPr>
-        <w:t xml:space="preserve">Valuations are current at the top and grow stale quickly below it</w:t>
-      </w:r>
-    </w:p>
-    <w:p>
-      <w:pPr>
-        <w:spacing w:after="160" w:line="276"/>
-        <w:jc w:val="left"/>
-      </w:pPr>
-      <w:r>
-        <w:rPr>
-          <w:rFonts w:ascii="Georgia" w:cs="Georgia" w:eastAsia="Georgia" w:hAnsi="Georgia"/>
-          <w:color w:val="1F2733"/>
-          <w:sz w:val="21"/>
-          <w:szCs w:val="21"/>
-        </w:rPr>
-        <w:t xml:space="preserve">Anthropic (valued May 2026), ByteDance (May 2026), and OpenAI (March 2026) carry recent valuations. Below the leaders they age fast: Ant Group, seventh by value, carries a financing from August 2020, and SHEIN one from January 2024. Measured from actual latest-financing dates, 47.6% of unicorns have not raised in more than 24 months and 37.1% in more than 36. Close to half of the $8.23 trillion rests on valuations no financing has retested in two years or more. The universe divides into a small frontier of recently priced companies and a large interior of dated valuations whose repricing risk does not appear in the aggregate; the total blends roughly forty companies priced this year with hundreds priced years ago, and should be separated into recently tested and untested dollars.</w:t>
-      </w:r>
-    </w:p>
-    <w:p>
-      <w:pPr>
-        <w:pStyle w:val="Heading2"/>
-        <w:spacing w:after="70" w:before="220"/>
-      </w:pPr>
-      <w:r>
-        <w:rPr>
-          <w:rFonts w:ascii="Arial" w:cs="Arial" w:eastAsia="Arial" w:hAnsi="Arial"/>
-          <w:b/>
-          <w:bCs/>
-          <w:color w:val="1A2744"/>
-          <w:sz w:val="21"/>
-          <w:szCs w:val="21"/>
-        </w:rPr>
-        <w:t xml:space="preserve">Value created per dollar invested has recovered above its pre-boom level</w:t>
-      </w:r>
-    </w:p>
-    <w:p>
-      <w:pPr>
-        <w:spacing w:after="160" w:line="276"/>
-        <w:jc w:val="left"/>
-      </w:pPr>
-      <w:r>
-        <w:rPr>
-          <w:rFonts w:ascii="Georgia" w:cs="Georgia" w:eastAsia="Georgia" w:hAnsi="Georgia"/>
-          <w:color w:val="1F2733"/>
-          <w:sz w:val="21"/>
-          <w:szCs w:val="21"/>
-        </w:rPr>
-        <w:t xml:space="preserve">The median relative velocity of value creation rose to 1.42 times in 2026 from 0.93 in 2025 and a low of 0.23 in 2023, above its pre-boom baseline of roughly 0.73. The 2.20 median step-up and 0.98-year interval point the same way. Velocity above 1.0 means each dollar raised created more than a dollar of new valuation, a reversal from 2023, when financings diluted holders more than they built value. The 2.73 average against the 1.42 median carries the same skew as valuations: value creation concentrates in a few names, and the measure counts only companies that raised.</w:t>
-      </w:r>
-    </w:p>
-    <w:p>
-      <w:pPr>
-        <w:pStyle w:val="Heading2"/>
-        <w:spacing w:after="70" w:before="220"/>
-      </w:pPr>
-      <w:r>
-        <w:rPr>
-          <w:rFonts w:ascii="Arial" w:cs="Arial" w:eastAsia="Arial" w:hAnsi="Arial"/>
-          <w:b/>
-          <w:bCs/>
-          <w:color w:val="1A2744"/>
-          <w:sz w:val="21"/>
-          <w:szCs w:val="21"/>
-        </w:rPr>
-        <w:t xml:space="preserve">The rate of new failures has fallen while the untested population has grown</w:t>
-      </w:r>
-    </w:p>
-    <w:p>
-      <w:pPr>
-        <w:spacing w:after="160" w:line="276"/>
-        <w:jc w:val="left"/>
-      </w:pPr>
-      <w:r>
-        <w:rPr>
-          <w:rFonts w:ascii="Georgia" w:cs="Georgia" w:eastAsia="Georgia" w:hAnsi="Georgia"/>
-          <w:color w:val="1F2733"/>
-          <w:sz w:val="21"/>
-          <w:szCs w:val="21"/>
-        </w:rPr>
-        <w:t xml:space="preserve">A total of 245 unicorns have fallen below the billion-dollar threshold to date, and new failures have nearly stopped: six down rounds in the first half of 2026 worth $3.85 billion, against a peak of 34 in 2024. Failures are severe when they occur, a median failing valuation of $524.5 million and a median decline of 67% from the prior peak, leaving the typical fallen company at about a third of its high, just below the billion-dollar line. The 2021 cohort's 15 companies that fell at exit are recorded as exits, so the reported failure count understates losses. A company is recognized as failing only when it raises at a lower valuation, and 47.6% of the universe has not raised in more than two years, so the count describes companies that raised, not the dormant majority.</w:t>
-      </w:r>
-    </w:p>
-    <w:p>
-      <w:pPr>
-        <w:pStyle w:val="Heading1"/>
-        <w:pBdr>
-          <w:bottom w:val="single" w:color="C9D2E0" w:sz="6" w:space="6"/>
-        </w:pBdr>
-        <w:spacing w:after="140" w:before="320"/>
-      </w:pPr>
-      <w:r>
-        <w:rPr>
-          <w:rFonts w:ascii="Arial" w:cs="Arial" w:eastAsia="Arial" w:hAnsi="Arial"/>
-          <w:b/>
-          <w:bCs/>
-          <w:color w:val="1A2744"/>
-          <w:sz w:val="26"/>
-          <w:szCs w:val="26"/>
-        </w:rPr>
         <w:t xml:space="preserve">What to watch</w:t>
       </w:r>
     </w:p>
     <w:p>
       <w:pPr>
         <w:spacing w:after="160" w:line="276"/>
-        <w:jc w:val="left"/>
-      </w:pPr>
-      <w:r>
-        <w:rPr>
-          <w:rFonts w:ascii="Georgia" w:cs="Georgia" w:eastAsia="Georgia" w:hAnsi="Georgia"/>
-          <w:color w:val="1F2733"/>
-          <w:sz w:val="21"/>
-          <w:szCs w:val="21"/>
-        </w:rPr>
-        <w:t xml:space="preserve">The $8.23 trillion is real, concentrated, and largely untested. Two companies hold 22% of it, the five largest financings took 62% of the quarter's deal value, and 47.6% of all valuations have gone more than two years without a financing to confirm them. The valuations that are current, at the top, are the ones the secondary market prices most below the model, by 22% at Anthropic and 32% at SpaceX. The governing fact is artificial intelligence: it added more value in six months than the entire universe gained and now holds three-fifths of all private-technology value on two-fifths of the companies.</w:t>
-      </w:r>
-    </w:p>
-    <w:p>
-      <w:pPr>
-        <w:spacing w:after="160" w:line="276"/>
-        <w:jc w:val="left"/>
-      </w:pPr>
-      <w:r>
-        <w:rPr>
-          <w:rFonts w:ascii="Georgia" w:cs="Georgia" w:eastAsia="Georgia" w:hAnsi="Georgia"/>
-          <w:color w:val="1F2733"/>
-          <w:sz w:val="21"/>
-          <w:szCs w:val="21"/>
-        </w:rPr>
-        <w:t xml:space="preserve">The figure to track is not the aggregate, which will keep climbing on a dozen AI valuations, but the share of value resting on recently tested valuations against dated ones, and the event that will move it is the next set of frontier financings. Should the next Anthropic or SpaceX round clear below its model rather than above it, the repricing will not stay contained to a single company: on the correlations this market carries, a 25% reduction in AI valuations is $1.27 trillion off the top of the universe.</w:t>
-      </w:r>
-    </w:p>
-    <w:p>
-      <w:pPr>
-        <w:spacing w:after="160" w:line="276"/>
-        <w:jc w:val="left"/>
-      </w:pPr>
-      <w:r>
-        <w:rPr>
-          <w:rFonts w:ascii="Georgia" w:cs="Georgia" w:eastAsia="Georgia" w:hAnsi="Georgia"/>
-          <w:color w:val="1F2733"/>
-          <w:sz w:val="21"/>
-          <w:szCs w:val="21"/>
-        </w:rPr>
-        <w:t xml:space="preserve">Source: PitchBook deal-level unicorn tracker (Final Q2 2026 Quarterly Unicorn Tracker); Morningstar PitchBook Unicorn 20 Valuations and Pricing Data; Unicorn Monitor Data Q2 2026. As of June 30, 2026. Figures on the primary-tracker basis unless flagged; not blended across bases.</w:t>
+      </w:pPr>
+      <w:r>
+        <w:rPr>
+          <w:rFonts w:ascii="Georgia" w:cs="Georgia" w:eastAsia="Georgia" w:hAnsi="Georgia"/>
+          <w:color w:val="1F2733"/>
+          <w:sz w:val="21"/>
+          <w:szCs w:val="21"/>
+        </w:rPr>
+        <w:t xml:space="preserve">The $8.23 trillion is real, concentrated, and largely untested. Two companies hold 22% of it, the five largest financings took 62% of the quarter's deal value, and 47.6% of all valuations have gone more than two years without a financing to confirm them. The valuations that are current, at the top, are the ones the secondary market prices furthest below the model, by 22% at Anthropic and 32% at SpaceX. The governing fact is AI, which added more value in six months than the entire universe gained and now holds three-fifths of all private-technology value on two-fifths of the companies.</w:t>
+      </w:r>
+    </w:p>
+    <w:p>
+      <w:pPr>
+        <w:spacing w:after="160" w:line="276"/>
+      </w:pPr>
+      <w:r>
+        <w:rPr>
+          <w:rFonts w:ascii="Georgia" w:cs="Georgia" w:eastAsia="Georgia" w:hAnsi="Georgia"/>
+          <w:color w:val="1F2733"/>
+          <w:sz w:val="21"/>
+          <w:szCs w:val="21"/>
+        </w:rPr>
+        <w:t xml:space="preserve">The figure to track is not the aggregate, which will keep climbing on a dozen AI valuations, but the share of value resting on the frontier of recently tested valuations against the interior of dated ones. The event that will move it is the next set of frontier financings. Should the next Anthropic or SpaceX round clear below its model rather than above it, the repricing will not stay contained to a single company. On the correlations this market carries, a 25% reduction in AI valuations is $1.27 trillion off the top of the universe.</w:t>
+      </w:r>
+    </w:p>
+    <w:p>
+      <w:pPr>
+        <w:spacing w:after="160" w:line="276"/>
+      </w:pPr>
+      <w:r>
+        <w:rPr>
+          <w:rFonts w:ascii="Georgia" w:cs="Georgia" w:eastAsia="Georgia" w:hAnsi="Georgia"/>
+          <w:color w:val="1F2733"/>
+          <w:sz w:val="21"/>
+          <w:szCs w:val="21"/>
+        </w:rPr>
+        <w:t xml:space="preserve">The market that emerges from these pages is five companies deep at the top and seventeen hundred wide beneath, and the space between those two numbers is where the next three years happen.</w:t>
       </w:r>
     </w:p>
     <w:p>
@@ -882,7 +924,7 @@
           <w:sz w:val="16"/>
           <w:szCs w:val="16"/>
         </w:rPr>
-        <w:t xml:space="preserve">Source: PitchBook deal-level unicorn tracker (Final Q2 2026 Quarterly Unicorn Tracker); Morningstar PitchBook Unicorn 20 Valuations and Pricing Data; Unicorn Monitor Data Q2 2026. As of June 30, 2026. Figures on the primary-tracker basis unless flagged; Monitor and Unicorn 20 figures are used only for the three-mark secondary validation and the vertical index returns, and are not blended.</w:t>
+        <w:t xml:space="preserve">Source: PitchBook deal-level unicorn tracker (Final Q2 2026 Quarterly Unicorn Tracker); Morningstar PitchBook Unicorn 20 Valuations and Pricing Data; Unicorn Monitor Data Q2 2026; AIBQ/PBQ Panel as of 2026-06-30. As of June 30, 2026. Figures on the primary-tracker basis unless flagged; not blended across bases.</w:t>
       </w:r>
     </w:p>
     <w:sectPr>

</xml_diff>

<commit_message>
Final editorial pass: verified numbers, merged redundant section, 3,250-word body, charts embedded
Co-Authored-By: Claude Fable 5 <noreply@anthropic.com>
Claude-Session: https://claude.ai/code/session_01KcQ6jidyMrCam9PxNDFS9i
</commit_message>
<xml_diff>
--- a/templates/q2_2026_report.docx
+++ b/templates/q2_2026_report.docx
@@ -55,7 +55,7 @@
           <w:sz w:val="18"/>
           <w:szCs w:val="18"/>
         </w:rPr>
-        <w:t xml:space="preserve">Primary basis: PitchBook deal-level unicorn tracker (1,743 active companies / $8.23 trillion aggregate post-money valuation). The Morningstar PitchBook Unicorn 20 daily valuations and the Unicorn Monitor are used only where flagged, for the three-way valuation comparison of the largest companies and for the vertical index returns, and their figures are not combined with the primary-tracker totals.</w:t>
+        <w:t xml:space="preserve">Primary basis: PitchBook deal-level unicorn tracker (1,743 active companies / $8.23 trillion aggregate post-money valuation). The Morningstar PitchBook Unicorn 20 daily valuations and the Unicorn Monitor are used only where flagged, for the three-way valuation comparison of the largest companies and for the vertical index returns, and their figures are not combined with the primary-tracker totals. AIBQ/PBQ scores are from the hand-scored panel as of June 30, 2026; the 301-company US AI extension is from the US AI/ML hand-scored workbook.</w:t>
       </w:r>
     </w:p>
     <w:p>
@@ -75,21 +75,21 @@
           <w:sz w:val="26"/>
           <w:szCs w:val="26"/>
         </w:rPr>
-        <w:t xml:space="preserve">Summary</w:t>
-      </w:r>
-    </w:p>
-    <w:p>
-      <w:pPr>
-        <w:spacing w:after="160" w:line="276"/>
-      </w:pPr>
-      <w:r>
-        <w:rPr>
-          <w:rFonts w:ascii="Georgia" w:cs="Georgia" w:eastAsia="Georgia" w:hAnsi="Georgia"/>
-          <w:color w:val="1F2733"/>
-          <w:sz w:val="21"/>
-          <w:szCs w:val="21"/>
-        </w:rPr>
-        <w:t xml:space="preserve">The unicorn universe ended the second quarter at $8.23 trillion across 1,743 companies, up 13% over the prior year. The gain came from one place. AI added $1.59 trillion in six months while the universe grew $0.93 trillion, which means everything outside AI contracted, and every question that matters this quarter, whether the valuations are real, where the liquidity is, and how this cohort will age, follows from that fact.</w:t>
+        <w:t xml:space="preserve">Key takeaways</w:t>
+      </w:r>
+    </w:p>
+    <w:p>
+      <w:pPr>
+        <w:spacing w:after="160" w:line="276"/>
+      </w:pPr>
+      <w:r>
+        <w:rPr>
+          <w:rFonts w:ascii="Georgia" w:cs="Georgia" w:eastAsia="Georgia" w:hAnsi="Georgia"/>
+          <w:color w:val="1F2733"/>
+          <w:sz w:val="21"/>
+          <w:szCs w:val="21"/>
+        </w:rPr>
+        <w:t xml:space="preserve">- The five largest rounds took $87.1 billion, 62% of Q2's sized deal value, and Anthropic's $65 billion Series H alone was 16.4% of first-half financing. Quarterly deal value fell to $144.9 billion from Q1's record $251.3 billion. - AI holds $5.08 trillion, 61.7% of unicorn value on 40.3% of the companies, and added more value in six months than the whole universe gained. Meanwhile 47.6% of unicorns have not raised in more than two years. - Business quality and price disagree where the money is. Valuation explains about 15% of the variation in AIBQ/PBQ scores, and the secondary market prices the two most valuable names 22-32% below their model valuations.</w:t>
       </w:r>
     </w:p>
     <w:p>
@@ -140,21 +140,21 @@
           <w:sz w:val="21"/>
           <w:szCs w:val="21"/>
         </w:rPr>
-        <w:t xml:space="preserve">The five largest rounds raised $87.1 billion between them, and Anthropic alone accounted for $65 billion, raising into a $965 billion post-money valuation. That one financing was 5.4 times the next-largest round, Prometheus at $12 billion into a $41 billion valuation, and 16.4% of all first-half unicorn financing. Anduril ($5 billion into a $61 billion valuation), ByteDance ($3 billion into $370 billion), and Isomorphic Labs ($2.1 billion) completed the five, four of them artificial intelligence businesses. Below them, financing sizes fall under $2 billion by the sixth company and under $1 billion shortly after, so the ten largest rounds absorbed 68.9% of the quarter's sized financing value and the twenty-five largest 78.5%. Late-stage capital is concentrating into a small number of frontier labs that set the reference valuations others raise against. "First-half financing was strong" describes the fundraising of five companies, not seventeen hundred.</w:t>
-      </w:r>
-    </w:p>
-    <w:p>
-      <w:pPr>
-        <w:spacing w:after="160" w:line="276"/>
-      </w:pPr>
-      <w:r>
-        <w:rPr>
-          <w:rFonts w:ascii="Georgia" w:cs="Georgia" w:eastAsia="Georgia" w:hAnsi="Georgia"/>
-          <w:color w:val="1F2733"/>
-          <w:sz w:val="21"/>
-          <w:szCs w:val="21"/>
-        </w:rPr>
-        <w:t xml:space="preserve">The same concentration runs through who writes the checks. Syndicates of six or more investors made up 60.9% of 2026 rounds with disclosed participation, near the 2021 peak of 64%, so the rounds that occur are more crowded than before. Investor participation by count has not recovered alongside the dollars. It peaked at 2,892 in the third quarter of 2021, bottomed at 895 in the fourth quarter of 2023, recovered to 1,415 in the first quarter of 2026, then fell back to 995 in the second quarter, even as financing value stayed high. A small number of firms account for the most financings, with Sequoia Capital participating in 491 unicorn financings since 2016, Tiger Global 472, Andreessen Horowitz 454, Accel 382, and Coatue 344. Investor concentration mirrors company concentration.</w:t>
+        <w:t xml:space="preserve">The five largest rounds raised $87.1 billion between them, and Anthropic alone accounted for $65 billion, raising into a $965 billion post-money valuation. That one financing was 5.4 times the next-largest round, Prometheus at $12 billion into a $41 billion valuation, and 16.4% of all first-half unicorn financing. Anduril ($5 billion into a $61 billion valuation), ByteDance ($3 billion into $370 billion), and Isomorphic Labs ($2.1 billion) completed the five, four of them artificial intelligence businesses. Below them, financing sizes fall under $2 billion by the sixth company and under $1 billion shortly after, so the ten largest rounds absorbed 68.9% of the quarter's sized financing value and the twenty-five largest 78.5%. Quarterly deal value fell to $144.9 billion from Q1's record $251.3 billion, and the concentration deepened even as the total shrank. Late-stage capital is concentrating into a small number of frontier labs that set the reference valuations others raise against. A strong first-half financing refers to the fundraising of five companies, not 1,700.</w:t>
+      </w:r>
+    </w:p>
+    <w:p>
+      <w:pPr>
+        <w:spacing w:after="160" w:line="276"/>
+      </w:pPr>
+      <w:r>
+        <w:rPr>
+          <w:rFonts w:ascii="Georgia" w:cs="Georgia" w:eastAsia="Georgia" w:hAnsi="Georgia"/>
+          <w:color w:val="1F2733"/>
+          <w:sz w:val="21"/>
+          <w:szCs w:val="21"/>
+        </w:rPr>
+        <w:t xml:space="preserve">The same concentration runs through who writes the checks. Syndicates of six or more investors made up 60.9% of 2026 rounds with disclosed participation, near the 2021 peak of 64%, so the rounds that occur are more crowded than before. Investor participation by count has not recovered alongside the dollars. It peaked at 2,892 in Q3 2021, bottomed at 895 in Q4 2023, recovered to 1,415 in Q1 2026, then fell back to 995 in Q2, even as financing value stayed high. Sequoia Capital has participated in 491 unicorn financings since 2016, Tiger Global 472, Andreessen Horowitz 454, Accel 382, and Coatue 344. Investor concentration mirrors company concentration.</w:t>
       </w:r>
     </w:p>
     <w:p>
@@ -185,35 +185,35 @@
           <w:sz w:val="21"/>
           <w:szCs w:val="21"/>
         </w:rPr>
-        <w:t xml:space="preserve">Each of the twenty most closely followed private companies can be valued three ways: a daily, model-derived valuation published by Morningstar; the post-money valuation of the last completed primary financing, fixed until the next round; and an implied valuation from secondary-market transactions, the price at which shares change hands. Across the eighteen companies with a priced round, model-derived valuations sit 15.2% above last-round valuations. The gap is expected, since the model updates daily while the last-round valuation stays fixed until the next financing.</w:t>
-      </w:r>
-    </w:p>
-    <w:p>
-      <w:pPr>
-        <w:spacing w:after="160" w:line="276"/>
-      </w:pPr>
-      <w:r>
-        <w:rPr>
-          <w:rFonts w:ascii="Georgia" w:cs="Georgia" w:eastAsia="Georgia" w:hAnsi="Georgia"/>
-          <w:color w:val="1F2733"/>
-          <w:sz w:val="21"/>
-          <w:szCs w:val="21"/>
-        </w:rPr>
-        <w:t xml:space="preserve">The secondary market diverges exactly where the capital sits. Shares in twelve of the twenty companies trade below their model-derived valuation, and the two largest carry the widest discounts. SpaceX changes hands 32% below its $2.03 trillion model valuation, a gap of roughly $650 billion, and Anthropic 22% below its $1.27 trillion valuation, about $282 billion. Both valuations were set on recent events, SpaceX's June listing and an Anthropic financing, and both ran ahead of a secondary market that had yet to reprice. Neither price has been tested. The next round will pick one. Further down the list the pattern reverses. Applied Intuition, Anysphere, Anduril, and Revolut all trade 16-36% above their last round, so their recorded valuations understate what buyers will pay. At the bottom, all three measures have fallen together at Ripple, Epic Games, and Kraken.</w:t>
-      </w:r>
-    </w:p>
-    <w:p>
-      <w:pPr>
-        <w:spacing w:after="160" w:line="276"/>
-      </w:pPr>
-      <w:r>
-        <w:rPr>
-          <w:rFonts w:ascii="Georgia" w:cs="Georgia" w:eastAsia="Georgia" w:hAnsi="Georgia"/>
-          <w:color w:val="1F2733"/>
-          <w:sz w:val="21"/>
-          <w:szCs w:val="21"/>
-        </w:rPr>
-        <w:t xml:space="preserve">Valuation reliability, the agreement among independent estimates, runs inversely to position size. The least corroborated valuations belong to the companies most likely to dominate a late-stage portfolio, so a portfolio carried at model values holds its biggest positions 20-30% above what buyers are currently paying, and the overstatement grows with the size of the position.</w:t>
+        <w:t xml:space="preserve">Each of the twenty most closely followed private companies can be valued three ways: a daily, model-derived valuation published by Morningstar; the post-money valuation of the last completed primary financing; and an implied valuation from secondary-market transactions, the price at which shares change hands. Across eighteen companies with a priced round, model-derived valuations sit 15.2% above last-round valuations. The gap is expected, since the model updates daily while the last-round valuation stays fixed until the next financing.</w:t>
+      </w:r>
+    </w:p>
+    <w:p>
+      <w:pPr>
+        <w:spacing w:after="160" w:line="276"/>
+      </w:pPr>
+      <w:r>
+        <w:rPr>
+          <w:rFonts w:ascii="Georgia" w:cs="Georgia" w:eastAsia="Georgia" w:hAnsi="Georgia"/>
+          <w:color w:val="1F2733"/>
+          <w:sz w:val="21"/>
+          <w:szCs w:val="21"/>
+        </w:rPr>
+        <w:t xml:space="preserve">The secondary market diverges exactly where the capital sits. Shares in 12 of the 20 companies trade below their model-derived valuations, and the two largest carry the widest discounts. SpaceX changes hands 32% below its $2.03 trillion model valuation, a gap of roughly $650 billion, and Anthropic 22% below its $1.27 trillion valuation, about $282 billion. Both valuations were set on recent events, SpaceX's June listing and an Anthropic financing, and both ran ahead of a secondary market that had yet to reprice. Neither gap has closed. SpaceX's will be settled by the public market and Anthropic's by its next financing. Further down the list the pattern reverses. Applied Intuition, Anysphere, Anduril, and Revolut all trade 16-36% above their last round, so their recorded valuations understate what buyers will pay. At the bottom, all three measures have fallen together at Ripple, Epic Games, and Kraken.</w:t>
+      </w:r>
+    </w:p>
+    <w:p>
+      <w:pPr>
+        <w:spacing w:after="160" w:line="276"/>
+      </w:pPr>
+      <w:r>
+        <w:rPr>
+          <w:rFonts w:ascii="Georgia" w:cs="Georgia" w:eastAsia="Georgia" w:hAnsi="Georgia"/>
+          <w:color w:val="1F2733"/>
+          <w:sz w:val="21"/>
+          <w:szCs w:val="21"/>
+        </w:rPr>
+        <w:t xml:space="preserve">Valuation reliability, the agreement among independent estimates, runs inversely to position size. The least corroborated valuations belong to the companies most likely to dominate a late-stage portfolio, so a portfolio carried at model values holds its biggest positions 22-32% above what buyers are currently paying, and the overstatement grows with the size of the position.</w:t>
       </w:r>
     </w:p>
     <w:p>
@@ -244,7 +244,7 @@
           <w:sz w:val="21"/>
           <w:szCs w:val="21"/>
         </w:rPr>
-        <w:t xml:space="preserve">The gap between the typical and the average unicorn is the clearest measure of how concentrated this market has become. The median company carries a $2.0 billion post-money valuation. The average is $18.19 billion. That 9.1-to-1 ratio was 3.1 to 1 in 2025 and 2.8 to 1 in 2024, so the distribution split open over a single year. Financing sizes are skewed the same way, with a $200 million median against a $1,143 million average, the widest separation in eleven years of data. The aggregate grew because roughly a dozen valuations were rewritten upward while the middle of the distribution stood still. An institution benchmarking to the aggregate is tracking the twelve largest companies and crediting their revaluation to the asset class as a whole, when the median portfolio bears little resemblance to the index it is judged against.</w:t>
+        <w:t xml:space="preserve">The gap between the typical and the average unicorn is the clearest measure of concentration. The median company carries a $2.0 billion post-money valuation. The average is $18.19 billion. That 9.1-to-1 ratio was 3.1-to-1 in 2025 and 2.8-to-1 in 2024, so the distribution split open over a single year. Financing sizes are skewed the same way, with a $200 million median against a $1,143 million average, the widest separation in eleven years. The aggregate grew because roughly a dozen valuations were rewritten upward while the middle of the distribution stood still. An institution benchmarking to the aggregate is tracking the twelve largest companies and crediting their revaluation to the asset class as a whole, when the median portfolio bears little resemblance to the index it is judged against.</w:t>
       </w:r>
     </w:p>
     <w:p>
@@ -275,7 +275,7 @@
           <w:sz w:val="21"/>
           <w:szCs w:val="21"/>
         </w:rPr>
-        <w:t xml:space="preserve">Among the companies that actually raised, terms were strong. The median valuation step-up, the ratio of a new round's post-money valuation to the prior round's, reached 2.20 times in 2026, up from 2.05 in 2025. Only the 2021 peak of 2.64 stands higher. The median interval between financings compressed to 0.98 years from 1.21 in 2025 and 1.45 in 2024. Down rounds have nearly vanished, with six in the first half of 2026 worth $3.85 billion, against 31 in all of 2025 and 34 in 2024. The steepest revaluations came from small companies rather than the leaders: Hark at 151 times its prior round, Blitzy and SendCutSend at 30 times, each valued below $7 billion, while the giants gained in dollars at modest multiples. Velocity lives at the small end of the market, where a single financing can revalue a company several times over, and the value sits at the large end. Every figure describes only companies that raised, which is well under half the universe, and the untested majority is where the market's real risk sits.</w:t>
+        <w:t xml:space="preserve">Among the companies that actually raised, terms were strong. The median valuation step-up, the ratio of a new round's post-money valuation to the prior round's, reached 2.20 times in 2026, up from 2.05 in 2025. Only the 2021 peak of 2.64 stands higher. The median interval between financings compressed to 0.98 years from 1.21 years in 2025 and 1.45 years in 2024. Down rounds have nearly vanished, with six in the first half of 2026 worth $3.85 billion, against 31 in all of 2025 and 34 in 2024. The steepest revaluations came from small companies rather than the leaders: Hark at 151 times its prior round, Blitzy and SendCutSend at 30 times, each valued below $7 billion, while the giants gained in dollars at modest multiples. Velocity lives at the small end of the market, where a single financing can revalue a company several times over, and the value sits at the large end. Every figure describes only companies that raised, which is well under half the universe, and the untested majority is where the market's real risk sits.</w:t>
       </w:r>
     </w:p>
     <w:p>
@@ -320,7 +320,7 @@
           <w:sz w:val="21"/>
           <w:szCs w:val="21"/>
         </w:rPr>
-        <w:t xml:space="preserve">With artificial intelligence at three-fifths of value and two-thirds of growth, an allocation to late-stage venture is a concentrated bet on one theme rather than a diversified position. A program built without an explicit view on AI is still long AI, at a weight that now exceeds what most diversified mandates would knowingly hold.</w:t>
+        <w:t xml:space="preserve">With artificial intelligence at three-fifths of value and two-thirds of growth, an allocation to late-stage venture is a concentrated bet on one theme. A program built without an explicit view on AI is still long AI, at a weight that now exceeds what most diversified mandates would knowingly hold.</w:t>
       </w:r>
     </w:p>
     <w:p>
@@ -351,7 +351,7 @@
           <w:sz w:val="21"/>
           <w:szCs w:val="21"/>
         </w:rPr>
-        <w:t xml:space="preserve">Exit value in 2026 reached $2.1 trillion across 50 exits, with a single event accounting for four-fifths of it. SpaceX's listing alone was $1.7 trillion; excluding it, exit value was $420.7 billion, the strongest year since 2021 but far below the headline. Public listings drove 85% of exit value, and after three years of few listings, SpaceX, Cerebras ($34 billion), and Quantinuum ($14 billion) all listed in the quarter. The median time to exit rose to 8.47 years, near the 9.17-year peak of 2025, so the companies reaching liquidity now are older vintages rather than recent 2023 and 2024 formations. The 2026 total reflects one large listing and a backlog of aged companies clearing, not a broad acceleration of recent cohorts.</w:t>
+        <w:t xml:space="preserve">Exit value in 2026 reached $2.1 trillion across 50 exits, with a single event accounting for four-fifths of it. SpaceX's listing alone was $1.7 trillion; excluding it, exit value was $420.7 billion, the strongest year since 2021 but far below the headline. Public listings drove 85% of exit value, and after three years of few listings, SpaceX, Cerebras ($34 billion), and Quantinuum ($14 billion) all listed in the quarter. The listing was large enough to shrink the universe itself: the aggregate peaked at $8.7 trillion in the first quarter and ended the half at $8.23 trillion, because SpaceX's departure removed more value than the rest of the market added. After a first quarter dip driven by AI-native companies exiting young, the half-year median time to exit settled at 8.47 years, near the 9.17-year peak of 2025, so the companies reaching liquidity now are older vintages rather than recent 2023 and 2024 formations. The 2026 total reflects one large listing and an aged backlog clearing.</w:t>
       </w:r>
     </w:p>
     <w:p>
@@ -402,7 +402,7 @@
           <w:sz w:val="21"/>
           <w:szCs w:val="21"/>
         </w:rPr>
-        <w:t xml:space="preserve">SaaS leads at $6.44 trillion across 968 companies, with AI close behind at $6.02 trillion across 865, and FinTech a distant third at $2.02 trillion across 436. The next tier is far smaller: SpaceTech $1.87 trillion, Mobility $0.83 trillion, Cloud Infrastructure $0.74 trillion, HealthTech $0.45 trillion. The two leaders hold roughly $12.5 trillion between them. Because companies can have overlapping categories, these totals cover more than 1,743 companies and about 1.5 times the universe by value, so they cannot be added together. Much of the apparent breadth is the same companies counted twice under SaaS and AI. SpaceTech shows how a category can be a single company: its $1.87 trillion across 34 names averages $55 billion each, but SpaceX is nearly all of it.</w:t>
+        <w:t xml:space="preserve">SaaS leads at $6.44 trillion across 968 companies, with AI close behind at $6.02 trillion across 865, and FinTech a distant third at $2.02 trillion across 436. The next tier is far smaller: SpaceTech $1.87 trillion, Mobility $0.83 trillion, Cloud Infrastructure $0.74 trillion, HealthTech $0.45 trillion. The two leaders hold roughly $12.5 trillion between them. Tags overlap, so these totals sum to about 1.5 times the universe by value and cannot be added together, and much of the apparent breadth is the same companies counted twice under SaaS and AI. SpaceTech shows how a category can be a single company: its $1.87 trillion across 34 names still carries SpaceX at its final private valuation, and excluding it the vertical holds roughly $180 billion.</w:t>
       </w:r>
     </w:p>
     <w:p>
@@ -464,21 +464,21 @@
           <w:sz w:val="21"/>
           <w:szCs w:val="21"/>
         </w:rPr>
-        <w:t xml:space="preserve">On 2026 medians, AI recorded a relative velocity of value creation, the ratio of new valuation created to capital invested, of 1.84 times alongside a 2.35 times step-up across 249 financings, with software 1.42 and 2.18 across 176. The highest velocity sits in smaller categories: robotics and drones at 2.03 times, and CleanTech at 3.30 with a 2.77 step-up. Crypto fell from 2.62 to 1.11. Cybersecurity at 0.66 and e-commerce at 0.38 are lowest, both below 1.0 even as they raised at higher valuations (step-ups of 1.74 and 2.13 times), so each dollar invested created less than a dollar of new valuation.</w:t>
-      </w:r>
-    </w:p>
-    <w:p>
-      <w:pPr>
-        <w:spacing w:after="160" w:line="276"/>
-      </w:pPr>
-      <w:r>
-        <w:rPr>
-          <w:rFonts w:ascii="Georgia" w:cs="Georgia" w:eastAsia="Georgia" w:hAnsi="Georgia"/>
-          <w:color w:val="1F2733"/>
-          <w:sz w:val="21"/>
-          <w:szCs w:val="21"/>
-        </w:rPr>
-        <w:t xml:space="preserve">The three-year vertical indexes show the same order. Stated as annualized returns, AI returned 58.1% a year, or 302.6% cumulative, enterprise software 34.2%, and cybersecurity 22.2%, the only categories to beat the Global TME benchmark of 19.6% a year, or 72.4% cumulative. AI compounded at about three times the public rate, while FinTech, third by value, returned 12.9% and trailed. These returns run on infrequently updated valuations, which suppresses measured volatility, so the low volatility of the private indexes reflects infrequent revaluation rather than stability.</w:t>
+        <w:t xml:space="preserve">On 2026 medians, AI recorded a relative velocity of value creation, the ratio of new valuation created to capital invested, of 1.84 times alongside a 2.35 times step-up across 249 financings, with software 1.42 and 2.18 across 176 financings. The highest velocity sits in smaller categories: robotics and drones at 2.03 times, and CleanTech at 3.30 with a 2.77 step-up. Crypto fell from 2.62 to 1.11. Cybersecurity at 0.66 and e-commerce at 0.38 are the lowest, both below 1.0, even as they raised at higher valuations (step-ups of 1.74 and 2.13 times), so each dollar invested created less than a dollar of new valuation.</w:t>
+      </w:r>
+    </w:p>
+    <w:p>
+      <w:pPr>
+        <w:spacing w:after="160" w:line="276"/>
+      </w:pPr>
+      <w:r>
+        <w:rPr>
+          <w:rFonts w:ascii="Georgia" w:cs="Georgia" w:eastAsia="Georgia" w:hAnsi="Georgia"/>
+          <w:color w:val="1F2733"/>
+          <w:sz w:val="21"/>
+          <w:szCs w:val="21"/>
+        </w:rPr>
+        <w:t xml:space="preserve">The three-year vertical indexes show the same order. Stated as annualized returns, AI returned 58.1% a year, or 302.6% cumulative, enterprise software 34.2%, and cybersecurity 22.2%, the only categories to beat the Global TME benchmark of 19.6% a year, or 72.4% cumulative. AI compounded at about three times the public rate, while FinTech, third by value, returned 12.9% and trailed. These returns are based on infrequently updated valuations, which suppress measured volatility, so the low volatility of the private indexes reflects infrequent revaluation rather than stability.</w:t>
       </w:r>
     </w:p>
     <w:p>
@@ -509,7 +509,7 @@
           <w:sz w:val="21"/>
           <w:szCs w:val="21"/>
         </w:rPr>
-        <w:t xml:space="preserve">AI is both the driver of the market's growth and its largest concentration of value, in the same companies. It produced $1.59 trillion of the $0.93 trillion universe gain, so the rest of the market contracted around it. It now represents 62% of value, four of the five largest rounds, and 61% of new company formation. Because AI valuations move together and dominate the index, a repricing in a few frontier names moves the aggregate. A 25% reduction in AI valuations would remove roughly $1.27 trillion, which is 15.4% of all private-technology value. That is the bet. The companies that produced the gain are the same ones the secondary market values below their model valuations. The exposure that drove the aggregate up carries the widest downside and sits in too large a share of the universe to be diversified away within it.</w:t>
+        <w:t xml:space="preserve">AI is both the driver of the market's growth and its largest concentration of value. It added $1.59 trillion in a half-year when the whole universe gained $0.93 trillion, so the rest of the market contracted around it, through both repricing and the departure of SpaceX to the public market. It now represents 62% of value, four of the five largest rounds, and 61% of new company formation. Because AI valuations move together and dominate the index, a repricing in a few frontier names moves the aggregate. A 25% reduction in AI valuations would remove roughly $1.27 trillion, which is 15.4% of all private-technology value. That is the bet. The companies that produced the gain are the same ones the secondary market values below their model valuations. The exposure that drove the aggregate up carries the widest downside and sits in too large a share of the universe to be diversified away within it.</w:t>
       </w:r>
     </w:p>
     <w:p>
@@ -540,7 +540,7 @@
           <w:sz w:val="21"/>
           <w:szCs w:val="21"/>
         </w:rPr>
-        <w:t xml:space="preserve">Of 635 unicorns minted in 2021, five years on 470 remain active (74%), 102 have exited (16%), and 62 have failed. Of the 62, 34 fell below the billion-dollar threshold while private, 15 fell at exit through a listing or sale below unicorn status, and 13 went bankrupt. Three-quarters remain illiquid four and a half years after formation, consistent with a median time to exit of 8.47 years, and because the 15 that fell at exit are recorded as exits rather than failures, the reported exit count overstates successful outcomes. Today's 702 AI unicorns are a cohort of the same size at an earlier stage. If they age as the 2021 vintage did, roughly a quarter would impair and three-quarters would remain illiquid into the next decade. AI valuations are more correlated and concentrated than 2021's, so those outcomes would be more tightly linked. The ten-year funds that financed the 2021 vintage mature between 2028 and 2031, the period over which those untested valuations resolve through markdown, sale, or wind-down.</w:t>
+        <w:t xml:space="preserve">Of 634 unicorns minted in 2021, five years on 470 remain active (74%), 102 have exited (16%), and 62 have failed (10%). Of the 62 that failed, 34 fell below the billion-dollar threshold while private, 15 fell at exit through a listing or sale below unicorn status, and 13 went bankrupt. Three-quarters remain illiquid five years after formation, consistent with a median time to exit of 8.47 years. Today's 702 AI unicorns are a cohort of the same size at an earlier stage. If they age as the 2021 vintage did, roughly a quarter would impair and three-quarters would remain illiquid into the next decade. AI valuations are more correlated and concentrated than 2021's, so those outcomes would be more tightly linked. The ten-year funds that financed the 2021 vintage mature between 2028 and 2031, the period over which those untested valuations resolve through markdown, sale, or wind-down.</w:t>
       </w:r>
     </w:p>
     <w:p>
@@ -560,7 +560,7 @@
           <w:sz w:val="26"/>
           <w:szCs w:val="26"/>
         </w:rPr>
-        <w:t xml:space="preserve">Business quality (AIBQ/PBQ) and valuations</w:t>
+        <w:t xml:space="preserve">Business quality and valuations</w:t>
       </w:r>
     </w:p>
     <w:p>
@@ -591,7 +591,7 @@
           <w:sz w:val="21"/>
           <w:szCs w:val="21"/>
         </w:rPr>
-        <w:t xml:space="preserve">The AIBQ and PBQ framework scores the twenty largest private companies on five weighted dimensions of the business underneath the valuation: revenue quality, capital efficiency, governance optionality, moat durability, and either compute independence or strategic velocity depending on the business type. Eight companies built on their own AI models are scored as AIBQ, and for them compute independence measures how much of their compute they control, because compute is the input that decides whether these businesses can keep operating. The other twelve are scored as PBQ and measured on speed of execution instead. Each composite sorts the company into one of four tiers, from Elite above 8.0 to Distressed below 4.5, with wide confidence bands because private disclosure is thin.</w:t>
+        <w:t xml:space="preserve">The AIBQ and PBQ framework scores the twenty largest private companies on five weighted dimensions of the business underneath the valuation: revenue quality, capital efficiency, governance optionality, moat durability, and either compute independence or strategic velocity depending on the business type. Eight companies built on their own AI models are scored as AIBQ, and for them, compute independence measures how much of their compute they control, because compute is the input that decides whether these businesses can keep operating. The other twelve are scored as PBQ and measured on speed of execution instead. Each composite sorts the company into one of four tiers, from Elite above 8.0 to Distressed below 4.5, with wide confidence bands because private disclosure is thin. Scores are re-baselined under a revised methodology and are not comparable to the Q1 prints.</w:t>
       </w:r>
     </w:p>
     <w:p>
@@ -622,7 +622,7 @@
           <w:sz w:val="21"/>
           <w:szCs w:val="21"/>
         </w:rPr>
-        <w:t xml:space="preserve">The primary market and the scores disagree about the same twenty companies. The disagreement is largest where the money is. Valuation explains about 15% of the variation in quality scores. Databricks and Stripe are the only companies to reach the Elite tier, and they are valued at $134 billion and $159 billion. Anthropic scores 7.22 and ranks seventh despite being the most valuable private company in the world at $965 billion, while OpenAI scores 6.30 and ranks fifteenth at $852 billion. A late-stage round prices scarcity and expected scale, and the giants earn their valuations on exactly those grounds. The framework scores what a growth round tends to look past, which is where the giants lose points, since they rent the compute they depend on, run thin margins after model costs, and in OpenAI's case carry an unfinished conversion from nonprofit control. Expressed as price per point of quality, the disagreement becomes concrete. For example, a point of quality costs about $2.2 billion at Applied Intuition and $134 billion at Anthropic, a sixty-fold premium for a lower score.</w:t>
+        <w:t xml:space="preserve">The primary market and the scores disagree about the same twenty companies. The disagreement is largest where the money is. Valuation explains about 15% of the variation in quality scores. Databricks and Stripe are the only companies to reach the Elite tier, and they are valued at $134 billion and $159 billion. Anthropic scores 7.22 and ranks seventh despite being the most valuable private company in the world at $965 billion, while OpenAI scores 6.30 and ranks fifteenth at $852 billion. A late-stage round prices scarcity and expected scale, and the giants earn their valuations on exactly those grounds. The framework scores what a growth round tends to look past, which is where the giants lose points, since they rent the compute they depend on, run thin margins after model costs, and in OpenAI's case carry an unfinished conversion from nonprofit control. Expressed as price per point of quality, the disagreement becomes concrete. A point of quality costs about $2.2 billion at Applied Intuition and $134 billion at Anthropic, a sixty-fold premium for a lower score.</w:t>
       </w:r>
     </w:p>
     <w:p>
@@ -685,21 +685,113 @@
           <w:sz w:val="21"/>
           <w:szCs w:val="21"/>
         </w:rPr>
-        <w:t xml:space="preserve">The scores against secondary valuations</w:t>
-      </w:r>
-    </w:p>
-    <w:p>
-      <w:pPr>
-        <w:spacing w:after="160" w:line="276"/>
-      </w:pPr>
-      <w:r>
-        <w:rPr>
-          <w:rFonts w:ascii="Georgia" w:cs="Georgia" w:eastAsia="Georgia" w:hAnsi="Georgia"/>
-          <w:color w:val="1F2733"/>
-          <w:sz w:val="21"/>
-          <w:szCs w:val="21"/>
-        </w:rPr>
-        <w:t xml:space="preserve">The secondary market, compared to the primary market, aligns more closely with the framework's reading. The ten companies whose shares trade above their last round average 7.4 on quality, while the seven trading below average 6.0. That alignment makes sense once the buyer is considered, because a secondary purchaser gets no board seat and no new information rights, so the price rests on what can be observed about the business today, which is close to what the framework scores. Two departures from the pattern are informative. Anthropic and OpenAI trade 22% and 9% below their model valuations despite mid-tier scores, which suggests secondary buyers are already discounting the compute dependence and governance questions the primary market has not yet priced. And the two Distressed names have the least price discovery of all. Figure AI, scored 3.75, trades 23% below its round, and Neuralink, scored 2.5, has no meaningful secondary depth beneath a model valuation sitting 441% above its last financing. Across the twenty unicorns, the weaker the business scores, the fewer independent prices exist to test its valuation, which is the same divide between tested and untested values that runs through the rest of this report.</w:t>
+        <w:t xml:space="preserve">The scores against the secondary market</w:t>
+      </w:r>
+    </w:p>
+    <w:p>
+      <w:pPr>
+        <w:spacing w:after="160" w:line="276"/>
+      </w:pPr>
+      <w:r>
+        <w:rPr>
+          <w:rFonts w:ascii="Georgia" w:cs="Georgia" w:eastAsia="Georgia" w:hAnsi="Georgia"/>
+          <w:color w:val="1F2733"/>
+          <w:sz w:val="21"/>
+          <w:szCs w:val="21"/>
+        </w:rPr>
+        <w:t xml:space="preserve">The secondary market, compared to the primary market, aligns more closely with the framework's reading. The ten companies whose shares trade above their last round average 7.4 on quality, while the seven trading below average 6.0. That alignment makes sense because a secondary purchaser gets no board seat and no new information rights, so the price rests on what can be observed about the business today, which is close to what the framework scores. Two departures from the pattern are informative. Anthropic and OpenAI trade at 22% and 9% below their model valuations despite mid-tier scores, suggesting secondary buyers are already discounting the compute dependence and governance questions that the primary market has not yet priced. And the two Distressed names have the least price discovery of all. Figure AI, scored 3.75, trades 23% below its round, and Neuralink, scored 2.5, has no meaningful secondary depth beneath a model valuation sitting 441% above its last financing. Across the twenty, the weaker the business scores, the fewer independent prices exist to test its valuation. Extending the framework across 301 US AI companies shows how thin quality runs below the leaders: the median composite sits near 4.5, only five companies reach Strong or better, and 140 of the 301 score Distressed. The quality question is not the top of the AI market. It is everything underneath it.</w:t>
+      </w:r>
+    </w:p>
+    <w:p>
+      <w:pPr>
+        <w:spacing w:after="160" w:before="120"/>
+        <w:jc w:val="center"/>
+      </w:pPr>
+      <w:r>
+        <w:drawing>
+          <wp:inline distT="0" distB="0" distL="0" distR="0">
+            <wp:extent cx="5905500" cy="3619500"/>
+            <wp:effectExtent t="0" r="0" b="0" l="0"/>
+            <wp:docPr id="1" name="" descr="" title=""/>
+            <wp:cNvGraphicFramePr>
+              <a:graphicFrameLocks xmlns:a="http://schemas.openxmlformats.org/drawingml/2006/main" noChangeAspect="1"/>
+            </wp:cNvGraphicFramePr>
+            <a:graphic xmlns:a="http://schemas.openxmlformats.org/drawingml/2006/main">
+              <a:graphicData uri="http://schemas.openxmlformats.org/drawingml/2006/picture">
+                <pic:pic xmlns:pic="http://schemas.openxmlformats.org/drawingml/2006/picture">
+                  <pic:nvPicPr>
+                    <pic:cNvPr id="0" name="" descr=""/>
+                    <pic:cNvPicPr>
+                      <a:picLocks noChangeAspect="1" noChangeArrowheads="1"/>
+                    </pic:cNvPicPr>
+                  </pic:nvPicPr>
+                  <pic:blipFill>
+                    <a:blip r:embed="rId9" cstate="none"/>
+                    <a:srcRect/>
+                    <a:stretch>
+                      <a:fillRect/>
+                    </a:stretch>
+                  </pic:blipFill>
+                  <pic:spPr bwMode="auto">
+                    <a:xfrm>
+                      <a:off x="0" y="0"/>
+                      <a:ext cx="5905500" cy="3619500"/>
+                    </a:xfrm>
+                    <a:prstGeom prst="rect">
+                      <a:avLst/>
+                    </a:prstGeom>
+                  </pic:spPr>
+                </pic:pic>
+              </a:graphicData>
+            </a:graphic>
+          </wp:inline>
+        </w:drawing>
+      </w:r>
+    </w:p>
+    <w:p>
+      <w:pPr>
+        <w:spacing w:after="160" w:before="120"/>
+        <w:jc w:val="center"/>
+      </w:pPr>
+      <w:r>
+        <w:drawing>
+          <wp:inline distT="0" distB="0" distL="0" distR="0">
+            <wp:extent cx="5905500" cy="3619500"/>
+            <wp:effectExtent t="0" r="0" b="0" l="0"/>
+            <wp:docPr id="1" name="" descr="" title=""/>
+            <wp:cNvGraphicFramePr>
+              <a:graphicFrameLocks xmlns:a="http://schemas.openxmlformats.org/drawingml/2006/main" noChangeAspect="1"/>
+            </wp:cNvGraphicFramePr>
+            <a:graphic xmlns:a="http://schemas.openxmlformats.org/drawingml/2006/main">
+              <a:graphicData uri="http://schemas.openxmlformats.org/drawingml/2006/picture">
+                <pic:pic xmlns:pic="http://schemas.openxmlformats.org/drawingml/2006/picture">
+                  <pic:nvPicPr>
+                    <pic:cNvPr id="0" name="" descr=""/>
+                    <pic:cNvPicPr>
+                      <a:picLocks noChangeAspect="1" noChangeArrowheads="1"/>
+                    </pic:cNvPicPr>
+                  </pic:nvPicPr>
+                  <pic:blipFill>
+                    <a:blip r:embed="rId10" cstate="none"/>
+                    <a:srcRect/>
+                    <a:stretch>
+                      <a:fillRect/>
+                    </a:stretch>
+                  </pic:blipFill>
+                  <pic:spPr bwMode="auto">
+                    <a:xfrm>
+                      <a:off x="0" y="0"/>
+                      <a:ext cx="5905500" cy="3619500"/>
+                    </a:xfrm>
+                    <a:prstGeom prst="rect">
+                      <a:avLst/>
+                    </a:prstGeom>
+                  </pic:spPr>
+                </pic:pic>
+              </a:graphicData>
+            </a:graphic>
+          </wp:inline>
+        </w:drawing>
       </w:r>
     </w:p>
     <w:p>
@@ -736,37 +828,6 @@
           <w:sz w:val="21"/>
           <w:szCs w:val="21"/>
         </w:rPr>
-        <w:t xml:space="preserve">Two companies account for a fifth of the market's value</w:t>
-      </w:r>
-    </w:p>
-    <w:p>
-      <w:pPr>
-        <w:spacing w:after="160" w:line="276"/>
-      </w:pPr>
-      <w:r>
-        <w:rPr>
-          <w:rFonts w:ascii="Georgia" w:cs="Georgia" w:eastAsia="Georgia" w:hAnsi="Georgia"/>
-          <w:color w:val="1F2733"/>
-          <w:sz w:val="21"/>
-          <w:szCs w:val="21"/>
-        </w:rPr>
-        <w:t xml:space="preserve">Anthropic ($965 billion) and OpenAI ($852 billion) together hold $1.82 trillion, 22% of the $8.23 trillion universe. The ten largest hold about $2.9 trillion, 35% of it, against a $2.0 billion median. At this concentration the index and the median move independently. The aggregate can rise on a dozen revaluations while the typical unicorn stands still, so a move in the aggregate says nothing about the median holding.</w:t>
-      </w:r>
-    </w:p>
-    <w:p>
-      <w:pPr>
-        <w:pStyle w:val="Heading2"/>
-        <w:spacing w:after="70" w:before="220"/>
-      </w:pPr>
-      <w:r>
-        <w:rPr>
-          <w:rFonts w:ascii="Arial" w:cs="Arial" w:eastAsia="Arial" w:hAnsi="Arial"/>
-          <w:b/>
-          <w:bCs/>
-          <w:color w:val="1A2744"/>
-          <w:sz w:val="21"/>
-          <w:szCs w:val="21"/>
-        </w:rPr>
         <w:t xml:space="preserve">Valuations are current at the top and grow stale quickly below it</w:t>
       </w:r>
     </w:p>
@@ -781,7 +842,7 @@
           <w:sz w:val="21"/>
           <w:szCs w:val="21"/>
         </w:rPr>
-        <w:t xml:space="preserve">Anthropic (valued May 2026), ByteDance (May 2026), and OpenAI (March 2026) carry recent valuations, but below the leaders they age fast. Ant Group, seventh by value, still carries a financing from August 2020, and SHEIN carries one from January 2024. Measured from actual latest-financing dates, 47.6% of unicorns have not raised in more than 24 months and 37.1% in more than 36 months. Close to half of the $8.23 trillion rests on valuations no financing has retested in two years or more. The universe divides into a small frontier of recently priced companies and a large interior of dated valuations whose repricing risk never appears in the aggregate. Blending the third of the universe priced within the past year with the hundreds of companies priced years ago produces a single number that hides the difference, and the total should be separated into recently tested and untested dollars.</w:t>
+        <w:t xml:space="preserve">Anthropic ($965 billion) and OpenAI ($852 billion) together hold $1.82 trillion, 22% of the $8.23 trillion universe, and both carry recent valuations, Anthropic from May 2026 and OpenAI from March 2026, as does ByteDance (May 2026). Below these leaders, valuations age fast. Ant Group, seventh by value, still carries a financing from August 2020, and SHEIN carries one from January 2024. Measured from actual latest-financing dates, 47.6% of unicorns have not raised in more than 24 months and 37.1% in more than 36 months. Close to half of the $8.23 trillion rests on valuations no financing has retested in two years or more. The universe divides into a small frontier of recently priced companies and a large interior of dated valuations whose repricing risk never appears in the aggregate. Blending recently priced companies with hundreds priced years ago produces a single number that hides the difference, and the total should be split into tested and untested dollars.</w:t>
       </w:r>
     </w:p>
     <w:p>
@@ -843,7 +904,7 @@
           <w:sz w:val="21"/>
           <w:szCs w:val="21"/>
         </w:rPr>
-        <w:t xml:space="preserve">A total of 245 unicorns have fallen below the billion-dollar threshold to date, and new failures have nearly stopped. There have been six down rounds in the first half of 2026 worth $3.85 billion, against a peak of 34 in 2024. Failures are severe when they occur, at a median failing valuation of $524.5 million and a median decline of 67% from the prior peak, leaving the typical fallen unicorn at about a third of its high, just below the billion-dollar line. The 2021 cohort's 15 companies that fell at exit are recorded as exits, so the reported failure count understates losses. A company is also recognized as failing only when it raises at a lower valuation, and 47.6% of the universe has not raised in more than two years, so the count describes companies that raised rather than the dormant majority.</w:t>
+        <w:t xml:space="preserve">A total of 245 unicorns have fallen below the billion-dollar threshold to date, and new failures have nearly stopped. The count rose from the 175 reported in Q1 through a rebuild of the curated list, which now includes pre-2016 falls and 63 companies with no recorded down round, not through new failures. There have been six down rounds in the first half of 2026 worth $3.85 billion, against a peak of 34 in 2024. Failures are severe when they occur, at a median failing valuation of $524.5 million and a median decline of 67% from the prior peak. The 2021 cohort's 15 companies that fell at exit are recorded as exits, so the reported failure count understates losses. A company is also recognized as failing only when it raises at a lower valuation, and 47.6% of the universe has not raised in more than two years, so the count describes companies that raised rather than the dormant majority.</w:t>
       </w:r>
     </w:p>
     <w:p>
@@ -877,54 +938,35 @@
           <w:sz w:val="21"/>
           <w:szCs w:val="21"/>
         </w:rPr>
-        <w:t xml:space="preserve">The $8.23 trillion is real, concentrated, and largely untested. Two companies hold 22% of it, the five largest financings took 62% of the quarter's deal value, and 47.6% of all valuations have gone more than two years without a financing to confirm them. The valuations that are current, at the top, are the ones the secondary market prices furthest below the model, by 22% at Anthropic and 32% at SpaceX. The governing fact is AI, which added more value in six months than the entire universe gained and now holds three-fifths of all private-technology value on two-fifths of the companies.</w:t>
-      </w:r>
-    </w:p>
-    <w:p>
-      <w:pPr>
-        <w:spacing w:after="160" w:line="276"/>
-      </w:pPr>
-      <w:r>
-        <w:rPr>
-          <w:rFonts w:ascii="Georgia" w:cs="Georgia" w:eastAsia="Georgia" w:hAnsi="Georgia"/>
-          <w:color w:val="1F2733"/>
-          <w:sz w:val="21"/>
-          <w:szCs w:val="21"/>
-        </w:rPr>
-        <w:t xml:space="preserve">The figure to track is not the aggregate, which will keep climbing on a dozen AI valuations, but the share of value resting on the frontier of recently tested valuations against the interior of dated ones. The event that will move it is the next set of frontier financings. Should the next Anthropic or SpaceX round clear below its model rather than above it, the repricing will not stay contained to a single company. On the correlations this market carries, a 25% reduction in AI valuations is $1.27 trillion off the top of the universe.</w:t>
-      </w:r>
-    </w:p>
-    <w:p>
-      <w:pPr>
-        <w:spacing w:after="160" w:line="276"/>
-      </w:pPr>
-      <w:r>
-        <w:rPr>
-          <w:rFonts w:ascii="Georgia" w:cs="Georgia" w:eastAsia="Georgia" w:hAnsi="Georgia"/>
-          <w:color w:val="1F2733"/>
-          <w:sz w:val="21"/>
-          <w:szCs w:val="21"/>
-        </w:rPr>
-        <w:t xml:space="preserve">The market that emerges from these pages is five companies deep at the top and seventeen hundred wide beneath, and the space between those two numbers is where the next three years happen.</w:t>
-      </w:r>
-    </w:p>
-    <w:p>
-      <w:pPr>
-        <w:pBdr>
-          <w:top w:val="single" w:color="C9D2E0" w:sz="4" w:space="8"/>
-        </w:pBdr>
-        <w:spacing w:after="0" w:before="360"/>
-      </w:pPr>
-      <w:r>
-        <w:rPr>
-          <w:rFonts w:ascii="Georgia" w:cs="Georgia" w:eastAsia="Georgia" w:hAnsi="Georgia"/>
-          <w:i/>
-          <w:iCs/>
-          <w:color w:val="55637A"/>
-          <w:sz w:val="16"/>
-          <w:szCs w:val="16"/>
-        </w:rPr>
-        <w:t xml:space="preserve">Source: PitchBook deal-level unicorn tracker (Final Q2 2026 Quarterly Unicorn Tracker); Morningstar PitchBook Unicorn 20 Valuations and Pricing Data; Unicorn Monitor Data Q2 2026; AIBQ/PBQ Panel as of 2026-06-30. As of June 30, 2026. Figures on the primary-tracker basis unless flagged; not blended across bases.</w:t>
+        <w:t xml:space="preserve">The $8.23 trillion is real, concentrated, and largely untested. Two companies hold 22% of it, the five largest financings took 62% of the quarter's sized deal value, and 47.6% of all valuations have gone more than two years without a financing to confirm them. The valuations that are current, at the top, are the ones the secondary market prices furthest below the model, by 22% at Anthropic and 32% at SpaceX. The governing fact is AI, which added more value in six months than the entire universe gained and now holds three-fifths of all private-technology value on two-fifths of the companies.</w:t>
+      </w:r>
+    </w:p>
+    <w:p>
+      <w:pPr>
+        <w:spacing w:after="160" w:line="276"/>
+      </w:pPr>
+      <w:r>
+        <w:rPr>
+          <w:rFonts w:ascii="Georgia" w:cs="Georgia" w:eastAsia="Georgia" w:hAnsi="Georgia"/>
+          <w:color w:val="1F2733"/>
+          <w:sz w:val="21"/>
+          <w:szCs w:val="21"/>
+        </w:rPr>
+        <w:t xml:space="preserve">The figure to track is not the aggregate, which will keep climbing on a dozen AI valuations, but the share of value resting on the frontier of recently tested valuations against the interior of dated ones. The event that will move it is the next set of frontier financings. SpaceX has already met its test, and public shares value the company roughly a third below its model valuation. Anthropic and OpenAI have not. Should Anthropic's expected listing or OpenAI's next round clear below the model rather than above it, the repricing will not stay contained to a single company.</w:t>
+      </w:r>
+    </w:p>
+    <w:p>
+      <w:pPr>
+        <w:spacing w:after="160" w:line="276"/>
+      </w:pPr>
+      <w:r>
+        <w:rPr>
+          <w:rFonts w:ascii="Georgia" w:cs="Georgia" w:eastAsia="Georgia" w:hAnsi="Georgia"/>
+          <w:color w:val="1F2733"/>
+          <w:sz w:val="21"/>
+          <w:szCs w:val="21"/>
+        </w:rPr>
+        <w:t xml:space="preserve">The market that emerges is five companies deep at the top and 1,700 wide beneath, and the space between those two numbers is where the next three years happen.</w:t>
       </w:r>
     </w:p>
     <w:sectPr>

</xml_diff>

<commit_message>
Apply post-review corrections: cohort-vs-universe median/average reframe, SpaceX public-price rework, 18-private-name scoping, methodology disclosures; add redline build with changes in red bold
Co-Authored-By: Claude Fable 5 <noreply@anthropic.com>
Claude-Session: https://claude.ai/code/session_01KcQ6jidyMrCam9PxNDFS9i
</commit_message>
<xml_diff>
--- a/templates/q2_2026_report.docx
+++ b/templates/q2_2026_report.docx
@@ -49,13 +49,15 @@
       <w:r>
         <w:rPr>
           <w:rFonts w:ascii="Georgia" w:cs="Georgia" w:eastAsia="Georgia" w:hAnsi="Georgia"/>
+          <w:b w:val="false"/>
+          <w:bCs w:val="false"/>
           <w:i/>
           <w:iCs/>
           <w:color w:val="55637A"/>
           <w:sz w:val="18"/>
           <w:szCs w:val="18"/>
         </w:rPr>
-        <w:t xml:space="preserve">Primary basis: PitchBook deal-level unicorn tracker (1,743 active companies / $8.23 trillion aggregate post-money valuation). The Morningstar PitchBook Unicorn 20 daily valuations and the Unicorn Monitor are used only where flagged, for the three-way valuation comparison of the largest companies and for the vertical index returns, and their figures are not combined with the primary-tracker totals. AIBQ/PBQ scores are from the hand-scored panel as of June 30, 2026; the 301-company US AI extension is from the US AI/ML hand-scored workbook.</w:t>
+        <w:t xml:space="preserve">Primary basis: PitchBook deal-level unicorn tracker (1,743 active companies / $8.23 trillion aggregate post-money valuation). The Morningstar PitchBook Unicorn 20 daily valuations and the Unicorn Monitor are used only where flagged, for the three-way valuation comparison of the largest companies and for the vertical index returns, and their figures are not combined with the primary-tracker totals. Secondary-market prices are from the Unicorn Monitor secondary dataset, marked as of June 22, 2026; SpaceX and Cerebras, public since June and May, are carried at public market values. AIBQ/PBQ scores are from the hand-scored panel as of June 30, 2026; the 301-company US AI extension is from the US AI/ML hand-scored workbook.</w:t>
       </w:r>
     </w:p>
     <w:p>
@@ -80,16 +82,59 @@
     </w:p>
     <w:p>
       <w:pPr>
-        <w:spacing w:after="160" w:line="276"/>
-      </w:pPr>
-      <w:r>
-        <w:rPr>
-          <w:rFonts w:ascii="Georgia" w:cs="Georgia" w:eastAsia="Georgia" w:hAnsi="Georgia"/>
-          <w:color w:val="1F2733"/>
-          <w:sz w:val="21"/>
-          <w:szCs w:val="21"/>
-        </w:rPr>
-        <w:t xml:space="preserve">- The five largest rounds took $87.1 billion, 62% of Q2's sized deal value, and Anthropic's $65 billion Series H alone was 16.4% of first-half financing. Quarterly deal value fell to $144.9 billion from Q1's record $251.3 billion. - AI holds $5.08 trillion, 61.7% of unicorn value on 40.3% of the companies, and added more value in six months than the whole universe gained. Meanwhile 47.6% of unicorns have not raised in more than two years. - Business quality and price disagree where the money is. Valuation explains about 15% of the variation in AIBQ/PBQ scores, and the secondary market prices the two most valuable names 22-32% below their model valuations.</w:t>
+        <w:pStyle w:val="ListParagraph"/>
+        <w:numPr>
+          <w:ilvl w:val="0"/>
+          <w:numId w:val="1"/>
+        </w:numPr>
+        <w:spacing w:after="100" w:line="276"/>
+      </w:pPr>
+      <w:r>
+        <w:rPr>
+          <w:rFonts w:ascii="Georgia" w:cs="Georgia" w:eastAsia="Georgia" w:hAnsi="Georgia"/>
+          <w:color w:val="1F2733"/>
+          <w:sz w:val="21"/>
+          <w:szCs w:val="21"/>
+        </w:rPr>
+        <w:t xml:space="preserve">The five largest rounds took $87.1 billion, 62% of Q2's sized deal value, and Anthropic's $65 billion Series H alone was 16.4% of first-half financing. Quarterly deal value fell to $144.9 billion from Q1's record $251.3 billion.</w:t>
+      </w:r>
+    </w:p>
+    <w:p>
+      <w:pPr>
+        <w:pStyle w:val="ListParagraph"/>
+        <w:numPr>
+          <w:ilvl w:val="0"/>
+          <w:numId w:val="1"/>
+        </w:numPr>
+        <w:spacing w:after="100" w:line="276"/>
+      </w:pPr>
+      <w:r>
+        <w:rPr>
+          <w:rFonts w:ascii="Georgia" w:cs="Georgia" w:eastAsia="Georgia" w:hAnsi="Georgia"/>
+          <w:color w:val="1F2733"/>
+          <w:sz w:val="21"/>
+          <w:szCs w:val="21"/>
+        </w:rPr>
+        <w:t xml:space="preserve">AI holds $5.08 trillion, 61.7% of unicorn value on 40.3% of the companies, and added more value in six months than the whole universe gained. Meanwhile 47.6% of unicorns have not raised in more than two years.</w:t>
+      </w:r>
+    </w:p>
+    <w:p>
+      <w:pPr>
+        <w:pStyle w:val="ListParagraph"/>
+        <w:numPr>
+          <w:ilvl w:val="0"/>
+          <w:numId w:val="1"/>
+        </w:numPr>
+        <w:spacing w:after="100" w:line="276"/>
+      </w:pPr>
+      <w:r>
+        <w:rPr>
+          <w:rFonts w:ascii="Georgia" w:cs="Georgia" w:eastAsia="Georgia" w:hAnsi="Georgia"/>
+          <w:color w:val="1F2733"/>
+          <w:sz w:val="21"/>
+          <w:szCs w:val="21"/>
+        </w:rPr>
+        <w:t xml:space="preserve">Business quality and price disagree where the money is. Valuation explains about 15% of the variation in AIBQ/PBQ scores, and the secondary market prices Anthropic, the most valuable private company, 22% below its model valuation, with 11 of the 18 private names trading below model.</w:t>
       </w:r>
     </w:p>
     <w:p>
@@ -186,21 +231,21 @@
           <w:sz w:val="21"/>
           <w:szCs w:val="21"/>
         </w:rPr>
-        <w:t xml:space="preserve">The five largest rounds raised $87.1 billion between them, and Anthropic alone accounted for $65 billion, raising into a $965 billion post-money valuation. That one financing was 5.4 times the next-largest round, Prometheus at $12 billion into a $41 billion valuation, and 16.4% of all first-half unicorn financing. Anduril ($5 billion into a $61 billion valuation), ByteDance ($3 billion into $370 billion), and Isomorphic Labs ($2.1 billion) completed the five, four of them artificial intelligence businesses. Below them, financing sizes fall under $2 billion by the sixth company and under $1 billion shortly after, so the ten largest rounds absorbed 68.9% of the quarter's sized financing value and the twenty-five largest 78.5%. Quarterly deal value fell to $144.9 billion from Q1's record $251.3 billion, and the concentration deepened even as the total shrank. Late-stage capital is concentrating into a small number of frontier labs that set the reference valuations others raise against. A strong first-half financing refers to the fundraising of five companies, not 1,700.</w:t>
-      </w:r>
-    </w:p>
-    <w:p>
-      <w:pPr>
-        <w:spacing w:after="160" w:line="276"/>
-      </w:pPr>
-      <w:r>
-        <w:rPr>
-          <w:rFonts w:ascii="Georgia" w:cs="Georgia" w:eastAsia="Georgia" w:hAnsi="Georgia"/>
-          <w:color w:val="1F2733"/>
-          <w:sz w:val="21"/>
-          <w:szCs w:val="21"/>
-        </w:rPr>
-        <w:t xml:space="preserve">The same concentration runs through who writes the checks. Syndicates of six or more investors made up 60.9% of 2026 rounds with disclosed participation, near the 2021 peak of 64%, so the rounds that occur are more crowded than before. Investor participation by count has not recovered alongside the dollars. It peaked at 2,892 in Q3 2021, bottomed at 895 in Q4 2023, recovered to 1,415 in Q1 2026, then fell back to 995 in Q2, even as financing value stayed high. Sequoia Capital has participated in 491 unicorn financings since 2016, Tiger Global 472, Andreessen Horowitz 454, Accel 382, and Coatue 344. Investor concentration mirrors company concentration.</w:t>
+        <w:t xml:space="preserve">The five largest rounds raised $87.1 billion between them, and Anthropic alone accounted for $65 billion, raising into a $965 billion post-money valuation. That one financing was 5.4 times the next-largest round, Prometheus at $12 billion into a $41 billion valuation, and 16.4% of all first-half unicorn financing. Anduril ($5 billion into a $61 billion valuation), ByteDance ($3 billion into $370 billion), and Isomorphic Labs ($2.1 billion) completed the five, four of them artificial intelligence businesses. Below them, financing sizes fall under $2 billion by the sixth company and under $1 billion shortly after, so the ten largest rounds absorbed 68.9% of the quarter's $139.5 billion in sized financing value and the twenty-five largest 78.5%. Quarterly deal value fell to $144.9 billion from Q1's record $251.3 billion, and the concentration deepened even as the total shrank. Late-stage capital is concentrating into a small number of frontier labs that set the reference valuations others raise against. A strong first half in financing describes five companies, not 1,700.</w:t>
+      </w:r>
+    </w:p>
+    <w:p>
+      <w:pPr>
+        <w:spacing w:after="160" w:line="276"/>
+      </w:pPr>
+      <w:r>
+        <w:rPr>
+          <w:rFonts w:ascii="Georgia" w:cs="Georgia" w:eastAsia="Georgia" w:hAnsi="Georgia"/>
+          <w:color w:val="1F2733"/>
+          <w:sz w:val="21"/>
+          <w:szCs w:val="21"/>
+        </w:rPr>
+        <w:t xml:space="preserve">The same concentration runs through who writes the checks. Syndicates of six or more investors made up 60.9% of 2026 rounds with disclosed participation, near the 2021 peak of 64.0%, so the rounds that occur are more crowded than before. Investor participation by count has not recovered alongside the dollars. It peaked at 2,892 in Q3 2021, bottomed at 895 in Q4 2023, recovered to 1,415 in Q1 2026, then fell back to 995 in Q2, even as financing value stayed high. Sequoia Capital has participated in 491 unicorn financings since 2016, Tiger Global 472, Andreessen Horowitz 454, Accel 382, and Coatue 344. Investor concentration mirrors company concentration.</w:t>
       </w:r>
     </w:p>
     <w:p>
@@ -277,35 +322,35 @@
           <w:sz w:val="21"/>
           <w:szCs w:val="21"/>
         </w:rPr>
-        <w:t xml:space="preserve">Each of the twenty most closely followed private companies can be valued three ways: a daily, model-derived valuation published by Morningstar; the post-money valuation of the last completed primary financing; and an implied valuation from secondary-market transactions, the price at which shares change hands. Across eighteen companies with a priced round, model-derived valuations sit 15.2% above last-round valuations. The gap is expected, since the model updates daily while the last-round valuation stays fixed until the next financing.</w:t>
-      </w:r>
-    </w:p>
-    <w:p>
-      <w:pPr>
-        <w:spacing w:after="160" w:line="276"/>
-      </w:pPr>
-      <w:r>
-        <w:rPr>
-          <w:rFonts w:ascii="Georgia" w:cs="Georgia" w:eastAsia="Georgia" w:hAnsi="Georgia"/>
-          <w:color w:val="1F2733"/>
-          <w:sz w:val="21"/>
-          <w:szCs w:val="21"/>
-        </w:rPr>
-        <w:t xml:space="preserve">The secondary market diverges exactly where the capital sits. Shares in 12 of the 20 companies trade below their model-derived valuations, and the two largest carry the widest discounts. SpaceX changes hands 32% below its $2.03 trillion model valuation, a gap of roughly $650 billion, and Anthropic 22% below its $1.27 trillion valuation, about $282 billion. Both valuations were set on recent events, SpaceX's June listing and an Anthropic financing, and both ran ahead of a secondary market that had yet to reprice. Neither gap has closed. SpaceX's will be settled by the public market and Anthropic's by its next financing. Further down the list the pattern reverses. Applied Intuition, Anysphere, Anduril, and Revolut all trade 16-36% above their last round, so their recorded valuations understate what buyers will pay. At the bottom, all three measures have fallen together at Ripple, Epic Games, and Kraken.</w:t>
-      </w:r>
-    </w:p>
-    <w:p>
-      <w:pPr>
-        <w:spacing w:after="160" w:line="276"/>
-      </w:pPr>
-      <w:r>
-        <w:rPr>
-          <w:rFonts w:ascii="Georgia" w:cs="Georgia" w:eastAsia="Georgia" w:hAnsi="Georgia"/>
-          <w:color w:val="1F2733"/>
-          <w:sz w:val="21"/>
-          <w:szCs w:val="21"/>
-        </w:rPr>
-        <w:t xml:space="preserve">Valuation reliability, the agreement among independent estimates, runs inversely to position size. The least corroborated valuations belong to the companies most likely to dominate a late-stage portfolio, so a portfolio carried at model values holds its biggest positions 22-32% above what buyers are currently paying, and the overstatement grows with the size of the position.</w:t>
+        <w:t xml:space="preserve">Each of the twenty companies in the Morningstar PitchBook Unicorn 20 can be valued three ways: a daily, model-derived valuation published by Morningstar; the post-money valuation of the last completed primary financing; and an implied valuation from secondary-market transactions, the price at which shares change hands. The index excludes some large private names, xAI and Waymo among them, which carry no model or secondary pricing. Across eighteen companies with a priced round, model-derived valuations sit 15.2% above last-round valuations. The gap is expected, since the model updates daily while the last-round valuation stays fixed until the next financing.</w:t>
+      </w:r>
+    </w:p>
+    <w:p>
+      <w:pPr>
+        <w:spacing w:after="160" w:line="276"/>
+      </w:pPr>
+      <w:r>
+        <w:rPr>
+          <w:rFonts w:ascii="Georgia" w:cs="Georgia" w:eastAsia="Georgia" w:hAnsi="Georgia"/>
+          <w:color w:val="1F2733"/>
+          <w:sz w:val="21"/>
+          <w:szCs w:val="21"/>
+        </w:rPr>
+        <w:t xml:space="preserve">The secondary market diverges exactly where the capital sits. Among the eighteen names that remain private, shares in 11 trade below their model-derived valuations, and the largest position carries the widest discount. Anthropic changes hands 22% below its $1.27 trillion model valuation, a gap of about $282 billion, set after a May financing that ran ahead of a secondary market that has yet to reprice. That gap will be settled by the company's next financing or listing. SpaceX, public since June 11, is the control case: pre-listing secondary prints implied a discount of roughly a third, and the opening of public trading erased it, with shares closing day one near $2.11 trillion against a $2.03 trillion model valuation. Further down the list the pattern reverses. Applied Intuition, Anysphere, Anduril, and Revolut all trade 16-36% above their last round, so their recorded valuations understate what buyers will pay. At the bottom, all three measures have fallen together at Ripple, Epic Games, and Kraken.</w:t>
+      </w:r>
+    </w:p>
+    <w:p>
+      <w:pPr>
+        <w:spacing w:after="160" w:line="276"/>
+      </w:pPr>
+      <w:r>
+        <w:rPr>
+          <w:rFonts w:ascii="Georgia" w:cs="Georgia" w:eastAsia="Georgia" w:hAnsi="Georgia"/>
+          <w:color w:val="1F2733"/>
+          <w:sz w:val="21"/>
+          <w:szCs w:val="21"/>
+        </w:rPr>
+        <w:t xml:space="preserve">Valuation reliability, the agreement among independent estimates, runs inversely to position size. The least corroborated valuations belong to the companies most likely to dominate a late-stage portfolio, so a portfolio carried at model values holds its largest private position 22% above what buyers are currently paying, and the overstatement grows with the size of the position.</w:t>
       </w:r>
     </w:p>
     <w:p>
@@ -336,7 +381,7 @@
           <w:sz w:val="21"/>
           <w:szCs w:val="21"/>
         </w:rPr>
-        <w:t xml:space="preserve">The gap between the typical and the average unicorn is the clearest measure of concentration. The median company carries a $2.0 billion post-money valuation. The average is $18.19 billion. That 9.1-to-1 ratio was 3.1-to-1 in 2025 and 2.8-to-1 in 2024, so the distribution split open over a single year. Financing sizes are skewed the same way, with a $200 million median against a $1,143 million average, the widest separation in eleven years. The aggregate grew because roughly a dozen valuations were rewritten upward while the middle of the distribution stood still. An institution benchmarking to the aggregate is tracking the twelve largest companies and crediting their revaluation to the asset class as a whole, when the median portfolio bears little resemblance to the index it is judged against.</w:t>
+        <w:t xml:space="preserve">Among unicorns that raised in the first half of 2026, the median financing priced at a $2.0 billion post-money valuation while the average was $18.19 billion. That 9.1-to-1 gap was 3.1-to-1 in 2025 and 2.8-to-1 in 2024. These are financing-cohort figures, not universe averages, and the widening is a composition effect: the cohort that raised this half includes the giants, so a handful of rounds pulls the average an order of magnitude above the median. The universe-wide numbers carry the same skew at smaller scale, a median active unicorn near $1.7 billion against a $4.7 billion implied average on the $8.23 trillion aggregate. Financing sizes are skewed the same way, with a $200 million median against a $1.14 billion average, the widest separation in eleven years. The aggregate grew because roughly a dozen valuations were rewritten upward while the middle of the distribution stood still. An institution benchmarking to the aggregate is tracking the twelve largest companies and crediting their revaluation to the asset class as a whole, when the median portfolio bears little resemblance to the index it is judged against.</w:t>
       </w:r>
     </w:p>
     <w:p>
@@ -413,7 +458,7 @@
           <w:sz w:val="21"/>
           <w:szCs w:val="21"/>
         </w:rPr>
-        <w:t xml:space="preserve">Among the companies that actually raised, terms were strong. The median valuation step-up, the ratio of a new round's post-money valuation to the prior round's, reached 2.20 times in 2026, up from 2.05 in 2025. Only the 2021 peak of 2.64 stands higher. The median interval between financings compressed to 0.98 years from 1.21 years in 2025 and 1.45 years in 2024. Down rounds have nearly vanished, with six in the first half of 2026 worth $3.85 billion, against 31 in all of 2025 and 34 in 2024. The steepest revaluations came from small companies rather than the leaders: Hark at 151 times its prior round, Blitzy and SendCutSend at 30 times, each valued below $7 billion, while the giants gained in dollars at modest multiples. Velocity lives at the small end of the market, where a single financing can revalue a company several times over, and the value sits at the large end. Every figure describes only companies that raised, which is well under half the universe, and the untested majority is where the market's real risk sits.</w:t>
+        <w:t xml:space="preserve">Among the companies that actually raised, terms were strong. The median valuation step-up, the ratio of a new round's post-money valuation to the prior round's, reached 2.20 times in the first half of 2026, up from 2.05 in 2025. Only the 2021 peak of 2.64 stands higher. The median interval between financings compressed to 0.98 years from 1.21 years in 2025 and 1.45 years in 2024. Down rounds have nearly vanished, with six in the first half of 2026 worth $3.85 billion, against 31 in all of 2025 and 34 in 2024. The steepest revaluations came from small companies rather than the leaders: Hark at 151 times its prior round, Blitzy and SendCutSend at 30 times, each valued below $7 billion, while the giants gained in dollars at modest multiples. Velocity lives at the small end of the market, where a single financing can revalue a company several times over, and the value sits at the large end. Every figure describes only companies that raised, which is well under half the universe, and the untested majority is where the market's real risk sits.</w:t>
       </w:r>
     </w:p>
     <w:p>
@@ -504,7 +549,7 @@
           <w:sz w:val="21"/>
           <w:szCs w:val="21"/>
         </w:rPr>
-        <w:t xml:space="preserve">With artificial intelligence at three-fifths of value and two-thirds of growth, an allocation to late-stage venture is a concentrated bet on one theme. A program built without an explicit view on AI is still long AI, at a weight that now exceeds what most diversified mandates would knowingly hold.</w:t>
+        <w:t xml:space="preserve">With artificial intelligence at three-fifths of value and three-fifths of new formation, an allocation to late-stage venture is a concentrated bet on one theme. A program built without an explicit view on AI is still long AI, at a weight that now exceeds what most diversified mandates would knowingly hold.</w:t>
       </w:r>
     </w:p>
     <w:p>
@@ -581,7 +626,7 @@
           <w:sz w:val="21"/>
           <w:szCs w:val="21"/>
         </w:rPr>
-        <w:t xml:space="preserve">Exit value in 2026 reached $2.1 trillion across 50 exits, with a single event accounting for four-fifths of it. SpaceX's listing alone was $1.7 trillion; excluding it, exit value was $420.7 billion, the strongest year since 2021 but far below the headline. Public listings drove 85% of exit value, and after three years of few listings, SpaceX, Cerebras ($34 billion), and Quantinuum ($14 billion) all listed in the quarter. The listing was large enough to shrink the universe itself: the aggregate peaked at $8.7 trillion in the first quarter and ended the half at $8.23 trillion, because SpaceX's departure removed more value than the rest of the market added. After a first quarter dip driven by AI-native companies exiting young, the half-year median time to exit settled at 8.47 years, near the 9.17-year peak of 2025, so the companies reaching liquidity now are older vintages rather than recent 2023 and 2024 formations. The 2026 total reflects one large listing and an aged backlog clearing.</w:t>
+        <w:t xml:space="preserve">Exit value in the first half of 2026 reached $2.1 trillion across 50 exits, with a single event accounting for four-fifths of it. SpaceX's listing alone was $1.7 trillion; excluding it, exit value was $420.7 billion, the strongest year since 2021 but far below the headline. Public listings drove 85% of exit value, and after three years of few listings, SpaceX, Cerebras ($34 billion), and Quantinuum ($14 billion) all listed in the quarter. The listing was large enough to shrink the universe itself: the aggregate peaked at $8.7 trillion in the first quarter and ended the half at $8.23 trillion, because SpaceX's departure removed more value than the rest of the market added. After a first-quarter dip in median time to exit, driven by AI-native companies exiting young, the half-year median settled at 8.47 years, near the 9.17-year peak of 2025, so the companies reaching liquidity now are older vintages rather than recent 2023 and 2024 formations. The 2026 total reflects one large listing and an aged backlog clearing.</w:t>
       </w:r>
     </w:p>
     <w:p>
@@ -678,7 +723,7 @@
           <w:sz w:val="21"/>
           <w:szCs w:val="21"/>
         </w:rPr>
-        <w:t xml:space="preserve">SaaS leads at $6.44 trillion across 968 companies, with AI close behind at $6.02 trillion across 865, and FinTech a distant third at $2.02 trillion across 436. The next tier is far smaller: SpaceTech $1.87 trillion, Mobility $0.83 trillion, Cloud Infrastructure $0.74 trillion, HealthTech $0.45 trillion. The two leaders hold roughly $12.5 trillion between them. Tags overlap, so these totals sum to about 1.5 times the universe by value and cannot be added together, and much of the apparent breadth is the same companies counted twice under SaaS and AI. SpaceTech shows how a category can be a single company: its $1.87 trillion across 34 names still carries SpaceX at its final private valuation, and excluding it the vertical holds roughly $180 billion.</w:t>
+        <w:t xml:space="preserve">SaaS leads at $6.44 trillion across 968 companies, with AI close behind at $6.02 trillion across 865, and FinTech a distant third at $2.02 trillion across 436. The next tier is far smaller: SpaceTech $1.87 trillion, Mobility $0.83 trillion, Cloud Infrastructure $0.74 trillion, HealthTech $0.45 trillion. The two leaders hold roughly $12.5 trillion between them. Tags overlap, so these totals sum to about 1.5 times the universe by value and cannot be added together, and much of the apparent breadth is the same companies counted twice under SaaS and AI. The AI tag at 865 companies is also broader than the curated 702-company AI cohort cited elsewhere in this report, because tags are nonexclusive. SpaceTech shows how a category can be a single company: its $1.87 trillion across 34 names still carries SpaceX at its final private valuation because the tag table is a snapshot that does not roll up to the aggregate, and excluding it the vertical holds roughly $0.18 trillion.</w:t>
       </w:r>
     </w:p>
     <w:p>
@@ -709,7 +754,7 @@
           <w:sz w:val="21"/>
           <w:szCs w:val="21"/>
         </w:rPr>
-        <w:t xml:space="preserve">The count of 1,743 overstates the number of large, recently valued companies. The ten largest hold about $2.9 trillion, 35% of the total, while the median company is $2.0 billion, so most of the universe sits far below the names that carry it. Only about a third of unicorns, 614 companies, have raised within the past twelve months. The rest are priced off older financings. Geography and theme narrow it further, with 54% domiciled in the United States and 40% classified as AI. Size, recency, and liquidity required together leave a small subset of the total count, weighted toward US software and AI.</w:t>
+        <w:t xml:space="preserve">The count of 1,743 overstates the number of large, recently valued companies. The ten largest hold about $2.9 trillion, 35% of the total, while the median active unicorn is about $1.7 billion, so most of the universe sits far below the names that carry it. Only about a third of unicorns, 614 companies, have raised within the past twelve months. The rest are priced off older financings. Geography and theme narrow it further, with 54% domiciled in the United States and 40% classified as AI. Size, recency, and required liquidity together leave a small subset of the total count, weighted toward US software and AI.</w:t>
       </w:r>
     </w:p>
     <w:p>
@@ -740,21 +785,21 @@
           <w:sz w:val="21"/>
           <w:szCs w:val="21"/>
         </w:rPr>
-        <w:t xml:space="preserve">On 2026 medians, AI recorded a relative velocity of value creation, the ratio of new valuation created to capital invested, of 1.84 times alongside a 2.35 times step-up across 249 financings, with software 1.42 and 2.18 across 176 financings. The highest velocity sits in smaller categories: robotics and drones at 2.03 times, and CleanTech at 3.30 with a 2.77 step-up. Crypto fell from 2.62 to 1.11. Cybersecurity at 0.66 and e-commerce at 0.38 are the lowest, both below 1.0, even as they raised at higher valuations (step-ups of 1.74 and 2.13 times), so each dollar invested created less than a dollar of new valuation.</w:t>
-      </w:r>
-    </w:p>
-    <w:p>
-      <w:pPr>
-        <w:spacing w:after="160" w:line="276"/>
-      </w:pPr>
-      <w:r>
-        <w:rPr>
-          <w:rFonts w:ascii="Georgia" w:cs="Georgia" w:eastAsia="Georgia" w:hAnsi="Georgia"/>
-          <w:color w:val="1F2733"/>
-          <w:sz w:val="21"/>
-          <w:szCs w:val="21"/>
-        </w:rPr>
-        <w:t xml:space="preserve">The three-year vertical indexes show the same order. Stated as annualized returns, AI returned 58.1% a year, or 302.6% cumulative, enterprise software 34.2%, and cybersecurity 22.2%, the only categories to beat the Global TME benchmark of 19.6% a year, or 72.4% cumulative. AI compounded at about three times the public rate, while FinTech, third by value, returned 12.9% and trailed. These returns are based on infrequently updated valuations, which suppress measured volatility, so the low volatility of the private indexes reflects infrequent revaluation rather than stability.</w:t>
+        <w:t xml:space="preserve">On first-half 2026 medians, AI recorded a relative velocity of value creation, the ratio of new valuation created to capital invested, of 1.84 times alongside a 2.35 times step-up across 249 financings, with SaaS at 1.42 and 2.18 across 176 financings. The highest velocity sits in smaller categories: robotics and drones at 2.03 times, and CleanTech at 3.30 with a 2.77 step-up. Crypto fell from 2.62 to 1.11. Cybersecurity at 0.66 and e-commerce at 0.38 are the lowest, both below 1.0, even as they raised at higher valuations (step-ups of 1.74 and 2.13 times), so each dollar invested created less than a dollar of new valuation.</w:t>
+      </w:r>
+    </w:p>
+    <w:p>
+      <w:pPr>
+        <w:spacing w:after="160" w:line="276"/>
+      </w:pPr>
+      <w:r>
+        <w:rPr>
+          <w:rFonts w:ascii="Georgia" w:cs="Georgia" w:eastAsia="Georgia" w:hAnsi="Georgia"/>
+          <w:color w:val="1F2733"/>
+          <w:sz w:val="21"/>
+          <w:szCs w:val="21"/>
+        </w:rPr>
+        <w:t xml:space="preserve">The three-year vertical indexes show the same order. Stated as annualized returns, AI returned 58.1% a year, or 302.6% cumulative, enterprise SaaS 34.2%, and cybersecurity 22.2%, the only categories to beat the Morningstar Global TME public technology benchmark of 19.6% a year, or 72.4% cumulative, over the three-year window ended June 30. AI compounded at about three times the public rate, while FinTech, third by value, returned 12.9% and trailed. These returns are based on infrequently updated valuations, which suppress measured volatility, so the low volatility of the private indexes reflects infrequent revaluation rather than stability.</w:t>
       </w:r>
     </w:p>
     <w:p>
@@ -785,7 +830,7 @@
           <w:sz w:val="21"/>
           <w:szCs w:val="21"/>
         </w:rPr>
-        <w:t xml:space="preserve">AI is both the driver of the market's growth and its largest concentration of value. It added $1.59 trillion in a half-year when the whole universe gained $0.93 trillion, so the rest of the market contracted around it, through both repricing and the departure of SpaceX to the public market. It now represents 62% of value, four of the five largest rounds, and 61% of new company formation. Because AI valuations move together and dominate the index, a repricing in a few frontier names moves the aggregate. A 25% reduction in AI valuations would remove roughly $1.27 trillion, which is 15.4% of all private-technology value. That is the bet. The companies that produced the gain are the same ones the secondary market values below their model valuations. The exposure that drove the aggregate up carries the widest downside and sits in too large a share of the universe to be diversified away within it.</w:t>
+        <w:t xml:space="preserve">AI is both the driver of the market's growth and its largest concentration of value. It added $1.59 trillion in a half-year when the whole universe gained $0.93 trillion, so the rest of the market contracted around it, through both repricing and the departure of SpaceX to the public market. It now represents 61.7% of value, four of the five largest rounds, and 61% of new company formation. Because AI valuations move together and dominate the index, a repricing in a few frontier names moves the aggregate. A 25% reduction in AI valuations would remove roughly $1.27 trillion, which is 15.4% of all private-technology value. That is the bet. The companies that produced the gain are the same ones the secondary market values below their model valuations. The exposure that drove the aggregate up carries the widest downside and sits in too large a share of the universe to be diversified away within it.</w:t>
       </w:r>
     </w:p>
     <w:p>
@@ -867,7 +912,7 @@
           <w:sz w:val="21"/>
           <w:szCs w:val="21"/>
         </w:rPr>
-        <w:t xml:space="preserve">The AIBQ and PBQ framework scores the twenty largest private companies on five weighted dimensions of the business underneath the valuation: revenue quality, capital efficiency, governance optionality, moat durability, and either compute independence or strategic velocity depending on the business type. Eight companies built on their own AI models are scored as AIBQ, and for them, compute independence measures how much of their compute they control, because compute is the input that decides whether these businesses can keep operating. The other twelve are scored as PBQ and measured on speed of execution instead. Each composite sorts the company into one of four tiers, from Elite above 8.0 to Distressed below 4.5, with wide confidence bands because private disclosure is thin. Scores are re-baselined under a revised methodology and are not comparable to the Q1 prints.</w:t>
+        <w:t xml:space="preserve">The AI business quality (AIBQ) and private business quality (PBQ) framework scores the twenty Unicorn 20 constituents on five weighted dimensions of the business underneath the valuation: revenue quality (25%), capital efficiency (20%), governance optionality (20%), moat durability (20%), and either compute independence or strategic velocity (15%), depending on the business type. Eight companies built on their own AI models are scored as AIBQ, and for them, compute independence measures how much of their compute they control, because compute is the input that decides whether these businesses can keep operating. The other twelve are scored as PBQ and measured on speed of execution instead. Each composite sorts the company into one of four tiers, from Elite at 8.0 and above to Distressed below 4.5, with wide confidence bands because private disclosure is thin. Scores are re-baselined under a revised methodology and are not comparable to the Q1 prints. All inputs are capped at June 30; events after quarter-end, including Databricks' July financing, are excluded.</w:t>
       </w:r>
     </w:p>
     <w:p>
@@ -898,7 +943,7 @@
           <w:sz w:val="21"/>
           <w:szCs w:val="21"/>
         </w:rPr>
-        <w:t xml:space="preserve">The primary market and the scores disagree about the same twenty companies. The disagreement is largest where the money is. Valuation explains about 15% of the variation in quality scores. Databricks and Stripe are the only companies to reach the Elite tier, and they are valued at $134 billion and $159 billion. Anthropic scores 7.22 and ranks seventh despite being the most valuable private company in the world at $965 billion, while OpenAI scores 6.30 and ranks fifteenth at $852 billion. A late-stage round prices scarcity and expected scale, and the giants earn their valuations on exactly those grounds. The framework scores what a growth round tends to look past, which is where the giants lose points, since they rent the compute they depend on, run thin margins after model costs, and in OpenAI's case carry an unfinished conversion from nonprofit control. Expressed as price per point of quality, the disagreement becomes concrete. A point of quality costs about $2.2 billion at Applied Intuition and $134 billion at Anthropic, a sixty-fold premium for a lower score.</w:t>
+        <w:t xml:space="preserve">The primary market and the scores disagree about the same twenty companies. The disagreement is largest where the money is. Valuation explains about 15% of the variation in quality scores, a directional read on a sample of twenty. Databricks and Stripe are the only companies to reach the Elite tier, and they are valued at $134 billion and $159 billion. Anthropic scores 7.22 and ranks seventh despite being the most valuable private company in the world at $965 billion, while OpenAI scores 6.30 and ranks fifteenth at $852 billion. A late-stage round prices scarcity and expected scale, and the giants earn their valuations on exactly those grounds. The framework scores what a growth round tends to look past, which is where the giants lose points, since they rent the compute they depend on, run thin margins after model costs, and in OpenAI's case carry an unfinished conversion from nonprofit control. Expressed as price per point of quality, the disagreement becomes concrete. A point of quality costs about $2.2 billion at Applied Intuition and $134 billion at Anthropic, a sixty-fold premium for a lower score.</w:t>
       </w:r>
     </w:p>
     <w:p>
@@ -975,7 +1020,7 @@
           <w:sz w:val="21"/>
           <w:szCs w:val="21"/>
         </w:rPr>
-        <w:t xml:space="preserve">The secondary market, compared to the primary market, aligns more closely with the framework's reading. The ten companies whose shares trade above their last round average 7.4 on quality, while the seven trading below average 6.0. That alignment makes sense because a secondary purchaser gets no board seat and no new information rights, so the price rests on what can be observed about the business today, which is close to what the framework scores. Two departures from the pattern are informative. Anthropic and OpenAI trade at 22% and 9% below their model valuations despite mid-tier scores, suggesting secondary buyers are already discounting the compute dependence and governance questions that the primary market has not yet priced. And the two Distressed names have the least price discovery of all. Figure AI, scored 3.75, trades 23% below its round, and Neuralink, scored 2.5, has no meaningful secondary depth beneath a model valuation sitting 441% above its last financing. Across the twenty, the weaker the business scores, the fewer independent prices exist to test its valuation. Extending the framework across 301 US AI companies shows how thin quality runs below the leaders: the median composite sits near 4.5, only five companies reach Strong or better, and 140 of the 301 score Distressed. The quality question is not the top of the AI market. It is everything underneath it.</w:t>
+        <w:t xml:space="preserve">The secondary market, compared to the primary market, aligns more closely with the framework's reading. Of the eighteen private names, eleven trade above their last round and seven below. Excluding Neuralink, whose premium is a stale-round artifact, the ten trading above average 7.4 on quality, while the seven trading below average 6.0. That alignment makes sense because a secondary purchaser gets no board seat and no new information rights, so the price rests on what can be observed about the business today, which is close to what the framework scores. Two departures from the pattern are informative. Anthropic and OpenAI trade at 22% and 9% below their model valuations despite mid-tier scores, suggesting secondary buyers are already discounting the compute dependence and governance questions that the primary market has not yet priced. And the two Distressed names have the least price discovery of all. Figure AI, scored 3.75, trades 23% below its round, and Neuralink, scored 2.50, has no meaningful secondary depth beneath a model valuation sitting 441% above its last financing. Across the twenty, the weaker the business scores, the fewer independent prices exist to test its valuation. The whole tape is thin: closed secondary volume across the twenty names was $562 million in Q2, down from $1.33 billion in Q1, against positions marked in the trillions. Extending the framework across 301 US AI companies, each hand-scored on the same rubric and calibrated to the twenty verified composites, with lower confidence on sparsely disclosed names, shows how thin quality runs below the leaders: the median composite sits at 4.55, just above the 4.5 Distressed boundary, only five companies reach Strong or better, and 140 of the 301 score Distressed. The quality question is not the top of the AI market. It is everything underneath it.</w:t>
       </w:r>
     </w:p>
     <w:p>
@@ -1195,7 +1240,7 @@
           <w:sz w:val="21"/>
           <w:szCs w:val="21"/>
         </w:rPr>
-        <w:t xml:space="preserve">The median relative velocity of value creation rose to 1.42 times in 2026 from 0.93 in 2025 and a low of 0.23 in 2023, above its pre-boom baseline of roughly 0.73, with the 2.20 median step-up and 0.98-year interval pointing in the same direction. Velocity above 1.0 means each dollar raised created more than a dollar of new valuation, a reversal from 2023, when financings diluted holders more than they built value. The 2.73 average against the 1.42 median carries the same skew as the valuations themselves. Value creation concentrates in a few names, and the measure counts only companies that have raised.</w:t>
+        <w:t xml:space="preserve">The median relative velocity of value creation rose to 1.42 times in the first half of 2026 from 0.93 in 2025 and a low of 0.23 in 2023, above its pre-boom baseline of roughly 0.73, with the 2.20 median step-up and 0.98-year interval pointing in the same direction. Velocity above 1.0 means each dollar raised created more than a dollar of new valuation, a reversal from 2023, when financings diluted holders more than they built value. The 2.73 average against the 1.42 median carries the same skew as the valuations themselves. Value creation concentrates in a few names, and the measure counts only companies that have raised.</w:t>
       </w:r>
     </w:p>
     <w:p>
@@ -1272,7 +1317,7 @@
           <w:sz w:val="21"/>
           <w:szCs w:val="21"/>
         </w:rPr>
-        <w:t xml:space="preserve">A total of 245 unicorns have fallen below the billion-dollar threshold to date, and new failures have nearly stopped. The count rose from the 175 reported in Q1 through a rebuild of the curated list, which now includes pre-2016 falls and 63 companies with no recorded down round, not through new failures. There have been six down rounds in the first half of 2026 worth $3.85 billion, against a peak of 34 in 2024. Failures are severe when they occur, at a median failing valuation of $524.5 million and a median decline of 67% from the prior peak. The 2021 cohort's 15 companies that fell at exit are recorded as exits, so the reported failure count understates losses. A company is also recognized as failing only when it raises at a lower valuation, and 47.6% of the universe has not raised in more than two years, so the count describes companies that raised rather than the dormant majority.</w:t>
+        <w:t xml:space="preserve">A total of 245 unicorns have fallen below the billion-dollar threshold to date, and new failures have nearly stopped. The count rose from the 175 reported in Q1 through a rebuild of the curated list, which now includes pre-2016 falls and 63 companies with no recorded down round, not through new failures. There have been six down rounds in the first half of 2026 worth $3.85 billion, against a peak of 34 in 2024. Failures are severe when they occur, at a median failing valuation of $524.5 million and a median decline of 67% from the prior peak. The 2021 cohort's 15 companies that fell at exit are counted as exits in standard exit statistics even though this report's cohort accounting classes them as failures, so headline exit tallies overstate successful outcomes. A company is also recognized as failing only when it raises at a lower valuation, and 47.6% of the universe has not raised in more than two years, so the count describes companies that raised rather than the dormant majority.</w:t>
       </w:r>
     </w:p>
     <w:p>
@@ -1306,21 +1351,21 @@
           <w:sz w:val="21"/>
           <w:szCs w:val="21"/>
         </w:rPr>
-        <w:t xml:space="preserve">The $8.23 trillion is real, concentrated, and largely untested. Two companies hold 22% of it, the five largest financings took 62% of the quarter's sized deal value, and 47.6% of all valuations have gone more than two years without a financing to confirm them. The valuations that are current, at the top, are the ones the secondary market prices furthest below the model, by 22% at Anthropic and 32% at SpaceX. The governing fact is AI, which added more value in six months than the entire universe gained and now holds three-fifths of all private-technology value on two-fifths of the companies.</w:t>
-      </w:r>
-    </w:p>
-    <w:p>
-      <w:pPr>
-        <w:spacing w:after="160" w:line="276"/>
-      </w:pPr>
-      <w:r>
-        <w:rPr>
-          <w:rFonts w:ascii="Georgia" w:cs="Georgia" w:eastAsia="Georgia" w:hAnsi="Georgia"/>
-          <w:color w:val="1F2733"/>
-          <w:sz w:val="21"/>
-          <w:szCs w:val="21"/>
-        </w:rPr>
-        <w:t xml:space="preserve">The figure to track is not the aggregate, which will keep climbing on a dozen AI valuations, but the share of value resting on the frontier of recently tested valuations against the interior of dated ones. The event that will move it is the next set of frontier financings. SpaceX has already met its test, and public shares value the company roughly a third below its model valuation. Anthropic and OpenAI have not. Should Anthropic's expected listing or OpenAI's next round clear below the model rather than above it, the repricing will not stay contained to a single company.</w:t>
+        <w:t xml:space="preserve">The $8.23 trillion is real, concentrated, and largely untested. Two companies hold 22% of it, the five largest financings took 62% of the quarter's sized deal value, and 47.6% of all valuations have gone more than two years without a financing to confirm them. The valuations that are current, at the top, are the ones the secondary market prices furthest below the model, led by Anthropic at 22%. The governing fact is AI, which added more value in six months than the entire universe gained and now holds three-fifths of all private-technology value on two-fifths of the companies.</w:t>
+      </w:r>
+    </w:p>
+    <w:p>
+      <w:pPr>
+        <w:spacing w:after="160" w:line="276"/>
+      </w:pPr>
+      <w:r>
+        <w:rPr>
+          <w:rFonts w:ascii="Georgia" w:cs="Georgia" w:eastAsia="Georgia" w:hAnsi="Georgia"/>
+          <w:color w:val="1F2733"/>
+          <w:sz w:val="21"/>
+          <w:szCs w:val="21"/>
+        </w:rPr>
+        <w:t xml:space="preserve">The figure to track is not the aggregate, which will keep climbing on a dozen AI valuations, but the share of value resting on the frontier of recently tested valuations against the interior of dated ones. The event that will move it is the next set of frontier financings. SpaceX has already met its test, listing in June at a public value roughly in line with its model valuation. Anthropic and OpenAI have not. Should Anthropic's expected listing or OpenAI's next round clear below the model rather than above it, the repricing will not stay contained to a single company.</w:t>
       </w:r>
     </w:p>
     <w:p>

</xml_diff>